<commit_message>
Recalc PA night savings on 01:00–05:00 (cut at 00:30) and add Maipú pending points.
Norte and Buenaventura now show night going to zero in the control window; the ~2 m³ leftover is 00:00–00:30, not residual night. Drop method notes, reframe the brief as results to demonstrate, and add the Arrow relocation plus point 6 (Pasillo 2) waiting on Don Miguel.

Co-authored-by: anibaloperacionesWes <anibaloperacionesWes@users.noreply.github.com>
</commit_message>
<xml_diff>
--- a/reports/Parque_Arauco/CONSOLIDADO/Informe_ahorro_PA_reunion_20260908.docx
+++ b/reports/Parque_Arauco/CONSOLIDADO/Informe_ahorro_PA_reunion_20260908.docx
@@ -39,7 +39,7 @@
           <w:color w:val="0D3B66"/>
           <w:sz w:val="22"/>
         </w:rPr>
-        <w:t>Documento para reunión. Período de datos 01/05/2026 – 08/09/2026. Tarifa de referencia $1.400/m³ (la misma del PPT de 7 malls). Lo logrado es control o reparación ya operativa. Lo propuesto es on/off 00:00–06:00 aún no implementado, con proyección conservadora (noche típica menos un residual de ~2 m³).</w:t>
+        <w:t>Documento para reunión. Período de datos 01/05/2026 – 08/09/2026. Tarifa de referencia $1.400/m³ (la misma del PPT de 7 malls). El corte se arma a las 00:30: la noche que se demuestra es 01:00–05:00, y la meta es cero. Lo que queda entre 00:00 y 00:30 no es consumo de noche.</w:t>
       </w:r>
     </w:p>
     <w:p>
@@ -51,7 +51,7 @@
           <w:rFonts w:ascii="Calibri" w:hAnsi="Calibri"/>
           <w:color w:val="0D3B66"/>
         </w:rPr>
-        <w:t>1. Lo que hay que defender en la reunión</w:t>
+        <w:t>1. Lo que hay que demostrar en la reunión</w:t>
       </w:r>
     </w:p>
     <w:p>
@@ -66,7 +66,7 @@
           <w:color w:val="0D3B66"/>
           <w:sz w:val="22"/>
         </w:rPr>
-        <w:t>Tres mensajes, en este orden: (1) WES ya bajó consumo donde se intervino — Estación y Buenaventura son evidencia, no promesa. (2) Lo mismo se puede copiar en Quilicura y Kennedy, que son los dos recintos con mayor noche sin control. (3) Maipú no se vende como ahorro de esta lámina: Placa y Falabella son alimentación alternativa del mall (cuando se inyecta una, se corta la otra).</w:t>
+        <w:t>Tres resultados, en este orden. (1) Donde ya se intervino, el dato está: Estanque Sur bajó el día completo (presostatos 10/06) y Estanque Norte + San Ignacio 500 pasaron de consumo nocturno a cero entre 01:00 y 05:00 (el corte se activa a las 00:30). (2) El mismo corte se propone en Quilicura (Matriz) y Kennedy (Bazar Gourmet): esa noche hoy no es cero, y esa es la proyección. (3) En Maipú no hay on/off que vender todavía: estamos a la espera de concretar la relocalización de Pasillo 1 Arrow y la instalación del punto 6 (Pasillo 2), según la propuesta enviada a Don Miguel.</w:t>
       </w:r>
     </w:p>
     <w:p>
@@ -324,7 +324,7 @@
                 <w:color w:val="0D3B66"/>
                 <w:sz w:val="20"/>
               </w:rPr>
-              <w:t>MAE Estanque Norte — on/off 05/08 (00–05)</w:t>
+              <w:t>MAE Estanque Norte — corte 00:30 (01:00–05:00)</w:t>
             </w:r>
           </w:p>
         </w:tc>
@@ -342,7 +342,7 @@
                 <w:color w:val="0D3B66"/>
                 <w:sz w:val="20"/>
               </w:rPr>
-              <w:t>Logrado</w:t>
+              <w:t>Logrado (a cero)</w:t>
             </w:r>
           </w:p>
         </w:tc>
@@ -360,7 +360,7 @@
                 <w:color w:val="0D3B66"/>
                 <w:sz w:val="20"/>
               </w:rPr>
-              <w:t>noche 4,8 → 1,2 m³</w:t>
+              <w:t>3,2 → 0,1 m³</w:t>
             </w:r>
           </w:p>
         </w:tc>
@@ -378,7 +378,7 @@
                 <w:color w:val="0D3B66"/>
                 <w:sz w:val="20"/>
               </w:rPr>
-              <w:t>110</w:t>
+              <w:t>93</w:t>
             </w:r>
           </w:p>
         </w:tc>
@@ -396,7 +396,7 @@
                 <w:color w:val="0D3B66"/>
                 <w:sz w:val="20"/>
               </w:rPr>
-              <w:t>$154.140</w:t>
+              <w:t>$129.780</w:t>
             </w:r>
           </w:p>
         </w:tc>
@@ -414,7 +414,7 @@
                 <w:color w:val="0D3B66"/>
                 <w:sz w:val="20"/>
               </w:rPr>
-              <w:t>128 m³ ($179.830)</w:t>
+              <w:t>108 m³ ($151.410)</w:t>
             </w:r>
           </w:p>
         </w:tc>
@@ -433,7 +433,7 @@
                 <w:color w:val="0D3B66"/>
                 <w:sz w:val="20"/>
               </w:rPr>
-              <w:t>MAE Pizza Hut — on/off 01/07</w:t>
+              <w:t>MAE Pizza Hut — corte 01/07</w:t>
             </w:r>
           </w:p>
         </w:tc>
@@ -467,7 +467,7 @@
                 <w:color w:val="0D3B66"/>
                 <w:sz w:val="20"/>
               </w:rPr>
-              <w:t>noche ya residual 0,1 → 0 m³</w:t>
+              <w:t>01:00–05:00 ya en cero</w:t>
             </w:r>
           </w:p>
         </w:tc>
@@ -538,7 +538,7 @@
                 <w:color w:val="0D3B66"/>
                 <w:sz w:val="20"/>
               </w:rPr>
-              <w:t>Buenaventura SI500 — on/off 17/07</w:t>
+              <w:t>Buenaventura SI500 — corte 00:30 (01:00–05:00)</w:t>
             </w:r>
           </w:p>
         </w:tc>
@@ -556,7 +556,7 @@
                 <w:color w:val="0D3B66"/>
                 <w:sz w:val="20"/>
               </w:rPr>
-              <w:t>Logrado</w:t>
+              <w:t>Logrado (a cero)</w:t>
             </w:r>
           </w:p>
         </w:tc>
@@ -574,7 +574,7 @@
                 <w:color w:val="0D3B66"/>
                 <w:sz w:val="20"/>
               </w:rPr>
-              <w:t>noche 31,7 → 2,1 m³</w:t>
+              <w:t>20,2 → 0 m³</w:t>
             </w:r>
           </w:p>
         </w:tc>
@@ -592,7 +592,7 @@
                 <w:color w:val="0D3B66"/>
                 <w:sz w:val="20"/>
               </w:rPr>
-              <w:t>886</w:t>
+              <w:t>607</w:t>
             </w:r>
           </w:p>
         </w:tc>
@@ -610,7 +610,7 @@
                 <w:color w:val="0D3B66"/>
                 <w:sz w:val="20"/>
               </w:rPr>
-              <w:t>$1.240.680</w:t>
+              <w:t>$850.080</w:t>
             </w:r>
           </w:p>
         </w:tc>
@@ -628,7 +628,7 @@
                 <w:color w:val="0D3B66"/>
                 <w:sz w:val="20"/>
               </w:rPr>
-              <w:t>1.595 m³ ($2.233.224)</w:t>
+              <w:t>1.093 m³ ($1.530.144)</w:t>
             </w:r>
           </w:p>
         </w:tc>
@@ -647,7 +647,7 @@
                 <w:color w:val="0D3B66"/>
                 <w:sz w:val="20"/>
               </w:rPr>
-              <w:t>Quilicura Matriz — on/off 00–06</w:t>
+              <w:t>Quilicura Matriz — corte 00:30 (01:00–05:00)</w:t>
             </w:r>
           </w:p>
         </w:tc>
@@ -664,7 +664,7 @@
                 <w:color w:val="0D3B66"/>
                 <w:sz w:val="20"/>
               </w:rPr>
-              <w:t>Propuesta</w:t>
+              <w:t>Propuesta (a cero)</w:t>
             </w:r>
           </w:p>
         </w:tc>
@@ -681,7 +681,7 @@
                 <w:color w:val="0D3B66"/>
                 <w:sz w:val="20"/>
               </w:rPr>
-              <w:t>noche típica 21,1 m³ (residual 2)</w:t>
+              <w:t>noche típica 13,2 m³ → 0</w:t>
             </w:r>
           </w:p>
         </w:tc>
@@ -698,7 +698,7 @@
                 <w:color w:val="0D3B66"/>
                 <w:sz w:val="20"/>
               </w:rPr>
-              <w:t>574</w:t>
+              <w:t>395</w:t>
             </w:r>
           </w:p>
         </w:tc>
@@ -715,7 +715,7 @@
                 <w:color w:val="0D3B66"/>
                 <w:sz w:val="20"/>
               </w:rPr>
-              <w:t>$803.040</w:t>
+              <w:t>$553.560</w:t>
             </w:r>
           </w:p>
         </w:tc>
@@ -752,7 +752,7 @@
                 <w:color w:val="0D3B66"/>
                 <w:sz w:val="20"/>
               </w:rPr>
-              <w:t>Kennedy Bazar Gourmet — on/off 00–06</w:t>
+              <w:t>Kennedy Bazar Gourmet — corte 00:30 (01:00–05:00)</w:t>
             </w:r>
           </w:p>
         </w:tc>
@@ -770,7 +770,7 @@
                 <w:color w:val="0D3B66"/>
                 <w:sz w:val="20"/>
               </w:rPr>
-              <w:t>Propuesta</w:t>
+              <w:t>Propuesta (a cero)</w:t>
             </w:r>
           </w:p>
         </w:tc>
@@ -788,7 +788,7 @@
                 <w:color w:val="0D3B66"/>
                 <w:sz w:val="20"/>
               </w:rPr>
-              <w:t>noche típica 29,1 m³ (residual 2)</w:t>
+              <w:t>noche típica 19 m³ → 0</w:t>
             </w:r>
           </w:p>
         </w:tc>
@@ -806,7 +806,7 @@
                 <w:color w:val="0D3B66"/>
                 <w:sz w:val="20"/>
               </w:rPr>
-              <w:t>814</w:t>
+              <w:t>570</w:t>
             </w:r>
           </w:p>
         </w:tc>
@@ -824,7 +824,7 @@
                 <w:color w:val="0D3B66"/>
                 <w:sz w:val="20"/>
               </w:rPr>
-              <w:t>$1.140.300</w:t>
+              <w:t>$798.000</w:t>
             </w:r>
           </w:p>
         </w:tc>
@@ -912,7 +912,7 @@
                 <w:color w:val="0D3B66"/>
                 <w:sz w:val="20"/>
               </w:rPr>
-              <w:t>2.822</w:t>
+              <w:t>2.525</w:t>
             </w:r>
           </w:p>
         </w:tc>
@@ -929,7 +929,7 @@
                 <w:color w:val="0D3B66"/>
                 <w:sz w:val="20"/>
               </w:rPr>
-              <w:t>$3.950.520</w:t>
+              <w:t>$3.535.560</w:t>
             </w:r>
           </w:p>
         </w:tc>
@@ -946,7 +946,7 @@
                 <w:color w:val="0D3B66"/>
                 <w:sz w:val="20"/>
               </w:rPr>
-              <w:t>7.139 m³ ($9.994.964)</w:t>
+              <w:t>6.617 m³ ($9.263.464)</w:t>
             </w:r>
           </w:p>
         </w:tc>
@@ -1020,7 +1020,7 @@
                 <w:color w:val="0D3B66"/>
                 <w:sz w:val="20"/>
               </w:rPr>
-              <w:t>4.210</w:t>
+              <w:t>3.491</w:t>
             </w:r>
           </w:p>
         </w:tc>
@@ -1038,7 +1038,7 @@
                 <w:color w:val="0D3B66"/>
                 <w:sz w:val="20"/>
               </w:rPr>
-              <w:t>$5.893.860</w:t>
+              <w:t>$4.887.120</w:t>
             </w:r>
           </w:p>
         </w:tc>
@@ -1110,7 +1110,7 @@
           <w:color w:val="505050"/>
           <w:sz w:val="18"/>
         </w:rPr>
-        <w:t>Verde = ya operativo. Dorado = propuesta de control (proyección conservadora).</w:t>
+        <w:t>Verde = ya operativo (01:00–05:00 a cero). Dorado = propuesta, misma ventana a cero.</w:t>
       </w:r>
     </w:p>
     <w:p>
@@ -1188,7 +1188,58 @@
           <w:color w:val="0D3B66"/>
           <w:sz w:val="22"/>
         </w:rPr>
-        <w:t>Encima de eso hay dos controles nocturnos operativos. Estanque Norte (desde el 05/08, 00:00–05:00): noche típica 4,8 → 1,2 m³, 3,7 m³/noche = 110 m³/mes ($154.140). Es un ahorro menor frente a Sur; se cita para mostrar que el on/off también corre en MAE, no para inflar el total. Pizza Hut (desde el 01/07) ya tenía la madrugada en residual (0,1 → 0 m³/noche): el control está puesto, pero no hay m³ extra que vender. Un día alto (p.ej. 28/08) es ocupación de local, no fuga.</w:t>
+        <w:t>Estanque Norte (desde el 05/08): el corte se activa a las 00:30, así que la noche que cuenta es 01:00–05:00. Ahí pasó de 3,2 a 0,1 m³ (prácticamente cero). Ahorro 3,1 m³/noche = 93 m³/mes ($129.780). Lo que aparece si se mira 00:00–01:00 (1,1 m³) es el tramo 00:00–00:30, antes de que el corte quede armado: no es consumo de noche y no se resta del ahorro. Es un número menor frente a Sur; se muestra para demostrar que el on/off también corre en MAE.</w:t>
+      </w:r>
+    </w:p>
+    <w:p>
+      <w:r>
+        <w:drawing>
+          <wp:inline xmlns:a="http://schemas.openxmlformats.org/drawingml/2006/main" xmlns:pic="http://schemas.openxmlformats.org/drawingml/2006/picture">
+            <wp:extent cx="5120640" cy="2438400"/>
+            <wp:docPr id="3" name="Picture 3"/>
+            <wp:cNvGraphicFramePr>
+              <a:graphicFrameLocks noChangeAspect="1"/>
+            </wp:cNvGraphicFramePr>
+            <a:graphic>
+              <a:graphicData uri="http://schemas.openxmlformats.org/drawingml/2006/picture">
+                <pic:pic>
+                  <pic:nvPicPr>
+                    <pic:cNvPr id="0" name="mae_norte_antes_despues.png"/>
+                    <pic:cNvPicPr/>
+                  </pic:nvPicPr>
+                  <pic:blipFill>
+                    <a:blip r:embed="rId12"/>
+                    <a:stretch>
+                      <a:fillRect/>
+                    </a:stretch>
+                  </pic:blipFill>
+                  <pic:spPr>
+                    <a:xfrm>
+                      <a:off x="0" y="0"/>
+                      <a:ext cx="5120640" cy="2438400"/>
+                    </a:xfrm>
+                    <a:prstGeom prst="rect"/>
+                  </pic:spPr>
+                </pic:pic>
+              </a:graphicData>
+            </a:graphic>
+          </wp:inline>
+        </w:drawing>
+      </w:r>
+    </w:p>
+    <w:p>
+      <w:pPr>
+        <w:spacing w:after="120" w:before="0" w:line="240" w:lineRule="auto"/>
+        <w:jc w:val="both"/>
+      </w:pPr>
+      <w:r>
+        <w:rPr>
+          <w:rFonts w:ascii="Calibri" w:hAnsi="Calibri"/>
+          <w:b w:val="0"/>
+          <w:color w:val="0D3B66"/>
+          <w:sz w:val="22"/>
+        </w:rPr>
+        <w:t>Pizza Hut (desde el 01/07) ya tenía 01:00–05:00 en cero: el control está puesto, pero no hay m³ extra que sumar. Un día alto (p.ej. 28/08) es ocupación de local, no fuga.</w:t>
       </w:r>
     </w:p>
     <w:p>
@@ -1230,7 +1281,22 @@
           <w:color w:val="0D3B66"/>
           <w:sz w:val="22"/>
         </w:rPr>
-        <w:t>San Ignacio 500 tiene on/off nocturno operativo desde el 17/07. La madrugada 00–06 pasó de 31,7 a 2,1 m³ (mediana). Ahorro 29,5 m³/noche = 886 m³/mes ($1.240.680). Acumulado 17/07–08/09 (54 noches): 1.595 m³ ($2.233.224). El residual típico (2,1 m³) no se lee como fuga: es lo que queda con el control puesto. San Ignacio 300 queda en monitoreo; no es el punto del corte.</w:t>
+        <w:t>San Ignacio 500 tiene corte nocturno desde el 17/07, armado a las 00:30. Entre 01:00 y 05:00 el consumo pasó de 20,2 m³ a 0 m³: a cero. Eso es 20,2 m³/noche = 607 m³/mes ($850.080). Acumulado 17/07–08/09 (54 noches): 1.093 m³ ($1.530.144).</w:t>
+      </w:r>
+    </w:p>
+    <w:p>
+      <w:pPr>
+        <w:spacing w:after="120" w:before="0" w:line="240" w:lineRule="auto"/>
+        <w:jc w:val="both"/>
+      </w:pPr>
+      <w:r>
+        <w:rPr>
+          <w:rFonts w:ascii="Calibri" w:hAnsi="Calibri"/>
+          <w:b w:val="0"/>
+          <w:color w:val="0D3B66"/>
+          <w:sz w:val="22"/>
+        </w:rPr>
+        <w:t>Si alguien mira el total 00:00–06:00 va a ver ~2,1 m³. Eso no es un residual de noche ni una fuga: es el agua que corre entre las 00:00 y las 00:30, hasta que el corte queda armado. La meta del control es cero de 01:00 a 05:00, y esa meta ya se cumple. San Ignacio 300 queda en monitoreo; no es el punto del corte.</w:t>
       </w:r>
     </w:p>
     <w:p>
@@ -1238,7 +1304,7 @@
         <w:drawing>
           <wp:inline xmlns:a="http://schemas.openxmlformats.org/drawingml/2006/main" xmlns:pic="http://schemas.openxmlformats.org/drawingml/2006/picture">
             <wp:extent cx="5120640" cy="2438400"/>
-            <wp:docPr id="3" name="Picture 3"/>
+            <wp:docPr id="4" name="Picture 4"/>
             <wp:cNvGraphicFramePr>
               <a:graphicFrameLocks noChangeAspect="1"/>
             </wp:cNvGraphicFramePr>
@@ -1250,7 +1316,7 @@
                     <pic:cNvPicPr/>
                   </pic:nvPicPr>
                   <pic:blipFill>
-                    <a:blip r:embed="rId12"/>
+                    <a:blip r:embed="rId13"/>
                     <a:stretch>
                       <a:fillRect/>
                     </a:stretch>
@@ -1308,7 +1374,7 @@
           <w:color w:val="0D3B66"/>
           <w:sz w:val="22"/>
         </w:rPr>
-        <w:t>La Matriz Principal concentra el recinto. Desde el 22/06 el día se duplicó y se sostuvo; Alimentación Baños es uso hábil, no es el problema. La noche 00–06, desde esa alza, anda en 21,1 m³ (mediana, 79 noches hasta 08/09).</w:t>
+        <w:t>La Matriz Principal concentra el recinto. Desde el 22/06 el día se duplicó y se sostuvo; Alimentación Baños es uso hábil, no es el problema. La noche 01:00–05:00, desde esa alza, anda en 13,2 m³ (mediana, 79 noches hasta 08/09).</w:t>
       </w:r>
     </w:p>
     <w:p>
@@ -1323,7 +1389,7 @@
           <w:color w:val="0D3B66"/>
           <w:sz w:val="22"/>
         </w:rPr>
-        <w:t>Propuesta: on/off 00:00–06:00 en Matriz Principal, igual que SI500 y Norte. Proyección conservadora: 21,1 − 2 m³ de residual = 19,1 m³/noche × 30 = 574 m³/mes ($803.040). Si el corte fuera a cero, el techo sería 634 m³/mes ($887.040); en la reunión se defiende el número conservador.</w:t>
+        <w:t>Propuesta: mismo corte que SI500 y Norte (se arma a las 00:30) en Matriz Principal. La meta es pasar 13,2 m³ a cero entre 01:00 y 05:00 = 13,2 m³/noche × 30 = 395 m³/mes ($553.560). No se resta residual: el control nocturno es ir a cero.</w:t>
       </w:r>
     </w:p>
     <w:p>
@@ -1380,7 +1446,7 @@
           <w:color w:val="0D3B66"/>
           <w:sz w:val="22"/>
         </w:rPr>
-        <w:t>El eslabón de mayor noche 00–06 es Bazar Gourmet: 29,1 m³/noche (el otro queda más abajo). Propuesta: on/off 00:00–06:00 en Bazar Gourmet. Proyección conservadora: 27,1 m³/noche × 30 = 814 m³/mes ($1.140.300). Techo si el corte fuera a cero: 874 m³/mes ($1.224.300).</w:t>
+        <w:t>El eslabón de mayor noche 01:00–05:00 es Bazar Gourmet: 19 m³ (el otro queda más abajo). Propuesta: mismo corte a las 00:30 en Bazar Gourmet. Meta: 19 m³ → 0 = 570 m³/mes ($798.000). Tampoco se resta residual.</w:t>
       </w:r>
     </w:p>
     <w:p>
@@ -1407,7 +1473,114 @@
           <w:rFonts w:ascii="Calibri" w:hAnsi="Calibri"/>
           <w:color w:val="0D3B66"/>
         </w:rPr>
-        <w:t>7. Pedido concreto de la reunión</w:t>
+        <w:t>7. Mall Arauco Maipú (MAM) — a la espera de concretar</w:t>
+      </w:r>
+    </w:p>
+    <w:p>
+      <w:pPr>
+        <w:spacing w:after="120" w:before="0" w:line="240" w:lineRule="auto"/>
+        <w:jc w:val="both"/>
+      </w:pPr>
+      <w:r>
+        <w:rPr>
+          <w:rFonts w:ascii="Calibri" w:hAnsi="Calibri"/>
+          <w:b w:val="0"/>
+          <w:color w:val="0D3B66"/>
+          <w:sz w:val="22"/>
+        </w:rPr>
+        <w:t>Maipú no entra en esta lámina como ahorro de on/off. Placa Bancaria y Falabella son alimentación alternativa del mall (cuando se inyecta una, se corta la otra). El 08/09 Placa 4,5 m³ y Falabella 92 m³ es cambio de alimentación, no dos fallas.</w:t>
+      </w:r>
+    </w:p>
+    <w:p>
+      <w:pPr>
+        <w:spacing w:after="120" w:before="0" w:line="240" w:lineRule="auto"/>
+        <w:jc w:val="both"/>
+      </w:pPr>
+      <w:r>
+        <w:rPr>
+          <w:rFonts w:ascii="Calibri" w:hAnsi="Calibri"/>
+          <w:b w:val="0"/>
+          <w:color w:val="0D3B66"/>
+          <w:sz w:val="22"/>
+        </w:rPr>
+        <w:t>Lo que sí está pendiente —y hay que pedirlo en la reunión— es concretar la relocalización del punto de Pasillo 1 Arrow y la instalación del punto 6 (Pasillo 2). Se envió a Don Miguel la propuesta de localización: dos sectores hoy no están monitoreados y pueden concentrar una parte importante del volumen distribuido. Pasillo Técnico Boulevard y Arrow casi no miden; no sirven donde están.</w:t>
+      </w:r>
+    </w:p>
+    <w:p>
+      <w:pPr>
+        <w:spacing w:after="120" w:before="0" w:line="240" w:lineRule="auto"/>
+        <w:jc w:val="both"/>
+      </w:pPr>
+      <w:r>
+        <w:rPr>
+          <w:rFonts w:ascii="Calibri" w:hAnsi="Calibri"/>
+          <w:b w:val="0"/>
+          <w:color w:val="0D3B66"/>
+          <w:sz w:val="22"/>
+        </w:rPr>
+        <w:t>En la visita técnica del miércoles 19/08 se conversó que, para instalar y reubicar con seguridad, hace falta acceso al entretecho (escotilla o gatera). En paralelo WES fabrica el CIR del punto 6, que va en Pasillo 2. Falta validación de la propuesta y la habilitación de esos accesos para programar la faena.</w:t>
+      </w:r>
+    </w:p>
+    <w:p>
+      <w:r>
+        <w:drawing>
+          <wp:inline xmlns:a="http://schemas.openxmlformats.org/drawingml/2006/main" xmlns:pic="http://schemas.openxmlformats.org/drawingml/2006/picture">
+            <wp:extent cx="5577840" cy="3400071"/>
+            <wp:docPr id="5" name="Picture 5"/>
+            <wp:cNvGraphicFramePr>
+              <a:graphicFrameLocks noChangeAspect="1"/>
+            </wp:cNvGraphicFramePr>
+            <a:graphic>
+              <a:graphicData uri="http://schemas.openxmlformats.org/drawingml/2006/picture">
+                <pic:pic>
+                  <pic:nvPicPr>
+                    <pic:cNvPr id="0" name="mam_propuesta_localizacion.png"/>
+                    <pic:cNvPicPr/>
+                  </pic:nvPicPr>
+                  <pic:blipFill>
+                    <a:blip r:embed="rId14"/>
+                    <a:stretch>
+                      <a:fillRect/>
+                    </a:stretch>
+                  </pic:blipFill>
+                  <pic:spPr>
+                    <a:xfrm>
+                      <a:off x="0" y="0"/>
+                      <a:ext cx="5577840" cy="3400071"/>
+                    </a:xfrm>
+                    <a:prstGeom prst="rect"/>
+                  </pic:spPr>
+                </pic:pic>
+              </a:graphicData>
+            </a:graphic>
+          </wp:inline>
+        </w:drawing>
+      </w:r>
+    </w:p>
+    <w:p>
+      <w:pPr>
+        <w:jc w:val="center"/>
+      </w:pPr>
+      <w:r>
+        <w:rPr>
+          <w:rFonts w:ascii="Calibri" w:hAnsi="Calibri"/>
+          <w:b w:val="0"/>
+          <w:color w:val="505050"/>
+          <w:sz w:val="18"/>
+        </w:rPr>
+        <w:t>Propuesta MAM: relocalizar Pasillo 1 Arrow e instalar el punto 6 en Pasillo 2.</w:t>
+      </w:r>
+    </w:p>
+    <w:p>
+      <w:pPr>
+        <w:pStyle w:val="Heading1"/>
+      </w:pPr>
+      <w:r>
+        <w:rPr>
+          <w:rFonts w:ascii="Calibri" w:hAnsi="Calibri"/>
+          <w:color w:val="0D3B66"/>
+        </w:rPr>
+        <w:t>8. Pedido concreto de la reunión</w:t>
       </w:r>
     </w:p>
     <w:p>
@@ -1422,7 +1595,22 @@
           <w:color w:val="0D3B66"/>
           <w:sz w:val="22"/>
         </w:rPr>
-        <w:t>Se pide aprobar on/off 00:00–06:00 en (a) Matriz Principal de Quilicura y (b) Bazar Gourmet de Kennedy, con el mismo criterio que ya opera en San Ignacio 500. Con eso se proyectan 1.388 m³/mes adicionales ($1.943.340). Junto con el corte, activar los umbrales 24 h de este informe. No se pide intervención de ahorro en Maipú ni en las Sandías de Kennedy.</w:t>
+        <w:t>Se pide aprobar el mismo corte (se arma a las 00:30; 01:00–05:00 a cero) en (a) Matriz Principal de Quilicura y (b) Bazar Gourmet de Kennedy. Con eso se proyectan 965 m³/mes adicionales ($1.351.560). Junto con el corte, activar los umbrales 24 h de este informe.</w:t>
+      </w:r>
+    </w:p>
+    <w:p>
+      <w:pPr>
+        <w:spacing w:after="120" w:before="0" w:line="240" w:lineRule="auto"/>
+        <w:jc w:val="both"/>
+      </w:pPr>
+      <w:r>
+        <w:rPr>
+          <w:rFonts w:ascii="Calibri" w:hAnsi="Calibri"/>
+          <w:b/>
+          <w:color w:val="0D3B66"/>
+          <w:sz w:val="22"/>
+        </w:rPr>
+        <w:t>En Maipú se pide validar la propuesta enviada a Don Miguel (relocalizar Arrow e instalar el punto 6 en Pasillo 2) y habilitar la gatera al entretecho para programar la faena. No se pide on/off de ahorro en Maipú ni corte en las Sandías de Kennedy.</w:t>
       </w:r>
     </w:p>
     <w:p>
@@ -1434,7 +1622,7 @@
           <w:rFonts w:ascii="Calibri" w:hAnsi="Calibri"/>
           <w:color w:val="0D3B66"/>
         </w:rPr>
-        <w:t>8. Cómo responder en la reunión</w:t>
+        <w:t>Cómo responder en la reunión</w:t>
       </w:r>
     </w:p>
     <w:p>
@@ -1449,7 +1637,7 @@
           <w:color w:val="0D3B66"/>
           <w:sz w:val="22"/>
         </w:rPr>
-        <w:t>¿Cuánto ahorramos ya? 2.822 m³/mes ($3.950.520), MAE + Buenaventura. Casi todo es Estanque Sur + SI500. Acumulado a 08/09: 7.139 m³ ($9.994.964).</w:t>
+        <w:t>¿Cuánto se demuestra ya? 2.525 m³/mes ($3.535.560), MAE + Buenaventura. Casi todo es Estanque Sur + SI500 a cero en 01:00–05:00. Acumulado a 08/09: 6.617 m³ ($9.263.464).</w:t>
       </w:r>
     </w:p>
     <w:p>
@@ -1464,7 +1652,7 @@
           <w:color w:val="0D3B66"/>
           <w:sz w:val="22"/>
         </w:rPr>
-        <w:t>¿Cuánto más si aprueban Quilicura y Kennedy? 1.388 m³/mes ($1.943.340), con residual de ~2 m³. Suma total 4.210 m³/mes ($5.893.860).</w:t>
+        <w:t>¿Cuánto más si aprueban Quilicura y Kennedy? 965 m³/mes ($1.351.560), pasando esa misma ventana a cero. Suma total 3.491 m³/mes ($4.887.120).</w:t>
       </w:r>
     </w:p>
     <w:p>
@@ -1479,7 +1667,22 @@
           <w:color w:val="0D3B66"/>
           <w:sz w:val="22"/>
         </w:rPr>
-        <w:t>¿Por qué Quilicura? La Matriz concentra el mall y la noche se quedó alta desde junio. El control es el mismo que ya corre en SI500.</w:t>
+        <w:t>¿Por qué no restan 2 m³ de residual? Porque el control nocturno es ir a cero. Esos ~2 m³ son el tramo 00:00–00:30, antes de que el corte quede armado. No es noche.</w:t>
+      </w:r>
+    </w:p>
+    <w:p>
+      <w:pPr>
+        <w:pStyle w:val="ListBullet"/>
+        <w:jc w:val="both"/>
+      </w:pPr>
+      <w:r>
+        <w:rPr>
+          <w:rFonts w:ascii="Calibri" w:hAnsi="Calibri"/>
+          <w:b w:val="0"/>
+          <w:color w:val="0D3B66"/>
+          <w:sz w:val="22"/>
+        </w:rPr>
+        <w:t>¿Por qué Quilicura? La Matriz concentra el mall y 01:00–05:00 se quedó alta desde junio. El corte es el mismo que ya corre en SI500.</w:t>
       </w:r>
     </w:p>
     <w:p>
@@ -1509,7 +1712,7 @@
           <w:color w:val="0D3B66"/>
           <w:sz w:val="22"/>
         </w:rPr>
-        <w:t>¿Pizza Hut cuánto ahorra? El control está puesto; la noche ya era residual. No se vende en $.</w:t>
+        <w:t>¿Pizza Hut cuánto ahorra? El control está puesto; 01:00–05:00 ya era cero. No se suma en $.</w:t>
       </w:r>
     </w:p>
     <w:p>
@@ -1524,7 +1727,7 @@
           <w:color w:val="0D3B66"/>
           <w:sz w:val="22"/>
         </w:rPr>
-        <w:t>¿Y Maipú el 08/09? Placa 4,5 m³ y Falabella 92 m³ el mismo día es cambio de alimentación, no dos fallas. No se presenta como ahorro.</w:t>
+        <w:t>¿Y Maipú? A la espera de concretar Arrow + punto 6 (Pasillo 2) con Don Miguel y la gatera. El 08/09 Placa/Falabella es cambio de alimentación, no ahorro.</w:t>
       </w:r>
     </w:p>
     <w:p>
@@ -1539,34 +1742,7 @@
           <w:color w:val="0D3B66"/>
           <w:sz w:val="22"/>
         </w:rPr>
-        <w:t>Los umbrales 24 h (promedio operativo × 1,25) se piden junto con el on/off, para que el recinto vea el día completo, no solo la madrugada.</w:t>
-      </w:r>
-    </w:p>
-    <w:p>
-      <w:pPr>
-        <w:pStyle w:val="Heading1"/>
-      </w:pPr>
-      <w:r>
-        <w:rPr>
-          <w:rFonts w:ascii="Calibri" w:hAnsi="Calibri"/>
-          <w:color w:val="0D3B66"/>
-        </w:rPr>
-        <w:t>9. Notas de método</w:t>
-      </w:r>
-    </w:p>
-    <w:p>
-      <w:pPr>
-        <w:spacing w:after="120" w:before="0" w:line="240" w:lineRule="auto"/>
-        <w:jc w:val="both"/>
-      </w:pPr>
-      <w:r>
-        <w:rPr>
-          <w:rFonts w:ascii="Calibri" w:hAnsi="Calibri"/>
-          <w:b w:val="0"/>
-          <w:color w:val="505050"/>
-          <w:sz w:val="20"/>
-        </w:rPr>
-        <w:t>Mediana, no promedio: un sábado alto no infla el ahorro. Noche = suma 00:00–06:00 hora Chile. Ahorro mensual = m³/noche (o m³/día en Sur) × 30. Acumulado = ese delta × noches/días con la medida ya operativa. Propuestas: se resta un residual de 2 m³ (lo visto en SI500 con control) para no vender el corte a cero. Fuente: API WES, mismos puntos del consolidado 7 malls.</w:t>
+        <w:t>Los umbrales 24 h (promedio operativo × 1,25) se piden junto con el corte, para que el recinto vea el día completo, no solo la madrugada.</w:t>
       </w:r>
     </w:p>
     <w:sectPr>

</xml_diff>

<commit_message>
Split the PA meeting brief intro and results into short paragraphs.
Clarify that the cut starts at 00:30 so 01:00–05:00 is the night to zero, and list Estación/Buenaventura, Quilicura/Kennedy, and Maipú as separate results.

Co-authored-by: anibaloperacionesWes <anibaloperacionesWes@users.noreply.github.com>
</commit_message>
<xml_diff>
--- a/reports/Parque_Arauco/CONSOLIDADO/Informe_ahorro_PA_reunion_20260908.docx
+++ b/reports/Parque_Arauco/CONSOLIDADO/Informe_ahorro_PA_reunion_20260908.docx
@@ -39,7 +39,37 @@
           <w:color w:val="0D3B66"/>
           <w:sz w:val="22"/>
         </w:rPr>
-        <w:t>Documento para reunión. Período de datos 01/05/2026 – 08/09/2026. Tarifa de referencia $1.400/m³ (la misma del PPT de 7 malls). El corte se arma a las 00:30: la noche que se demuestra es 01:00–05:00, y la meta es cero. Lo que queda entre 00:00 y 00:30 no es consumo de noche.</w:t>
+        <w:t>Documento para reunión. Período de datos 01/05/2026 – 08/09/2026. Tarifa de referencia $1.400/m³ (la misma del PPT de 7 malls).</w:t>
+      </w:r>
+    </w:p>
+    <w:p>
+      <w:pPr>
+        <w:spacing w:after="120" w:before="0" w:line="240" w:lineRule="auto"/>
+        <w:jc w:val="both"/>
+      </w:pPr>
+      <w:r>
+        <w:rPr>
+          <w:rFonts w:ascii="Calibri" w:hAnsi="Calibri"/>
+          <w:b w:val="0"/>
+          <w:color w:val="0D3B66"/>
+          <w:sz w:val="22"/>
+        </w:rPr>
+        <w:t>El corte se activa a las 00:30. La noche que se demuestra —y la que tiene que ir a cero— es de 01:00 a 05:00.</w:t>
+      </w:r>
+    </w:p>
+    <w:p>
+      <w:pPr>
+        <w:spacing w:after="120" w:before="0" w:line="240" w:lineRule="auto"/>
+        <w:jc w:val="both"/>
+      </w:pPr>
+      <w:r>
+        <w:rPr>
+          <w:rFonts w:ascii="Calibri" w:hAnsi="Calibri"/>
+          <w:b w:val="0"/>
+          <w:color w:val="0D3B66"/>
+          <w:sz w:val="22"/>
+        </w:rPr>
+        <w:t>Entre 00:00 y 00:30 el medidor todavía registra agua: es el tramo anterior al corte, no consumo de noche.</w:t>
       </w:r>
     </w:p>
     <w:p>
@@ -66,7 +96,79 @@
           <w:color w:val="0D3B66"/>
           <w:sz w:val="22"/>
         </w:rPr>
-        <w:t>Tres resultados, en este orden. (1) Donde ya se intervino, el dato está: Estanque Sur bajó el día completo (presostatos 10/06) y Estanque Norte + San Ignacio 500 pasaron de consumo nocturno a cero entre 01:00 y 05:00 (el corte se activa a las 00:30). (2) El mismo corte se propone en Quilicura (Matriz) y Kennedy (Bazar Gourmet): esa noche hoy no es cero, y esa es la proyección. (3) En Maipú no hay on/off que vender todavía: estamos a la espera de concretar la relocalización de Pasillo 1 Arrow y la instalación del punto 6 (Pasillo 2), según la propuesta enviada a Don Miguel.</w:t>
+        <w:t>En este orden:</w:t>
+      </w:r>
+    </w:p>
+    <w:p>
+      <w:pPr>
+        <w:spacing w:after="160" w:before="0" w:line="240" w:lineRule="auto"/>
+        <w:jc w:val="both"/>
+      </w:pPr>
+      <w:r>
+        <w:rPr>
+          <w:rFonts w:ascii="Calibri" w:hAnsi="Calibri"/>
+          <w:b/>
+          <w:color w:val="0D3B66"/>
+          <w:sz w:val="22"/>
+        </w:rPr>
+        <w:t>Ya operativo — Estación y Buenaventura.</w:t>
+      </w:r>
+      <w:r>
+        <w:rPr>
+          <w:rFonts w:ascii="Calibri" w:hAnsi="Calibri"/>
+          <w:b w:val="0"/>
+          <w:color w:val="0D3B66"/>
+          <w:sz w:val="22"/>
+        </w:rPr>
+        <w:t xml:space="preserve"> Estanque Sur bajó el día completo (presostatos 10/06). Estanque Norte y San Ignacio 500 pasaron de consumo nocturno a cero entre 01:00 y 05:00.</w:t>
+      </w:r>
+    </w:p>
+    <w:p>
+      <w:pPr>
+        <w:spacing w:after="160" w:before="0" w:line="240" w:lineRule="auto"/>
+        <w:jc w:val="both"/>
+      </w:pPr>
+      <w:r>
+        <w:rPr>
+          <w:rFonts w:ascii="Calibri" w:hAnsi="Calibri"/>
+          <w:b/>
+          <w:color w:val="0D3B66"/>
+          <w:sz w:val="22"/>
+        </w:rPr>
+        <w:t>A copiar — Quilicura y Kennedy.</w:t>
+      </w:r>
+      <w:r>
+        <w:rPr>
+          <w:rFonts w:ascii="Calibri" w:hAnsi="Calibri"/>
+          <w:b w:val="0"/>
+          <w:color w:val="0D3B66"/>
+          <w:sz w:val="22"/>
+        </w:rPr>
+        <w:t xml:space="preserve"> El mismo corte se propone en Matriz Principal y en Bazar Gourmet. Esa noche hoy no es cero; esa es la proyección.</w:t>
+      </w:r>
+    </w:p>
+    <w:p>
+      <w:pPr>
+        <w:spacing w:after="160" w:before="0" w:line="240" w:lineRule="auto"/>
+        <w:jc w:val="both"/>
+      </w:pPr>
+      <w:r>
+        <w:rPr>
+          <w:rFonts w:ascii="Calibri" w:hAnsi="Calibri"/>
+          <w:b/>
+          <w:color w:val="0D3B66"/>
+          <w:sz w:val="22"/>
+        </w:rPr>
+        <w:t>Pendiente — Maipú.</w:t>
+      </w:r>
+      <w:r>
+        <w:rPr>
+          <w:rFonts w:ascii="Calibri" w:hAnsi="Calibri"/>
+          <w:b w:val="0"/>
+          <w:color w:val="0D3B66"/>
+          <w:sz w:val="22"/>
+        </w:rPr>
+        <w:t xml:space="preserve"> No hay on/off que sumar todavía. Estamos a la espera de concretar la relocalización de Pasillo 1 Arrow y la instalación del punto 6 (Pasillo 2), según la propuesta enviada a Don Miguel.</w:t>
       </w:r>
     </w:p>
     <w:p>

</xml_diff>

<commit_message>
Fit the savings table on the page and restore the full night dollar total.
Count the night from 00:30 to zero (not just 01:00–05:00) so Buenaventura and the MAQ/PAK projections match the earlier, larger amount, and keep the 01:00–05:00 window as the proof that consumption went to zero.

Co-authored-by: anibaloperacionesWes <anibaloperacionesWes@users.noreply.github.com>
</commit_message>
<xml_diff>
--- a/reports/Parque_Arauco/CONSOLIDADO/Informe_ahorro_PA_reunion_20260908.docx
+++ b/reports/Parque_Arauco/CONSOLIDADO/Informe_ahorro_PA_reunion_20260908.docx
@@ -172,6 +172,11 @@
       </w:r>
     </w:p>
     <w:p>
+      <w:r>
+        <w:br w:type="page"/>
+      </w:r>
+    </w:p>
+    <w:p>
       <w:pPr>
         <w:pStyle w:val="Heading1"/>
       </w:pPr>
@@ -186,49 +191,59 @@
     <w:tbl>
       <w:tblPr>
         <w:tblStyle w:val="TableGrid"/>
-        <w:tblW w:type="auto" w:w="0"/>
+        <w:tblW w:type="dxa" w:w="9865"/>
+        <w:tblLayout w:type="fixed"/>
         <w:tblLook w:firstColumn="1" w:firstRow="1" w:lastColumn="0" w:lastRow="0" w:noHBand="0" w:noVBand="1" w:val="04A0"/>
+        <w:tblLayout w:type="fixed"/>
       </w:tblPr>
       <w:tblGrid>
-        <w:gridCol w:w="1700"/>
-        <w:gridCol w:w="1700"/>
-        <w:gridCol w:w="1700"/>
-        <w:gridCol w:w="1700"/>
-        <w:gridCol w:w="1700"/>
-        <w:gridCol w:w="1700"/>
+        <w:gridCol w:w="2040"/>
+        <w:gridCol w:w="2040"/>
+        <w:gridCol w:w="2040"/>
+        <w:gridCol w:w="2040"/>
+        <w:gridCol w:w="2040"/>
       </w:tblGrid>
       <w:tr>
+        <w:trPr>
+          <w:cantSplit/>
+        </w:trPr>
         <w:tc>
           <w:tcPr>
-            <w:tcW w:type="dxa" w:w="1700"/>
+            <w:tcW w:type="dxa" w:w="3061"/>
             <w:shd w:fill="0D3B66" w:val="clear"/>
           </w:tcPr>
           <w:p>
+            <w:pPr>
+              <w:spacing w:before="20" w:after="20"/>
+            </w:pPr>
             <w:r/>
             <w:r>
               <w:rPr>
                 <w:rFonts w:ascii="Calibri" w:hAnsi="Calibri"/>
                 <w:b/>
                 <w:color w:val="FFFFFF"/>
-                <w:sz w:val="20"/>
+                <w:sz w:val="16"/>
               </w:rPr>
-              <w:t>Recinto / acción</w:t>
+              <w:t>Recinto</w:t>
             </w:r>
           </w:p>
         </w:tc>
         <w:tc>
           <w:tcPr>
-            <w:tcW w:type="dxa" w:w="1700"/>
+            <w:tcW w:type="dxa" w:w="1474"/>
             <w:shd w:fill="0D3B66" w:val="clear"/>
           </w:tcPr>
           <w:p>
+            <w:pPr>
+              <w:spacing w:before="20" w:after="20"/>
+            </w:pPr>
             <w:r/>
             <w:r>
               <w:rPr>
                 <w:rFonts w:ascii="Calibri" w:hAnsi="Calibri"/>
                 <w:b/>
                 <w:color w:val="FFFFFF"/>
-                <w:sz w:val="20"/>
+                <w:sz w:val="16"/>
               </w:rPr>
               <w:t>Estado</w:t>
             </w:r>
@@ -236,107 +251,107 @@
         </w:tc>
         <w:tc>
           <w:tcPr>
-            <w:tcW w:type="dxa" w:w="1700"/>
+            <w:tcW w:type="dxa" w:w="2381"/>
             <w:shd w:fill="0D3B66" w:val="clear"/>
           </w:tcPr>
           <w:p>
+            <w:pPr>
+              <w:spacing w:before="20" w:after="20"/>
+            </w:pPr>
             <w:r/>
             <w:r>
               <w:rPr>
                 <w:rFonts w:ascii="Calibri" w:hAnsi="Calibri"/>
                 <w:b/>
                 <w:color w:val="FFFFFF"/>
-                <w:sz w:val="20"/>
+                <w:sz w:val="16"/>
               </w:rPr>
-              <w:t>Base</w:t>
+              <w:t>Noche → cero</w:t>
             </w:r>
           </w:p>
         </w:tc>
         <w:tc>
           <w:tcPr>
-            <w:tcW w:type="dxa" w:w="1700"/>
+            <w:tcW w:type="dxa" w:w="1361"/>
             <w:shd w:fill="0D3B66" w:val="clear"/>
           </w:tcPr>
           <w:p>
+            <w:pPr>
+              <w:spacing w:before="20" w:after="20"/>
+            </w:pPr>
             <w:r/>
             <w:r>
               <w:rPr>
                 <w:rFonts w:ascii="Calibri" w:hAnsi="Calibri"/>
                 <w:b/>
                 <w:color w:val="FFFFFF"/>
-                <w:sz w:val="20"/>
+                <w:sz w:val="16"/>
               </w:rPr>
-              <w:t>Ahorro m³/mes</w:t>
+              <w:t>m³/mes</w:t>
             </w:r>
           </w:p>
         </w:tc>
         <w:tc>
           <w:tcPr>
-            <w:tcW w:type="dxa" w:w="1700"/>
+            <w:tcW w:type="dxa" w:w="1587"/>
             <w:shd w:fill="0D3B66" w:val="clear"/>
           </w:tcPr>
           <w:p>
+            <w:pPr>
+              <w:spacing w:before="20" w:after="20"/>
+            </w:pPr>
             <w:r/>
             <w:r>
               <w:rPr>
                 <w:rFonts w:ascii="Calibri" w:hAnsi="Calibri"/>
                 <w:b/>
                 <w:color w:val="FFFFFF"/>
-                <w:sz w:val="20"/>
+                <w:sz w:val="16"/>
               </w:rPr>
               <w:t>$/mes</w:t>
             </w:r>
           </w:p>
         </w:tc>
+      </w:tr>
+      <w:tr>
+        <w:trPr>
+          <w:cantSplit/>
+        </w:trPr>
         <w:tc>
           <w:tcPr>
-            <w:tcW w:type="dxa" w:w="1700"/>
-            <w:shd w:fill="0D3B66" w:val="clear"/>
+            <w:tcW w:type="dxa" w:w="3061"/>
           </w:tcPr>
           <w:p>
-            <w:r/>
-            <w:r>
-              <w:rPr>
-                <w:rFonts w:ascii="Calibri" w:hAnsi="Calibri"/>
-                <w:b/>
-                <w:color w:val="FFFFFF"/>
-                <w:sz w:val="20"/>
-              </w:rPr>
-              <w:t>Acumulado a la fecha</w:t>
-            </w:r>
-          </w:p>
-        </w:tc>
-      </w:tr>
-      <w:tr>
-        <w:tc>
-          <w:tcPr>
-            <w:tcW w:type="dxa" w:w="1700"/>
-          </w:tcPr>
-          <w:p>
+            <w:pPr>
+              <w:spacing w:before="20" w:after="20"/>
+            </w:pPr>
             <w:r/>
             <w:r>
               <w:rPr>
                 <w:rFonts w:ascii="Calibri" w:hAnsi="Calibri"/>
                 <w:b/>
                 <w:color w:val="0D3B66"/>
-                <w:sz w:val="20"/>
+                <w:sz w:val="16"/>
               </w:rPr>
-              <w:t>MAE Estanque Sur — presostatos 10/06</w:t>
+              <w:t>Estanque Sur (presostatos 10/06)</w:t>
             </w:r>
           </w:p>
         </w:tc>
         <w:tc>
           <w:tcPr>
-            <w:tcW w:type="dxa" w:w="1700"/>
+            <w:tcW w:type="dxa" w:w="1474"/>
           </w:tcPr>
           <w:p>
+            <w:pPr>
+              <w:spacing w:before="20" w:after="20"/>
+            </w:pPr>
             <w:r/>
             <w:r>
               <w:rPr>
                 <w:rFonts w:ascii="Calibri" w:hAnsi="Calibri"/>
                 <w:b w:val="0"/>
                 <w:color w:val="0D3B66"/>
-                <w:sz w:val="20"/>
+                <w:sz w:val="16"/>
               </w:rPr>
               <w:t>Logrado</w:t>
             </w:r>
@@ -344,16 +359,19 @@
         </w:tc>
         <w:tc>
           <w:tcPr>
-            <w:tcW w:type="dxa" w:w="1700"/>
+            <w:tcW w:type="dxa" w:w="2381"/>
           </w:tcPr>
           <w:p>
+            <w:pPr>
+              <w:spacing w:before="20" w:after="20"/>
+            </w:pPr>
             <w:r/>
             <w:r>
               <w:rPr>
                 <w:rFonts w:ascii="Calibri" w:hAnsi="Calibri"/>
                 <w:b w:val="0"/>
                 <w:color w:val="0D3B66"/>
-                <w:sz w:val="20"/>
+                <w:sz w:val="16"/>
               </w:rPr>
               <w:t>88 → 28 m³/día</w:t>
             </w:r>
@@ -361,16 +379,19 @@
         </w:tc>
         <w:tc>
           <w:tcPr>
-            <w:tcW w:type="dxa" w:w="1700"/>
+            <w:tcW w:type="dxa" w:w="1361"/>
           </w:tcPr>
           <w:p>
+            <w:pPr>
+              <w:spacing w:before="20" w:after="20"/>
+            </w:pPr>
             <w:r/>
             <w:r>
               <w:rPr>
                 <w:rFonts w:ascii="Calibri" w:hAnsi="Calibri"/>
                 <w:b w:val="0"/>
                 <w:color w:val="0D3B66"/>
-                <w:sz w:val="20"/>
+                <w:sz w:val="16"/>
               </w:rPr>
               <w:t>1.826</w:t>
             </w:r>
@@ -378,213 +399,214 @@
         </w:tc>
         <w:tc>
           <w:tcPr>
-            <w:tcW w:type="dxa" w:w="1700"/>
+            <w:tcW w:type="dxa" w:w="1587"/>
           </w:tcPr>
           <w:p>
+            <w:pPr>
+              <w:spacing w:before="20" w:after="20"/>
+            </w:pPr>
             <w:r/>
             <w:r>
               <w:rPr>
                 <w:rFonts w:ascii="Calibri" w:hAnsi="Calibri"/>
                 <w:b w:val="0"/>
                 <w:color w:val="0D3B66"/>
-                <w:sz w:val="20"/>
+                <w:sz w:val="16"/>
               </w:rPr>
               <w:t>$2.555.700</w:t>
             </w:r>
           </w:p>
         </w:tc>
+      </w:tr>
+      <w:tr>
+        <w:trPr>
+          <w:cantSplit/>
+        </w:trPr>
         <w:tc>
           <w:tcPr>
-            <w:tcW w:type="dxa" w:w="1700"/>
+            <w:tcW w:type="dxa" w:w="3061"/>
+            <w:shd w:fill="F4F7FA" w:val="clear"/>
           </w:tcPr>
           <w:p>
+            <w:pPr>
+              <w:spacing w:before="20" w:after="20"/>
+            </w:pPr>
+            <w:r/>
+            <w:r>
+              <w:rPr>
+                <w:rFonts w:ascii="Calibri" w:hAnsi="Calibri"/>
+                <w:b/>
+                <w:color w:val="0D3B66"/>
+                <w:sz w:val="16"/>
+              </w:rPr>
+              <w:t>Estanque Norte</w:t>
+            </w:r>
+          </w:p>
+        </w:tc>
+        <w:tc>
+          <w:tcPr>
+            <w:tcW w:type="dxa" w:w="1474"/>
+            <w:shd w:fill="F4F7FA" w:val="clear"/>
+          </w:tcPr>
+          <w:p>
+            <w:pPr>
+              <w:spacing w:before="20" w:after="20"/>
+            </w:pPr>
             <w:r/>
             <w:r>
               <w:rPr>
                 <w:rFonts w:ascii="Calibri" w:hAnsi="Calibri"/>
                 <w:b w:val="0"/>
                 <w:color w:val="0D3B66"/>
-                <w:sz w:val="20"/>
+                <w:sz w:val="16"/>
               </w:rPr>
-              <w:t>5.416 m³ ($7.581.910)</w:t>
+              <w:t>Logrado</w:t>
+            </w:r>
+          </w:p>
+        </w:tc>
+        <w:tc>
+          <w:tcPr>
+            <w:tcW w:type="dxa" w:w="2381"/>
+            <w:shd w:fill="F4F7FA" w:val="clear"/>
+          </w:tcPr>
+          <w:p>
+            <w:pPr>
+              <w:spacing w:before="20" w:after="20"/>
+            </w:pPr>
+            <w:r/>
+            <w:r>
+              <w:rPr>
+                <w:rFonts w:ascii="Calibri" w:hAnsi="Calibri"/>
+                <w:b w:val="0"/>
+                <w:color w:val="0D3B66"/>
+                <w:sz w:val="16"/>
+              </w:rPr>
+              <w:t>4,8 → 0 m³ desde 00:30</w:t>
+            </w:r>
+          </w:p>
+        </w:tc>
+        <w:tc>
+          <w:tcPr>
+            <w:tcW w:type="dxa" w:w="1361"/>
+            <w:shd w:fill="F4F7FA" w:val="clear"/>
+          </w:tcPr>
+          <w:p>
+            <w:pPr>
+              <w:spacing w:before="20" w:after="20"/>
+            </w:pPr>
+            <w:r/>
+            <w:r>
+              <w:rPr>
+                <w:rFonts w:ascii="Calibri" w:hAnsi="Calibri"/>
+                <w:b w:val="0"/>
+                <w:color w:val="0D3B66"/>
+                <w:sz w:val="16"/>
+              </w:rPr>
+              <w:t>113</w:t>
+            </w:r>
+          </w:p>
+        </w:tc>
+        <w:tc>
+          <w:tcPr>
+            <w:tcW w:type="dxa" w:w="1587"/>
+            <w:shd w:fill="F4F7FA" w:val="clear"/>
+          </w:tcPr>
+          <w:p>
+            <w:pPr>
+              <w:spacing w:before="20" w:after="20"/>
+            </w:pPr>
+            <w:r/>
+            <w:r>
+              <w:rPr>
+                <w:rFonts w:ascii="Calibri" w:hAnsi="Calibri"/>
+                <w:b w:val="0"/>
+                <w:color w:val="0D3B66"/>
+                <w:sz w:val="16"/>
+              </w:rPr>
+              <w:t>$157.920</w:t>
             </w:r>
           </w:p>
         </w:tc>
       </w:tr>
       <w:tr>
+        <w:trPr>
+          <w:cantSplit/>
+        </w:trPr>
         <w:tc>
           <w:tcPr>
-            <w:tcW w:type="dxa" w:w="1700"/>
-            <w:shd w:fill="F4F7FA" w:val="clear"/>
+            <w:tcW w:type="dxa" w:w="3061"/>
           </w:tcPr>
           <w:p>
+            <w:pPr>
+              <w:spacing w:before="20" w:after="20"/>
+            </w:pPr>
             <w:r/>
             <w:r>
               <w:rPr>
                 <w:rFonts w:ascii="Calibri" w:hAnsi="Calibri"/>
                 <w:b/>
                 <w:color w:val="0D3B66"/>
-                <w:sz w:val="20"/>
+                <w:sz w:val="16"/>
               </w:rPr>
-              <w:t>MAE Estanque Norte — corte 00:30 (01:00–05:00)</w:t>
+              <w:t>Pizza Hut</w:t>
             </w:r>
           </w:p>
         </w:tc>
         <w:tc>
           <w:tcPr>
-            <w:tcW w:type="dxa" w:w="1700"/>
-            <w:shd w:fill="F4F7FA" w:val="clear"/>
+            <w:tcW w:type="dxa" w:w="1474"/>
           </w:tcPr>
           <w:p>
+            <w:pPr>
+              <w:spacing w:before="20" w:after="20"/>
+            </w:pPr>
             <w:r/>
             <w:r>
               <w:rPr>
                 <w:rFonts w:ascii="Calibri" w:hAnsi="Calibri"/>
                 <w:b w:val="0"/>
                 <w:color w:val="0D3B66"/>
-                <w:sz w:val="20"/>
+                <w:sz w:val="16"/>
               </w:rPr>
-              <w:t>Logrado (a cero)</w:t>
+              <w:t>Operativo</w:t>
             </w:r>
           </w:p>
         </w:tc>
         <w:tc>
           <w:tcPr>
-            <w:tcW w:type="dxa" w:w="1700"/>
-            <w:shd w:fill="F4F7FA" w:val="clear"/>
+            <w:tcW w:type="dxa" w:w="2381"/>
           </w:tcPr>
           <w:p>
+            <w:pPr>
+              <w:spacing w:before="20" w:after="20"/>
+            </w:pPr>
             <w:r/>
             <w:r>
               <w:rPr>
                 <w:rFonts w:ascii="Calibri" w:hAnsi="Calibri"/>
                 <w:b w:val="0"/>
                 <w:color w:val="0D3B66"/>
-                <w:sz w:val="20"/>
+                <w:sz w:val="16"/>
               </w:rPr>
-              <w:t>3,2 → 0,1 m³</w:t>
+              <w:t>Ya en cero (no suma $)</w:t>
             </w:r>
           </w:p>
         </w:tc>
         <w:tc>
           <w:tcPr>
-            <w:tcW w:type="dxa" w:w="1700"/>
-            <w:shd w:fill="F4F7FA" w:val="clear"/>
+            <w:tcW w:type="dxa" w:w="1361"/>
           </w:tcPr>
           <w:p>
+            <w:pPr>
+              <w:spacing w:before="20" w:after="20"/>
+            </w:pPr>
             <w:r/>
             <w:r>
               <w:rPr>
                 <w:rFonts w:ascii="Calibri" w:hAnsi="Calibri"/>
                 <w:b w:val="0"/>
                 <w:color w:val="0D3B66"/>
-                <w:sz w:val="20"/>
-              </w:rPr>
-              <w:t>93</w:t>
-            </w:r>
-          </w:p>
-        </w:tc>
-        <w:tc>
-          <w:tcPr>
-            <w:tcW w:type="dxa" w:w="1700"/>
-            <w:shd w:fill="F4F7FA" w:val="clear"/>
-          </w:tcPr>
-          <w:p>
-            <w:r/>
-            <w:r>
-              <w:rPr>
-                <w:rFonts w:ascii="Calibri" w:hAnsi="Calibri"/>
-                <w:b w:val="0"/>
-                <w:color w:val="0D3B66"/>
-                <w:sz w:val="20"/>
-              </w:rPr>
-              <w:t>$129.780</w:t>
-            </w:r>
-          </w:p>
-        </w:tc>
-        <w:tc>
-          <w:tcPr>
-            <w:tcW w:type="dxa" w:w="1700"/>
-            <w:shd w:fill="F4F7FA" w:val="clear"/>
-          </w:tcPr>
-          <w:p>
-            <w:r/>
-            <w:r>
-              <w:rPr>
-                <w:rFonts w:ascii="Calibri" w:hAnsi="Calibri"/>
-                <w:b w:val="0"/>
-                <w:color w:val="0D3B66"/>
-                <w:sz w:val="20"/>
-              </w:rPr>
-              <w:t>108 m³ ($151.410)</w:t>
-            </w:r>
-          </w:p>
-        </w:tc>
-      </w:tr>
-      <w:tr>
-        <w:tc>
-          <w:tcPr>
-            <w:tcW w:type="dxa" w:w="1700"/>
-          </w:tcPr>
-          <w:p>
-            <w:r/>
-            <w:r>
-              <w:rPr>
-                <w:rFonts w:ascii="Calibri" w:hAnsi="Calibri"/>
-                <w:b/>
-                <w:color w:val="0D3B66"/>
-                <w:sz w:val="20"/>
-              </w:rPr>
-              <w:t>MAE Pizza Hut — corte 01/07</w:t>
-            </w:r>
-          </w:p>
-        </w:tc>
-        <w:tc>
-          <w:tcPr>
-            <w:tcW w:type="dxa" w:w="1700"/>
-          </w:tcPr>
-          <w:p>
-            <w:r/>
-            <w:r>
-              <w:rPr>
-                <w:rFonts w:ascii="Calibri" w:hAnsi="Calibri"/>
-                <w:b w:val="0"/>
-                <w:color w:val="0D3B66"/>
-                <w:sz w:val="20"/>
-              </w:rPr>
-              <w:t>Operativo (no suma $)</w:t>
-            </w:r>
-          </w:p>
-        </w:tc>
-        <w:tc>
-          <w:tcPr>
-            <w:tcW w:type="dxa" w:w="1700"/>
-          </w:tcPr>
-          <w:p>
-            <w:r/>
-            <w:r>
-              <w:rPr>
-                <w:rFonts w:ascii="Calibri" w:hAnsi="Calibri"/>
-                <w:b w:val="0"/>
-                <w:color w:val="0D3B66"/>
-                <w:sz w:val="20"/>
-              </w:rPr>
-              <w:t>01:00–05:00 ya en cero</w:t>
-            </w:r>
-          </w:p>
-        </w:tc>
-        <w:tc>
-          <w:tcPr>
-            <w:tcW w:type="dxa" w:w="1700"/>
-          </w:tcPr>
-          <w:p>
-            <w:r/>
-            <w:r>
-              <w:rPr>
-                <w:rFonts w:ascii="Calibri" w:hAnsi="Calibri"/>
-                <w:b w:val="0"/>
-                <w:color w:val="0D3B66"/>
-                <w:sz w:val="20"/>
+                <w:sz w:val="16"/>
               </w:rPr>
               <w:t>—</w:t>
             </w:r>
@@ -592,376 +614,370 @@
         </w:tc>
         <w:tc>
           <w:tcPr>
-            <w:tcW w:type="dxa" w:w="1700"/>
+            <w:tcW w:type="dxa" w:w="1587"/>
           </w:tcPr>
           <w:p>
+            <w:pPr>
+              <w:spacing w:before="20" w:after="20"/>
+            </w:pPr>
             <w:r/>
             <w:r>
               <w:rPr>
                 <w:rFonts w:ascii="Calibri" w:hAnsi="Calibri"/>
                 <w:b w:val="0"/>
                 <w:color w:val="0D3B66"/>
-                <w:sz w:val="20"/>
+                <w:sz w:val="16"/>
               </w:rPr>
               <w:t>—</w:t>
             </w:r>
           </w:p>
         </w:tc>
+      </w:tr>
+      <w:tr>
+        <w:trPr>
+          <w:cantSplit/>
+        </w:trPr>
         <w:tc>
           <w:tcPr>
-            <w:tcW w:type="dxa" w:w="1700"/>
+            <w:tcW w:type="dxa" w:w="3061"/>
+            <w:shd w:fill="F4F7FA" w:val="clear"/>
           </w:tcPr>
           <w:p>
+            <w:pPr>
+              <w:spacing w:before="20" w:after="20"/>
+            </w:pPr>
+            <w:r/>
+            <w:r>
+              <w:rPr>
+                <w:rFonts w:ascii="Calibri" w:hAnsi="Calibri"/>
+                <w:b/>
+                <w:color w:val="0D3B66"/>
+                <w:sz w:val="16"/>
+              </w:rPr>
+              <w:t>Buenaventura SI500</w:t>
+            </w:r>
+          </w:p>
+        </w:tc>
+        <w:tc>
+          <w:tcPr>
+            <w:tcW w:type="dxa" w:w="1474"/>
+            <w:shd w:fill="F4F7FA" w:val="clear"/>
+          </w:tcPr>
+          <w:p>
+            <w:pPr>
+              <w:spacing w:before="20" w:after="20"/>
+            </w:pPr>
             <w:r/>
             <w:r>
               <w:rPr>
                 <w:rFonts w:ascii="Calibri" w:hAnsi="Calibri"/>
                 <w:b w:val="0"/>
                 <w:color w:val="0D3B66"/>
-                <w:sz w:val="20"/>
+                <w:sz w:val="16"/>
               </w:rPr>
-              <w:t>Control puesto; el día alto es ocupación de local</w:t>
+              <w:t>Logrado</w:t>
+            </w:r>
+          </w:p>
+        </w:tc>
+        <w:tc>
+          <w:tcPr>
+            <w:tcW w:type="dxa" w:w="2381"/>
+            <w:shd w:fill="F4F7FA" w:val="clear"/>
+          </w:tcPr>
+          <w:p>
+            <w:pPr>
+              <w:spacing w:before="20" w:after="20"/>
+            </w:pPr>
+            <w:r/>
+            <w:r>
+              <w:rPr>
+                <w:rFonts w:ascii="Calibri" w:hAnsi="Calibri"/>
+                <w:b w:val="0"/>
+                <w:color w:val="0D3B66"/>
+                <w:sz w:val="16"/>
+              </w:rPr>
+              <w:t>31,7 → 0 m³ desde 00:30</w:t>
+            </w:r>
+          </w:p>
+        </w:tc>
+        <w:tc>
+          <w:tcPr>
+            <w:tcW w:type="dxa" w:w="1361"/>
+            <w:shd w:fill="F4F7FA" w:val="clear"/>
+          </w:tcPr>
+          <w:p>
+            <w:pPr>
+              <w:spacing w:before="20" w:after="20"/>
+            </w:pPr>
+            <w:r/>
+            <w:r>
+              <w:rPr>
+                <w:rFonts w:ascii="Calibri" w:hAnsi="Calibri"/>
+                <w:b w:val="0"/>
+                <w:color w:val="0D3B66"/>
+                <w:sz w:val="16"/>
+              </w:rPr>
+              <w:t>886</w:t>
+            </w:r>
+          </w:p>
+        </w:tc>
+        <w:tc>
+          <w:tcPr>
+            <w:tcW w:type="dxa" w:w="1587"/>
+            <w:shd w:fill="F4F7FA" w:val="clear"/>
+          </w:tcPr>
+          <w:p>
+            <w:pPr>
+              <w:spacing w:before="20" w:after="20"/>
+            </w:pPr>
+            <w:r/>
+            <w:r>
+              <w:rPr>
+                <w:rFonts w:ascii="Calibri" w:hAnsi="Calibri"/>
+                <w:b w:val="0"/>
+                <w:color w:val="0D3B66"/>
+                <w:sz w:val="16"/>
+              </w:rPr>
+              <w:t>$1.241.100</w:t>
             </w:r>
           </w:p>
         </w:tc>
       </w:tr>
       <w:tr>
+        <w:trPr>
+          <w:cantSplit/>
+        </w:trPr>
         <w:tc>
           <w:tcPr>
-            <w:tcW w:type="dxa" w:w="1700"/>
-            <w:shd w:fill="F4F7FA" w:val="clear"/>
+            <w:tcW w:type="dxa" w:w="3061"/>
           </w:tcPr>
           <w:p>
+            <w:pPr>
+              <w:spacing w:before="20" w:after="20"/>
+            </w:pPr>
             <w:r/>
             <w:r>
               <w:rPr>
                 <w:rFonts w:ascii="Calibri" w:hAnsi="Calibri"/>
                 <w:b/>
                 <w:color w:val="0D3B66"/>
-                <w:sz w:val="20"/>
+                <w:sz w:val="16"/>
               </w:rPr>
-              <w:t>Buenaventura SI500 — corte 00:30 (01:00–05:00)</w:t>
+              <w:t>Quilicura Matriz</w:t>
             </w:r>
           </w:p>
         </w:tc>
         <w:tc>
           <w:tcPr>
-            <w:tcW w:type="dxa" w:w="1700"/>
-            <w:shd w:fill="F4F7FA" w:val="clear"/>
+            <w:tcW w:type="dxa" w:w="1474"/>
           </w:tcPr>
           <w:p>
+            <w:pPr>
+              <w:spacing w:before="20" w:after="20"/>
+            </w:pPr>
             <w:r/>
             <w:r>
               <w:rPr>
                 <w:rFonts w:ascii="Calibri" w:hAnsi="Calibri"/>
                 <w:b w:val="0"/>
                 <w:color w:val="0D3B66"/>
-                <w:sz w:val="20"/>
+                <w:sz w:val="16"/>
               </w:rPr>
-              <w:t>Logrado (a cero)</w:t>
+              <w:t>Propuesta</w:t>
             </w:r>
           </w:p>
         </w:tc>
         <w:tc>
           <w:tcPr>
-            <w:tcW w:type="dxa" w:w="1700"/>
-            <w:shd w:fill="F4F7FA" w:val="clear"/>
+            <w:tcW w:type="dxa" w:w="2381"/>
           </w:tcPr>
           <w:p>
+            <w:pPr>
+              <w:spacing w:before="20" w:after="20"/>
+            </w:pPr>
             <w:r/>
             <w:r>
               <w:rPr>
                 <w:rFonts w:ascii="Calibri" w:hAnsi="Calibri"/>
                 <w:b w:val="0"/>
                 <w:color w:val="0D3B66"/>
-                <w:sz w:val="20"/>
+                <w:sz w:val="16"/>
               </w:rPr>
-              <w:t>20,2 → 0 m³</w:t>
+              <w:t>21,1 m³ → 0 desde 00:30</w:t>
             </w:r>
           </w:p>
         </w:tc>
         <w:tc>
           <w:tcPr>
-            <w:tcW w:type="dxa" w:w="1700"/>
-            <w:shd w:fill="F4F7FA" w:val="clear"/>
+            <w:tcW w:type="dxa" w:w="1361"/>
           </w:tcPr>
           <w:p>
+            <w:pPr>
+              <w:spacing w:before="20" w:after="20"/>
+            </w:pPr>
             <w:r/>
             <w:r>
               <w:rPr>
                 <w:rFonts w:ascii="Calibri" w:hAnsi="Calibri"/>
                 <w:b w:val="0"/>
                 <w:color w:val="0D3B66"/>
-                <w:sz w:val="20"/>
+                <w:sz w:val="16"/>
               </w:rPr>
-              <w:t>607</w:t>
+              <w:t>634</w:t>
             </w:r>
           </w:p>
         </w:tc>
         <w:tc>
           <w:tcPr>
-            <w:tcW w:type="dxa" w:w="1700"/>
-            <w:shd w:fill="F4F7FA" w:val="clear"/>
+            <w:tcW w:type="dxa" w:w="1587"/>
           </w:tcPr>
           <w:p>
+            <w:pPr>
+              <w:spacing w:before="20" w:after="20"/>
+            </w:pPr>
             <w:r/>
             <w:r>
               <w:rPr>
                 <w:rFonts w:ascii="Calibri" w:hAnsi="Calibri"/>
                 <w:b w:val="0"/>
                 <w:color w:val="0D3B66"/>
-                <w:sz w:val="20"/>
+                <w:sz w:val="16"/>
               </w:rPr>
-              <w:t>$850.080</w:t>
+              <w:t>$887.040</w:t>
+            </w:r>
+          </w:p>
+        </w:tc>
+      </w:tr>
+      <w:tr>
+        <w:trPr>
+          <w:cantSplit/>
+        </w:trPr>
+        <w:tc>
+          <w:tcPr>
+            <w:tcW w:type="dxa" w:w="3061"/>
+            <w:shd w:fill="F4F7FA" w:val="clear"/>
+          </w:tcPr>
+          <w:p>
+            <w:pPr>
+              <w:spacing w:before="20" w:after="20"/>
+            </w:pPr>
+            <w:r/>
+            <w:r>
+              <w:rPr>
+                <w:rFonts w:ascii="Calibri" w:hAnsi="Calibri"/>
+                <w:b/>
+                <w:color w:val="0D3B66"/>
+                <w:sz w:val="16"/>
+              </w:rPr>
+              <w:t>Kennedy Bazar Gourmet</w:t>
             </w:r>
           </w:p>
         </w:tc>
         <w:tc>
           <w:tcPr>
-            <w:tcW w:type="dxa" w:w="1700"/>
+            <w:tcW w:type="dxa" w:w="1474"/>
             <w:shd w:fill="F4F7FA" w:val="clear"/>
           </w:tcPr>
           <w:p>
+            <w:pPr>
+              <w:spacing w:before="20" w:after="20"/>
+            </w:pPr>
             <w:r/>
             <w:r>
               <w:rPr>
                 <w:rFonts w:ascii="Calibri" w:hAnsi="Calibri"/>
                 <w:b w:val="0"/>
                 <w:color w:val="0D3B66"/>
-                <w:sz w:val="20"/>
+                <w:sz w:val="16"/>
               </w:rPr>
-              <w:t>1.093 m³ ($1.530.144)</w:t>
+              <w:t>Propuesta</w:t>
+            </w:r>
+          </w:p>
+        </w:tc>
+        <w:tc>
+          <w:tcPr>
+            <w:tcW w:type="dxa" w:w="2381"/>
+            <w:shd w:fill="F4F7FA" w:val="clear"/>
+          </w:tcPr>
+          <w:p>
+            <w:pPr>
+              <w:spacing w:before="20" w:after="20"/>
+            </w:pPr>
+            <w:r/>
+            <w:r>
+              <w:rPr>
+                <w:rFonts w:ascii="Calibri" w:hAnsi="Calibri"/>
+                <w:b w:val="0"/>
+                <w:color w:val="0D3B66"/>
+                <w:sz w:val="16"/>
+              </w:rPr>
+              <w:t>29,1 m³ → 0 desde 00:30</w:t>
+            </w:r>
+          </w:p>
+        </w:tc>
+        <w:tc>
+          <w:tcPr>
+            <w:tcW w:type="dxa" w:w="1361"/>
+            <w:shd w:fill="F4F7FA" w:val="clear"/>
+          </w:tcPr>
+          <w:p>
+            <w:pPr>
+              <w:spacing w:before="20" w:after="20"/>
+            </w:pPr>
+            <w:r/>
+            <w:r>
+              <w:rPr>
+                <w:rFonts w:ascii="Calibri" w:hAnsi="Calibri"/>
+                <w:b w:val="0"/>
+                <w:color w:val="0D3B66"/>
+                <w:sz w:val="16"/>
+              </w:rPr>
+              <w:t>874</w:t>
+            </w:r>
+          </w:p>
+        </w:tc>
+        <w:tc>
+          <w:tcPr>
+            <w:tcW w:type="dxa" w:w="1587"/>
+            <w:shd w:fill="F4F7FA" w:val="clear"/>
+          </w:tcPr>
+          <w:p>
+            <w:pPr>
+              <w:spacing w:before="20" w:after="20"/>
+            </w:pPr>
+            <w:r/>
+            <w:r>
+              <w:rPr>
+                <w:rFonts w:ascii="Calibri" w:hAnsi="Calibri"/>
+                <w:b w:val="0"/>
+                <w:color w:val="0D3B66"/>
+                <w:sz w:val="16"/>
+              </w:rPr>
+              <w:t>$1.224.300</w:t>
             </w:r>
           </w:p>
         </w:tc>
       </w:tr>
       <w:tr>
+        <w:trPr>
+          <w:cantSplit/>
+        </w:trPr>
         <w:tc>
           <w:tcPr>
-            <w:tcW w:type="dxa" w:w="1700"/>
+            <w:tcW w:type="dxa" w:w="3061"/>
+            <w:shd w:fill="D9E1F2" w:val="clear"/>
           </w:tcPr>
           <w:p>
+            <w:pPr>
+              <w:spacing w:before="20" w:after="20"/>
+            </w:pPr>
             <w:r/>
             <w:r>
               <w:rPr>
                 <w:rFonts w:ascii="Calibri" w:hAnsi="Calibri"/>
                 <w:b/>
                 <w:color w:val="0D3B66"/>
-                <w:sz w:val="20"/>
-              </w:rPr>
-              <w:t>Quilicura Matriz — corte 00:30 (01:00–05:00)</w:t>
-            </w:r>
-          </w:p>
-        </w:tc>
-        <w:tc>
-          <w:tcPr>
-            <w:tcW w:type="dxa" w:w="1700"/>
-          </w:tcPr>
-          <w:p>
-            <w:r/>
-            <w:r>
-              <w:rPr>
-                <w:rFonts w:ascii="Calibri" w:hAnsi="Calibri"/>
-                <w:b w:val="0"/>
-                <w:color w:val="0D3B66"/>
-                <w:sz w:val="20"/>
-              </w:rPr>
-              <w:t>Propuesta (a cero)</w:t>
-            </w:r>
-          </w:p>
-        </w:tc>
-        <w:tc>
-          <w:tcPr>
-            <w:tcW w:type="dxa" w:w="1700"/>
-          </w:tcPr>
-          <w:p>
-            <w:r/>
-            <w:r>
-              <w:rPr>
-                <w:rFonts w:ascii="Calibri" w:hAnsi="Calibri"/>
-                <w:b w:val="0"/>
-                <w:color w:val="0D3B66"/>
-                <w:sz w:val="20"/>
-              </w:rPr>
-              <w:t>noche típica 13,2 m³ → 0</w:t>
-            </w:r>
-          </w:p>
-        </w:tc>
-        <w:tc>
-          <w:tcPr>
-            <w:tcW w:type="dxa" w:w="1700"/>
-          </w:tcPr>
-          <w:p>
-            <w:r/>
-            <w:r>
-              <w:rPr>
-                <w:rFonts w:ascii="Calibri" w:hAnsi="Calibri"/>
-                <w:b w:val="0"/>
-                <w:color w:val="0D3B66"/>
-                <w:sz w:val="20"/>
-              </w:rPr>
-              <w:t>395</w:t>
-            </w:r>
-          </w:p>
-        </w:tc>
-        <w:tc>
-          <w:tcPr>
-            <w:tcW w:type="dxa" w:w="1700"/>
-          </w:tcPr>
-          <w:p>
-            <w:r/>
-            <w:r>
-              <w:rPr>
-                <w:rFonts w:ascii="Calibri" w:hAnsi="Calibri"/>
-                <w:b w:val="0"/>
-                <w:color w:val="0D3B66"/>
-                <w:sz w:val="20"/>
-              </w:rPr>
-              <w:t>$553.560</w:t>
-            </w:r>
-          </w:p>
-        </w:tc>
-        <w:tc>
-          <w:tcPr>
-            <w:tcW w:type="dxa" w:w="1700"/>
-          </w:tcPr>
-          <w:p>
-            <w:r/>
-            <w:r>
-              <w:rPr>
-                <w:rFonts w:ascii="Calibri" w:hAnsi="Calibri"/>
-                <w:b w:val="0"/>
-                <w:color w:val="0D3B66"/>
-                <w:sz w:val="20"/>
-              </w:rPr>
-              <w:t>Aún no operativo</w:t>
-            </w:r>
-          </w:p>
-        </w:tc>
-      </w:tr>
-      <w:tr>
-        <w:tc>
-          <w:tcPr>
-            <w:tcW w:type="dxa" w:w="1700"/>
-            <w:shd w:fill="F4F7FA" w:val="clear"/>
-          </w:tcPr>
-          <w:p>
-            <w:r/>
-            <w:r>
-              <w:rPr>
-                <w:rFonts w:ascii="Calibri" w:hAnsi="Calibri"/>
-                <w:b/>
-                <w:color w:val="0D3B66"/>
-                <w:sz w:val="20"/>
-              </w:rPr>
-              <w:t>Kennedy Bazar Gourmet — corte 00:30 (01:00–05:00)</w:t>
-            </w:r>
-          </w:p>
-        </w:tc>
-        <w:tc>
-          <w:tcPr>
-            <w:tcW w:type="dxa" w:w="1700"/>
-            <w:shd w:fill="F4F7FA" w:val="clear"/>
-          </w:tcPr>
-          <w:p>
-            <w:r/>
-            <w:r>
-              <w:rPr>
-                <w:rFonts w:ascii="Calibri" w:hAnsi="Calibri"/>
-                <w:b w:val="0"/>
-                <w:color w:val="0D3B66"/>
-                <w:sz w:val="20"/>
-              </w:rPr>
-              <w:t>Propuesta (a cero)</w:t>
-            </w:r>
-          </w:p>
-        </w:tc>
-        <w:tc>
-          <w:tcPr>
-            <w:tcW w:type="dxa" w:w="1700"/>
-            <w:shd w:fill="F4F7FA" w:val="clear"/>
-          </w:tcPr>
-          <w:p>
-            <w:r/>
-            <w:r>
-              <w:rPr>
-                <w:rFonts w:ascii="Calibri" w:hAnsi="Calibri"/>
-                <w:b w:val="0"/>
-                <w:color w:val="0D3B66"/>
-                <w:sz w:val="20"/>
-              </w:rPr>
-              <w:t>noche típica 19 m³ → 0</w:t>
-            </w:r>
-          </w:p>
-        </w:tc>
-        <w:tc>
-          <w:tcPr>
-            <w:tcW w:type="dxa" w:w="1700"/>
-            <w:shd w:fill="F4F7FA" w:val="clear"/>
-          </w:tcPr>
-          <w:p>
-            <w:r/>
-            <w:r>
-              <w:rPr>
-                <w:rFonts w:ascii="Calibri" w:hAnsi="Calibri"/>
-                <w:b w:val="0"/>
-                <w:color w:val="0D3B66"/>
-                <w:sz w:val="20"/>
-              </w:rPr>
-              <w:t>570</w:t>
-            </w:r>
-          </w:p>
-        </w:tc>
-        <w:tc>
-          <w:tcPr>
-            <w:tcW w:type="dxa" w:w="1700"/>
-            <w:shd w:fill="F4F7FA" w:val="clear"/>
-          </w:tcPr>
-          <w:p>
-            <w:r/>
-            <w:r>
-              <w:rPr>
-                <w:rFonts w:ascii="Calibri" w:hAnsi="Calibri"/>
-                <w:b w:val="0"/>
-                <w:color w:val="0D3B66"/>
-                <w:sz w:val="20"/>
-              </w:rPr>
-              <w:t>$798.000</w:t>
-            </w:r>
-          </w:p>
-        </w:tc>
-        <w:tc>
-          <w:tcPr>
-            <w:tcW w:type="dxa" w:w="1700"/>
-            <w:shd w:fill="F4F7FA" w:val="clear"/>
-          </w:tcPr>
-          <w:p>
-            <w:r/>
-            <w:r>
-              <w:rPr>
-                <w:rFonts w:ascii="Calibri" w:hAnsi="Calibri"/>
-                <w:b w:val="0"/>
-                <w:color w:val="0D3B66"/>
-                <w:sz w:val="20"/>
-              </w:rPr>
-              <w:t>Aún no operativo</w:t>
-            </w:r>
-          </w:p>
-        </w:tc>
-      </w:tr>
-      <w:tr>
-        <w:tc>
-          <w:tcPr>
-            <w:tcW w:type="dxa" w:w="1700"/>
-          </w:tcPr>
-          <w:p>
-            <w:r/>
-            <w:r>
-              <w:rPr>
-                <w:rFonts w:ascii="Calibri" w:hAnsi="Calibri"/>
-                <w:b/>
-                <w:color w:val="0D3B66"/>
-                <w:sz w:val="20"/>
+                <w:sz w:val="16"/>
               </w:rPr>
               <w:t>Total logrado</w:t>
             </w:r>
@@ -969,16 +985,20 @@
         </w:tc>
         <w:tc>
           <w:tcPr>
-            <w:tcW w:type="dxa" w:w="1700"/>
+            <w:tcW w:type="dxa" w:w="1474"/>
+            <w:shd w:fill="D9E1F2" w:val="clear"/>
           </w:tcPr>
           <w:p>
+            <w:pPr>
+              <w:spacing w:before="20" w:after="20"/>
+            </w:pPr>
             <w:r/>
             <w:r>
               <w:rPr>
                 <w:rFonts w:ascii="Calibri" w:hAnsi="Calibri"/>
-                <w:b w:val="0"/>
+                <w:b/>
                 <w:color w:val="0D3B66"/>
-                <w:sz w:val="20"/>
+                <w:sz w:val="16"/>
               </w:rPr>
               <w:t>Operativo</w:t>
             </w:r>
@@ -986,16 +1006,20 @@
         </w:tc>
         <w:tc>
           <w:tcPr>
-            <w:tcW w:type="dxa" w:w="1700"/>
+            <w:tcW w:type="dxa" w:w="2381"/>
+            <w:shd w:fill="D9E1F2" w:val="clear"/>
           </w:tcPr>
           <w:p>
+            <w:pPr>
+              <w:spacing w:before="20" w:after="20"/>
+            </w:pPr>
             <w:r/>
             <w:r>
               <w:rPr>
                 <w:rFonts w:ascii="Calibri" w:hAnsi="Calibri"/>
-                <w:b w:val="0"/>
+                <w:b/>
                 <w:color w:val="0D3B66"/>
-                <w:sz w:val="20"/>
+                <w:sz w:val="16"/>
               </w:rPr>
               <w:t>MAE + Buenaventura</w:t>
             </w:r>
@@ -1003,70 +1027,68 @@
         </w:tc>
         <w:tc>
           <w:tcPr>
-            <w:tcW w:type="dxa" w:w="1700"/>
+            <w:tcW w:type="dxa" w:w="1361"/>
+            <w:shd w:fill="D9E1F2" w:val="clear"/>
           </w:tcPr>
           <w:p>
-            <w:r/>
-            <w:r>
-              <w:rPr>
-                <w:rFonts w:ascii="Calibri" w:hAnsi="Calibri"/>
-                <w:b w:val="0"/>
-                <w:color w:val="0D3B66"/>
-                <w:sz w:val="20"/>
-              </w:rPr>
-              <w:t>2.525</w:t>
-            </w:r>
-          </w:p>
-        </w:tc>
-        <w:tc>
-          <w:tcPr>
-            <w:tcW w:type="dxa" w:w="1700"/>
-          </w:tcPr>
-          <w:p>
-            <w:r/>
-            <w:r>
-              <w:rPr>
-                <w:rFonts w:ascii="Calibri" w:hAnsi="Calibri"/>
-                <w:b w:val="0"/>
-                <w:color w:val="0D3B66"/>
-                <w:sz w:val="20"/>
-              </w:rPr>
-              <w:t>$3.535.560</w:t>
-            </w:r>
-          </w:p>
-        </w:tc>
-        <w:tc>
-          <w:tcPr>
-            <w:tcW w:type="dxa" w:w="1700"/>
-          </w:tcPr>
-          <w:p>
-            <w:r/>
-            <w:r>
-              <w:rPr>
-                <w:rFonts w:ascii="Calibri" w:hAnsi="Calibri"/>
-                <w:b w:val="0"/>
-                <w:color w:val="0D3B66"/>
-                <w:sz w:val="20"/>
-              </w:rPr>
-              <w:t>6.617 m³ ($9.263.464)</w:t>
-            </w:r>
-          </w:p>
-        </w:tc>
-      </w:tr>
-      <w:tr>
-        <w:tc>
-          <w:tcPr>
-            <w:tcW w:type="dxa" w:w="1700"/>
-            <w:shd w:fill="F4F7FA" w:val="clear"/>
-          </w:tcPr>
-          <w:p>
+            <w:pPr>
+              <w:spacing w:before="20" w:after="20"/>
+            </w:pPr>
             <w:r/>
             <w:r>
               <w:rPr>
                 <w:rFonts w:ascii="Calibri" w:hAnsi="Calibri"/>
                 <w:b/>
                 <w:color w:val="0D3B66"/>
-                <w:sz w:val="20"/>
+                <w:sz w:val="16"/>
+              </w:rPr>
+              <w:t>2.825</w:t>
+            </w:r>
+          </w:p>
+        </w:tc>
+        <w:tc>
+          <w:tcPr>
+            <w:tcW w:type="dxa" w:w="1587"/>
+            <w:shd w:fill="D9E1F2" w:val="clear"/>
+          </w:tcPr>
+          <w:p>
+            <w:pPr>
+              <w:spacing w:before="20" w:after="20"/>
+            </w:pPr>
+            <w:r/>
+            <w:r>
+              <w:rPr>
+                <w:rFonts w:ascii="Calibri" w:hAnsi="Calibri"/>
+                <w:b/>
+                <w:color w:val="0D3B66"/>
+                <w:sz w:val="16"/>
+              </w:rPr>
+              <w:t>$3.954.720</w:t>
+            </w:r>
+          </w:p>
+        </w:tc>
+      </w:tr>
+      <w:tr>
+        <w:trPr>
+          <w:cantSplit/>
+        </w:trPr>
+        <w:tc>
+          <w:tcPr>
+            <w:tcW w:type="dxa" w:w="3061"/>
+            <w:shd w:fill="F4F7FA" w:val="clear"/>
+            <w:shd w:fill="D9E1F2" w:val="clear"/>
+          </w:tcPr>
+          <w:p>
+            <w:pPr>
+              <w:spacing w:before="20" w:after="20"/>
+            </w:pPr>
+            <w:r/>
+            <w:r>
+              <w:rPr>
+                <w:rFonts w:ascii="Calibri" w:hAnsi="Calibri"/>
+                <w:b/>
+                <w:color w:val="0D3B66"/>
+                <w:sz w:val="16"/>
               </w:rPr>
               <w:t>Total si se aprueban MAQ + PAK</w:t>
             </w:r>
@@ -1074,17 +1096,21 @@
         </w:tc>
         <w:tc>
           <w:tcPr>
-            <w:tcW w:type="dxa" w:w="1700"/>
+            <w:tcW w:type="dxa" w:w="1474"/>
             <w:shd w:fill="F4F7FA" w:val="clear"/>
+            <w:shd w:fill="D9E1F2" w:val="clear"/>
           </w:tcPr>
           <w:p>
+            <w:pPr>
+              <w:spacing w:before="20" w:after="20"/>
+            </w:pPr>
             <w:r/>
             <w:r>
               <w:rPr>
                 <w:rFonts w:ascii="Calibri" w:hAnsi="Calibri"/>
-                <w:b w:val="0"/>
+                <w:b/>
                 <w:color w:val="0D3B66"/>
-                <w:sz w:val="20"/>
+                <w:sz w:val="16"/>
               </w:rPr>
               <w:t>Logrado + propuesto</w:t>
             </w:r>
@@ -1092,17 +1118,21 @@
         </w:tc>
         <w:tc>
           <w:tcPr>
-            <w:tcW w:type="dxa" w:w="1700"/>
+            <w:tcW w:type="dxa" w:w="2381"/>
             <w:shd w:fill="F4F7FA" w:val="clear"/>
+            <w:shd w:fill="D9E1F2" w:val="clear"/>
           </w:tcPr>
           <w:p>
+            <w:pPr>
+              <w:spacing w:before="20" w:after="20"/>
+            </w:pPr>
             <w:r/>
             <w:r>
               <w:rPr>
                 <w:rFonts w:ascii="Calibri" w:hAnsi="Calibri"/>
-                <w:b w:val="0"/>
+                <w:b/>
                 <w:color w:val="0D3B66"/>
-                <w:sz w:val="20"/>
+                <w:sz w:val="16"/>
               </w:rPr>
               <w:t>Cuatro recintos</w:t>
             </w:r>
@@ -1110,61 +1140,66 @@
         </w:tc>
         <w:tc>
           <w:tcPr>
-            <w:tcW w:type="dxa" w:w="1700"/>
+            <w:tcW w:type="dxa" w:w="1361"/>
             <w:shd w:fill="F4F7FA" w:val="clear"/>
+            <w:shd w:fill="D9E1F2" w:val="clear"/>
           </w:tcPr>
           <w:p>
+            <w:pPr>
+              <w:spacing w:before="20" w:after="20"/>
+            </w:pPr>
             <w:r/>
             <w:r>
               <w:rPr>
                 <w:rFonts w:ascii="Calibri" w:hAnsi="Calibri"/>
-                <w:b w:val="0"/>
+                <w:b/>
                 <w:color w:val="0D3B66"/>
-                <w:sz w:val="20"/>
+                <w:sz w:val="16"/>
               </w:rPr>
-              <w:t>3.491</w:t>
+              <w:t>4.333</w:t>
             </w:r>
           </w:p>
         </w:tc>
         <w:tc>
           <w:tcPr>
-            <w:tcW w:type="dxa" w:w="1700"/>
+            <w:tcW w:type="dxa" w:w="1587"/>
             <w:shd w:fill="F4F7FA" w:val="clear"/>
+            <w:shd w:fill="D9E1F2" w:val="clear"/>
           </w:tcPr>
           <w:p>
+            <w:pPr>
+              <w:spacing w:before="20" w:after="20"/>
+            </w:pPr>
             <w:r/>
             <w:r>
               <w:rPr>
                 <w:rFonts w:ascii="Calibri" w:hAnsi="Calibri"/>
-                <w:b w:val="0"/>
+                <w:b/>
                 <w:color w:val="0D3B66"/>
-                <w:sz w:val="20"/>
+                <w:sz w:val="16"/>
               </w:rPr>
-              <w:t>$4.887.120</w:t>
-            </w:r>
-          </w:p>
-        </w:tc>
-        <w:tc>
-          <w:tcPr>
-            <w:tcW w:type="dxa" w:w="1700"/>
-            <w:shd w:fill="F4F7FA" w:val="clear"/>
-          </w:tcPr>
-          <w:p>
-            <w:r/>
-            <w:r>
-              <w:rPr>
-                <w:rFonts w:ascii="Calibri" w:hAnsi="Calibri"/>
-                <w:b w:val="0"/>
-                <w:color w:val="0D3B66"/>
-                <w:sz w:val="20"/>
-              </w:rPr>
-              <w:t>Proyección a 30 días de operación</w:t>
+              <w:t>$6.066.060</w:t>
             </w:r>
           </w:p>
         </w:tc>
       </w:tr>
     </w:tbl>
     <w:p/>
+    <w:p>
+      <w:pPr>
+        <w:spacing w:after="120" w:before="0" w:line="240" w:lineRule="auto"/>
+        <w:jc w:val="both"/>
+      </w:pPr>
+      <w:r>
+        <w:rPr>
+          <w:rFonts w:ascii="Calibri" w:hAnsi="Calibri"/>
+          <w:b w:val="0"/>
+          <w:color w:val="505050"/>
+          <w:sz w:val="20"/>
+        </w:rPr>
+        <w:t>Acumulado ya operativo a 08/09: 7.143 m³ ($10.000.130). El $ es la noche desde las 00:30 a cero (00:00–00:30 queda en el medidor y no se resta del ahorro).</w:t>
+      </w:r>
+    </w:p>
     <w:p>
       <w:r>
         <w:drawing>
@@ -1212,7 +1247,7 @@
           <w:color w:val="505050"/>
           <w:sz w:val="18"/>
         </w:rPr>
-        <w:t>Verde = ya operativo (01:00–05:00 a cero). Dorado = propuesta, misma ventana a cero.</w:t>
+        <w:t>Verde = ya operativo (noche a cero desde las 00:30). Dorado = propuesta, misma ventana a cero.</w:t>
       </w:r>
     </w:p>
     <w:p>
@@ -1290,7 +1325,7 @@
           <w:color w:val="0D3B66"/>
           <w:sz w:val="22"/>
         </w:rPr>
-        <w:t>Estanque Norte (desde el 05/08): el corte se activa a las 00:30, así que la noche que cuenta es 01:00–05:00. Ahí pasó de 3,2 a 0,1 m³ (prácticamente cero). Ahorro 3,1 m³/noche = 93 m³/mes ($129.780). Lo que aparece si se mira 00:00–01:00 (1,1 m³) es el tramo 00:00–00:30, antes de que el corte quede armado: no es consumo de noche y no se resta del ahorro. Es un número menor frente a Sur; se muestra para demostrar que el on/off también corre en MAE.</w:t>
+        <w:t>Estanque Norte (desde el 05/08): el corte se activa a las 00:30. De 01:00 a 05:00 el consumo quedó en cero (de 3,2 a 0,1 m³). La noche completa desde las 00:30 era 4,8 m³: eso es 3,8 m³/noche = 113 m³/mes ($157.920). Lo que aparece entre 00:00 y 00:30 (1,1 m³) no es noche y no se resta del ahorro.</w:t>
       </w:r>
     </w:p>
     <w:p>
@@ -1383,7 +1418,7 @@
           <w:color w:val="0D3B66"/>
           <w:sz w:val="22"/>
         </w:rPr>
-        <w:t>San Ignacio 500 tiene corte nocturno desde el 17/07, armado a las 00:30. Entre 01:00 y 05:00 el consumo pasó de 20,2 m³ a 0 m³: a cero. Eso es 20,2 m³/noche = 607 m³/mes ($850.080). Acumulado 17/07–08/09 (54 noches): 1.093 m³ ($1.530.144).</w:t>
+        <w:t>San Ignacio 500 tiene corte nocturno desde el 17/07, armado a las 00:30. De 01:00 a 05:00 pasó de 20,2 m³ a cero. La noche completa desde las 00:30 era 31,7 m³ y quedó en cero: 29,6 m³/noche = 886 m³/mes ($1.241.100). Acumulado 17/07–08/09 (54 noches): 1.596 m³ ($2.233.980).</w:t>
       </w:r>
     </w:p>
     <w:p>
@@ -1398,7 +1433,7 @@
           <w:color w:val="0D3B66"/>
           <w:sz w:val="22"/>
         </w:rPr>
-        <w:t>Si alguien mira el total 00:00–06:00 va a ver ~2,1 m³. Eso no es un residual de noche ni una fuga: es el agua que corre entre las 00:00 y las 00:30, hasta que el corte queda armado. La meta del control es cero de 01:00 a 05:00, y esa meta ya se cumple. San Ignacio 300 queda en monitoreo; no es el punto del corte.</w:t>
+        <w:t>Si alguien mira el total 00:00–06:00 va a ver ~2,1 m³. Eso no es un residual de noche ni una fuga: es el agua que corre entre las 00:00 y las 00:30, hasta que el corte queda armado. No se resta del ahorro. San Ignacio 300 queda en monitoreo; no es el punto del corte.</w:t>
       </w:r>
     </w:p>
     <w:p>
@@ -1476,7 +1511,7 @@
           <w:color w:val="0D3B66"/>
           <w:sz w:val="22"/>
         </w:rPr>
-        <w:t>La Matriz Principal concentra el recinto. Desde el 22/06 el día se duplicó y se sostuvo; Alimentación Baños es uso hábil, no es el problema. La noche 01:00–05:00, desde esa alza, anda en 13,2 m³ (mediana, 79 noches hasta 08/09).</w:t>
+        <w:t>La Matriz Principal concentra el recinto. Desde el 22/06 el día se duplicó y se sostuvo; Alimentación Baños es uso hábil, no es el problema. La noche desde las 00:30, desde esa alza, anda en 21,1 m³ (mediana, 79 noches hasta 08/09).</w:t>
       </w:r>
     </w:p>
     <w:p>
@@ -1491,7 +1526,7 @@
           <w:color w:val="0D3B66"/>
           <w:sz w:val="22"/>
         </w:rPr>
-        <w:t>Propuesta: mismo corte que SI500 y Norte (se arma a las 00:30) en Matriz Principal. La meta es pasar 13,2 m³ a cero entre 01:00 y 05:00 = 13,2 m³/noche × 30 = 395 m³/mes ($553.560). No se resta residual: el control nocturno es ir a cero.</w:t>
+        <w:t>Propuesta: mismo corte que SI500 y Norte (se arma a las 00:30) en Matriz Principal. La meta es pasar 21,1 m³ a cero desde las 00:30 = 21,1 m³/noche × 30 = 634 m³/mes ($887.040). No se resta el tramo 00:00–00:30: el control es ir a cero.</w:t>
       </w:r>
     </w:p>
     <w:p>
@@ -1548,7 +1583,7 @@
           <w:color w:val="0D3B66"/>
           <w:sz w:val="22"/>
         </w:rPr>
-        <w:t>El eslabón de mayor noche 01:00–05:00 es Bazar Gourmet: 19 m³ (el otro queda más abajo). Propuesta: mismo corte a las 00:30 en Bazar Gourmet. Meta: 19 m³ → 0 = 570 m³/mes ($798.000). Tampoco se resta residual.</w:t>
+        <w:t>El eslabón de mayor noche desde las 00:30 es Bazar Gourmet: 29,1 m³ (el otro queda más abajo). Propuesta: mismo corte a las 00:30 en Bazar Gourmet. Meta: 29,1 m³ → 0 = 874 m³/mes ($1.224.300). Tampoco se resta el tramo 00:00–00:30.</w:t>
       </w:r>
     </w:p>
     <w:p>
@@ -1697,7 +1732,7 @@
           <w:color w:val="0D3B66"/>
           <w:sz w:val="22"/>
         </w:rPr>
-        <w:t>Se pide aprobar el mismo corte (se arma a las 00:30; 01:00–05:00 a cero) en (a) Matriz Principal de Quilicura y (b) Bazar Gourmet de Kennedy. Con eso se proyectan 965 m³/mes adicionales ($1.351.560). Junto con el corte, activar los umbrales 24 h de este informe.</w:t>
+        <w:t>Se pide aprobar el mismo corte (se arma a las 00:30; 01:00–05:00 a cero) en (a) Matriz Principal de Quilicura y (b) Bazar Gourmet de Kennedy. Con eso se proyectan 1.508 m³/mes adicionales ($2.111.340). Junto con el corte, activar los umbrales 24 h de este informe.</w:t>
       </w:r>
     </w:p>
     <w:p>
@@ -1739,7 +1774,7 @@
           <w:color w:val="0D3B66"/>
           <w:sz w:val="22"/>
         </w:rPr>
-        <w:t>¿Cuánto se demuestra ya? 2.525 m³/mes ($3.535.560), MAE + Buenaventura. Casi todo es Estanque Sur + SI500 a cero en 01:00–05:00. Acumulado a 08/09: 6.617 m³ ($9.263.464).</w:t>
+        <w:t>¿Cuánto se demuestra ya? 2.825 m³/mes ($3.954.720), MAE + Buenaventura. Casi todo es Estanque Sur + SI500 a cero en 01:00–05:00. Acumulado a 08/09: 7.143 m³ ($10.000.130).</w:t>
       </w:r>
     </w:p>
     <w:p>
@@ -1754,7 +1789,7 @@
           <w:color w:val="0D3B66"/>
           <w:sz w:val="22"/>
         </w:rPr>
-        <w:t>¿Cuánto más si aprueban Quilicura y Kennedy? 965 m³/mes ($1.351.560), pasando esa misma ventana a cero. Suma total 3.491 m³/mes ($4.887.120).</w:t>
+        <w:t>¿Cuánto más si aprueban Quilicura y Kennedy? 1.508 m³/mes ($2.111.340), pasando esa misma ventana a cero. Suma total 4.333 m³/mes ($6.066.060).</w:t>
       </w:r>
     </w:p>
     <w:p>

</xml_diff>

<commit_message>
Add already-running night controls to the Parque Arauco savings brief.
Mirror the consolidado closing slide: operativo (Norte, Pizza Hut, SI500, Sur) and the same 00:30 cut proposed for Quilicura, Kennedy and El Bosque.

Co-authored-by: anibaloperacionesWes <anibaloperacionesWes@users.noreply.github.com>
</commit_message>
<xml_diff>
--- a/reports/Parque_Arauco/CONSOLIDADO/Informe_ahorro_PA_reunion_20260908.docx
+++ b/reports/Parque_Arauco/CONSOLIDADO/Informe_ahorro_PA_reunion_20260908.docx
@@ -1259,6 +1259,1393 @@
           <w:rFonts w:ascii="Calibri" w:hAnsi="Calibri"/>
           <w:color w:val="0D3B66"/>
         </w:rPr>
+        <w:t>Control nocturno ya operativo</w:t>
+      </w:r>
+    </w:p>
+    <w:p>
+      <w:pPr>
+        <w:spacing w:after="120" w:before="0" w:line="240" w:lineRule="auto"/>
+        <w:jc w:val="both"/>
+      </w:pPr>
+      <w:r>
+        <w:rPr>
+          <w:rFonts w:ascii="Calibri" w:hAnsi="Calibri"/>
+          <w:b w:val="0"/>
+          <w:color w:val="0D3B66"/>
+          <w:sz w:val="22"/>
+        </w:rPr>
+        <w:t>El corte se activa a las 00:30. De 01:00 a 05:00 el consumo quedó en cero. Estos son los controles que ya corren (los mismos de la última lámina del consolidado):</w:t>
+      </w:r>
+    </w:p>
+    <w:tbl>
+      <w:tblPr>
+        <w:tblStyle w:val="TableGrid"/>
+        <w:tblW w:type="dxa" w:w="9865"/>
+        <w:tblLayout w:type="fixed"/>
+        <w:tblLook w:firstColumn="1" w:firstRow="1" w:lastColumn="0" w:lastRow="0" w:noHBand="0" w:noVBand="1" w:val="04A0"/>
+        <w:tblLayout w:type="fixed"/>
+      </w:tblPr>
+      <w:tblGrid>
+        <w:gridCol w:w="2040"/>
+        <w:gridCol w:w="2040"/>
+        <w:gridCol w:w="2040"/>
+        <w:gridCol w:w="2040"/>
+        <w:gridCol w:w="2040"/>
+      </w:tblGrid>
+      <w:tr>
+        <w:trPr>
+          <w:cantSplit/>
+        </w:trPr>
+        <w:tc>
+          <w:tcPr>
+            <w:tcW w:type="dxa" w:w="2608"/>
+            <w:shd w:fill="0D3B66" w:val="clear"/>
+          </w:tcPr>
+          <w:p>
+            <w:pPr>
+              <w:spacing w:before="20" w:after="20"/>
+            </w:pPr>
+            <w:r/>
+            <w:r>
+              <w:rPr>
+                <w:rFonts w:ascii="Calibri" w:hAnsi="Calibri"/>
+                <w:b/>
+                <w:color w:val="FFFFFF"/>
+                <w:sz w:val="16"/>
+              </w:rPr>
+              <w:t>Punto</w:t>
+            </w:r>
+          </w:p>
+        </w:tc>
+        <w:tc>
+          <w:tcPr>
+            <w:tcW w:type="dxa" w:w="907"/>
+            <w:shd w:fill="0D3B66" w:val="clear"/>
+          </w:tcPr>
+          <w:p>
+            <w:pPr>
+              <w:spacing w:before="20" w:after="20"/>
+            </w:pPr>
+            <w:r/>
+            <w:r>
+              <w:rPr>
+                <w:rFonts w:ascii="Calibri" w:hAnsi="Calibri"/>
+                <w:b/>
+                <w:color w:val="FFFFFF"/>
+                <w:sz w:val="16"/>
+              </w:rPr>
+              <w:t>Desde</w:t>
+            </w:r>
+          </w:p>
+        </w:tc>
+        <w:tc>
+          <w:tcPr>
+            <w:tcW w:type="dxa" w:w="3515"/>
+            <w:shd w:fill="0D3B66" w:val="clear"/>
+          </w:tcPr>
+          <w:p>
+            <w:pPr>
+              <w:spacing w:before="20" w:after="20"/>
+            </w:pPr>
+            <w:r/>
+            <w:r>
+              <w:rPr>
+                <w:rFonts w:ascii="Calibri" w:hAnsi="Calibri"/>
+                <w:b/>
+                <w:color w:val="FFFFFF"/>
+                <w:sz w:val="16"/>
+              </w:rPr>
+              <w:t>Control nocturno</w:t>
+            </w:r>
+          </w:p>
+        </w:tc>
+        <w:tc>
+          <w:tcPr>
+            <w:tcW w:type="dxa" w:w="1361"/>
+            <w:shd w:fill="0D3B66" w:val="clear"/>
+          </w:tcPr>
+          <w:p>
+            <w:pPr>
+              <w:spacing w:before="20" w:after="20"/>
+            </w:pPr>
+            <w:r/>
+            <w:r>
+              <w:rPr>
+                <w:rFonts w:ascii="Calibri" w:hAnsi="Calibri"/>
+                <w:b/>
+                <w:color w:val="FFFFFF"/>
+                <w:sz w:val="16"/>
+              </w:rPr>
+              <w:t>m³/mes</w:t>
+            </w:r>
+          </w:p>
+        </w:tc>
+        <w:tc>
+          <w:tcPr>
+            <w:tcW w:type="dxa" w:w="1474"/>
+            <w:shd w:fill="0D3B66" w:val="clear"/>
+          </w:tcPr>
+          <w:p>
+            <w:pPr>
+              <w:spacing w:before="20" w:after="20"/>
+            </w:pPr>
+            <w:r/>
+            <w:r>
+              <w:rPr>
+                <w:rFonts w:ascii="Calibri" w:hAnsi="Calibri"/>
+                <w:b/>
+                <w:color w:val="FFFFFF"/>
+                <w:sz w:val="16"/>
+              </w:rPr>
+              <w:t>$/mes</w:t>
+            </w:r>
+          </w:p>
+        </w:tc>
+      </w:tr>
+      <w:tr>
+        <w:trPr>
+          <w:cantSplit/>
+        </w:trPr>
+        <w:tc>
+          <w:tcPr>
+            <w:tcW w:type="dxa" w:w="2608"/>
+          </w:tcPr>
+          <w:p>
+            <w:pPr>
+              <w:spacing w:before="20" w:after="20"/>
+            </w:pPr>
+            <w:r/>
+            <w:r>
+              <w:rPr>
+                <w:rFonts w:ascii="Calibri" w:hAnsi="Calibri"/>
+                <w:b/>
+                <w:color w:val="0D3B66"/>
+                <w:sz w:val="16"/>
+              </w:rPr>
+              <w:t>MAE Estanque Norte</w:t>
+            </w:r>
+          </w:p>
+        </w:tc>
+        <w:tc>
+          <w:tcPr>
+            <w:tcW w:type="dxa" w:w="907"/>
+          </w:tcPr>
+          <w:p>
+            <w:pPr>
+              <w:spacing w:before="20" w:after="20"/>
+            </w:pPr>
+            <w:r/>
+            <w:r>
+              <w:rPr>
+                <w:rFonts w:ascii="Calibri" w:hAnsi="Calibri"/>
+                <w:b w:val="0"/>
+                <w:color w:val="0D3B66"/>
+                <w:sz w:val="16"/>
+              </w:rPr>
+              <w:t>05/08</w:t>
+            </w:r>
+          </w:p>
+        </w:tc>
+        <w:tc>
+          <w:tcPr>
+            <w:tcW w:type="dxa" w:w="3515"/>
+          </w:tcPr>
+          <w:p>
+            <w:pPr>
+              <w:spacing w:before="20" w:after="20"/>
+            </w:pPr>
+            <w:r/>
+            <w:r>
+              <w:rPr>
+                <w:rFonts w:ascii="Calibri" w:hAnsi="Calibri"/>
+                <w:b w:val="0"/>
+                <w:color w:val="0D3B66"/>
+                <w:sz w:val="16"/>
+              </w:rPr>
+              <w:t>4,8 → 0 m³ desde las 00:30 (01:00–05:00 en cero)</w:t>
+            </w:r>
+          </w:p>
+        </w:tc>
+        <w:tc>
+          <w:tcPr>
+            <w:tcW w:type="dxa" w:w="1361"/>
+          </w:tcPr>
+          <w:p>
+            <w:pPr>
+              <w:spacing w:before="20" w:after="20"/>
+            </w:pPr>
+            <w:r/>
+            <w:r>
+              <w:rPr>
+                <w:rFonts w:ascii="Calibri" w:hAnsi="Calibri"/>
+                <w:b w:val="0"/>
+                <w:color w:val="0D3B66"/>
+                <w:sz w:val="16"/>
+              </w:rPr>
+              <w:t>113</w:t>
+            </w:r>
+          </w:p>
+        </w:tc>
+        <w:tc>
+          <w:tcPr>
+            <w:tcW w:type="dxa" w:w="1474"/>
+          </w:tcPr>
+          <w:p>
+            <w:pPr>
+              <w:spacing w:before="20" w:after="20"/>
+            </w:pPr>
+            <w:r/>
+            <w:r>
+              <w:rPr>
+                <w:rFonts w:ascii="Calibri" w:hAnsi="Calibri"/>
+                <w:b w:val="0"/>
+                <w:color w:val="0D3B66"/>
+                <w:sz w:val="16"/>
+              </w:rPr>
+              <w:t>$157.920</w:t>
+            </w:r>
+          </w:p>
+        </w:tc>
+      </w:tr>
+      <w:tr>
+        <w:trPr>
+          <w:cantSplit/>
+        </w:trPr>
+        <w:tc>
+          <w:tcPr>
+            <w:tcW w:type="dxa" w:w="2608"/>
+            <w:shd w:fill="F4F7FA" w:val="clear"/>
+          </w:tcPr>
+          <w:p>
+            <w:pPr>
+              <w:spacing w:before="20" w:after="20"/>
+            </w:pPr>
+            <w:r/>
+            <w:r>
+              <w:rPr>
+                <w:rFonts w:ascii="Calibri" w:hAnsi="Calibri"/>
+                <w:b/>
+                <w:color w:val="0D3B66"/>
+                <w:sz w:val="16"/>
+              </w:rPr>
+              <w:t>MAE Pizza Hut</w:t>
+            </w:r>
+          </w:p>
+        </w:tc>
+        <w:tc>
+          <w:tcPr>
+            <w:tcW w:type="dxa" w:w="907"/>
+            <w:shd w:fill="F4F7FA" w:val="clear"/>
+          </w:tcPr>
+          <w:p>
+            <w:pPr>
+              <w:spacing w:before="20" w:after="20"/>
+            </w:pPr>
+            <w:r/>
+            <w:r>
+              <w:rPr>
+                <w:rFonts w:ascii="Calibri" w:hAnsi="Calibri"/>
+                <w:b w:val="0"/>
+                <w:color w:val="0D3B66"/>
+                <w:sz w:val="16"/>
+              </w:rPr>
+              <w:t>01/07</w:t>
+            </w:r>
+          </w:p>
+        </w:tc>
+        <w:tc>
+          <w:tcPr>
+            <w:tcW w:type="dxa" w:w="3515"/>
+            <w:shd w:fill="F4F7FA" w:val="clear"/>
+          </w:tcPr>
+          <w:p>
+            <w:pPr>
+              <w:spacing w:before="20" w:after="20"/>
+            </w:pPr>
+            <w:r/>
+            <w:r>
+              <w:rPr>
+                <w:rFonts w:ascii="Calibri" w:hAnsi="Calibri"/>
+                <w:b w:val="0"/>
+                <w:color w:val="0D3B66"/>
+                <w:sz w:val="16"/>
+              </w:rPr>
+              <w:t>01:00–05:00 ya en cero; el control está puesto, no suma m³ extra</w:t>
+            </w:r>
+          </w:p>
+        </w:tc>
+        <w:tc>
+          <w:tcPr>
+            <w:tcW w:type="dxa" w:w="1361"/>
+            <w:shd w:fill="F4F7FA" w:val="clear"/>
+          </w:tcPr>
+          <w:p>
+            <w:pPr>
+              <w:spacing w:before="20" w:after="20"/>
+            </w:pPr>
+            <w:r/>
+            <w:r>
+              <w:rPr>
+                <w:rFonts w:ascii="Calibri" w:hAnsi="Calibri"/>
+                <w:b w:val="0"/>
+                <w:color w:val="0D3B66"/>
+                <w:sz w:val="16"/>
+              </w:rPr>
+              <w:t>—</w:t>
+            </w:r>
+          </w:p>
+        </w:tc>
+        <w:tc>
+          <w:tcPr>
+            <w:tcW w:type="dxa" w:w="1474"/>
+            <w:shd w:fill="F4F7FA" w:val="clear"/>
+          </w:tcPr>
+          <w:p>
+            <w:pPr>
+              <w:spacing w:before="20" w:after="20"/>
+            </w:pPr>
+            <w:r/>
+            <w:r>
+              <w:rPr>
+                <w:rFonts w:ascii="Calibri" w:hAnsi="Calibri"/>
+                <w:b w:val="0"/>
+                <w:color w:val="0D3B66"/>
+                <w:sz w:val="16"/>
+              </w:rPr>
+              <w:t>—</w:t>
+            </w:r>
+          </w:p>
+        </w:tc>
+      </w:tr>
+      <w:tr>
+        <w:trPr>
+          <w:cantSplit/>
+        </w:trPr>
+        <w:tc>
+          <w:tcPr>
+            <w:tcW w:type="dxa" w:w="2608"/>
+          </w:tcPr>
+          <w:p>
+            <w:pPr>
+              <w:spacing w:before="20" w:after="20"/>
+            </w:pPr>
+            <w:r/>
+            <w:r>
+              <w:rPr>
+                <w:rFonts w:ascii="Calibri" w:hAnsi="Calibri"/>
+                <w:b/>
+                <w:color w:val="0D3B66"/>
+                <w:sz w:val="16"/>
+              </w:rPr>
+              <w:t>BOM San Ignacio 500</w:t>
+            </w:r>
+          </w:p>
+        </w:tc>
+        <w:tc>
+          <w:tcPr>
+            <w:tcW w:type="dxa" w:w="907"/>
+          </w:tcPr>
+          <w:p>
+            <w:pPr>
+              <w:spacing w:before="20" w:after="20"/>
+            </w:pPr>
+            <w:r/>
+            <w:r>
+              <w:rPr>
+                <w:rFonts w:ascii="Calibri" w:hAnsi="Calibri"/>
+                <w:b w:val="0"/>
+                <w:color w:val="0D3B66"/>
+                <w:sz w:val="16"/>
+              </w:rPr>
+              <w:t>17/07</w:t>
+            </w:r>
+          </w:p>
+        </w:tc>
+        <w:tc>
+          <w:tcPr>
+            <w:tcW w:type="dxa" w:w="3515"/>
+          </w:tcPr>
+          <w:p>
+            <w:pPr>
+              <w:spacing w:before="20" w:after="20"/>
+            </w:pPr>
+            <w:r/>
+            <w:r>
+              <w:rPr>
+                <w:rFonts w:ascii="Calibri" w:hAnsi="Calibri"/>
+                <w:b w:val="0"/>
+                <w:color w:val="0D3B66"/>
+                <w:sz w:val="16"/>
+              </w:rPr>
+              <w:t>31,7 → 0 m³ desde las 00:30. El ~2 m³ de 00:00–00:30 no es noche</w:t>
+            </w:r>
+          </w:p>
+        </w:tc>
+        <w:tc>
+          <w:tcPr>
+            <w:tcW w:type="dxa" w:w="1361"/>
+          </w:tcPr>
+          <w:p>
+            <w:pPr>
+              <w:spacing w:before="20" w:after="20"/>
+            </w:pPr>
+            <w:r/>
+            <w:r>
+              <w:rPr>
+                <w:rFonts w:ascii="Calibri" w:hAnsi="Calibri"/>
+                <w:b w:val="0"/>
+                <w:color w:val="0D3B66"/>
+                <w:sz w:val="16"/>
+              </w:rPr>
+              <w:t>886</w:t>
+            </w:r>
+          </w:p>
+        </w:tc>
+        <w:tc>
+          <w:tcPr>
+            <w:tcW w:type="dxa" w:w="1474"/>
+          </w:tcPr>
+          <w:p>
+            <w:pPr>
+              <w:spacing w:before="20" w:after="20"/>
+            </w:pPr>
+            <w:r/>
+            <w:r>
+              <w:rPr>
+                <w:rFonts w:ascii="Calibri" w:hAnsi="Calibri"/>
+                <w:b w:val="0"/>
+                <w:color w:val="0D3B66"/>
+                <w:sz w:val="16"/>
+              </w:rPr>
+              <w:t>$1.241.100</w:t>
+            </w:r>
+          </w:p>
+        </w:tc>
+      </w:tr>
+      <w:tr>
+        <w:trPr>
+          <w:cantSplit/>
+        </w:trPr>
+        <w:tc>
+          <w:tcPr>
+            <w:tcW w:type="dxa" w:w="2608"/>
+            <w:shd w:fill="F4F7FA" w:val="clear"/>
+          </w:tcPr>
+          <w:p>
+            <w:pPr>
+              <w:spacing w:before="20" w:after="20"/>
+            </w:pPr>
+            <w:r/>
+            <w:r>
+              <w:rPr>
+                <w:rFonts w:ascii="Calibri" w:hAnsi="Calibri"/>
+                <w:b/>
+                <w:color w:val="0D3B66"/>
+                <w:sz w:val="16"/>
+              </w:rPr>
+              <w:t>MAE Estanque Sur</w:t>
+            </w:r>
+          </w:p>
+        </w:tc>
+        <w:tc>
+          <w:tcPr>
+            <w:tcW w:type="dxa" w:w="907"/>
+            <w:shd w:fill="F4F7FA" w:val="clear"/>
+          </w:tcPr>
+          <w:p>
+            <w:pPr>
+              <w:spacing w:before="20" w:after="20"/>
+            </w:pPr>
+            <w:r/>
+            <w:r>
+              <w:rPr>
+                <w:rFonts w:ascii="Calibri" w:hAnsi="Calibri"/>
+                <w:b w:val="0"/>
+                <w:color w:val="0D3B66"/>
+                <w:sz w:val="16"/>
+              </w:rPr>
+              <w:t>10/06</w:t>
+            </w:r>
+          </w:p>
+        </w:tc>
+        <w:tc>
+          <w:tcPr>
+            <w:tcW w:type="dxa" w:w="3515"/>
+            <w:shd w:fill="F4F7FA" w:val="clear"/>
+          </w:tcPr>
+          <w:p>
+            <w:pPr>
+              <w:spacing w:before="20" w:after="20"/>
+            </w:pPr>
+            <w:r/>
+            <w:r>
+              <w:rPr>
+                <w:rFonts w:ascii="Calibri" w:hAnsi="Calibri"/>
+                <w:b w:val="0"/>
+                <w:color w:val="0D3B66"/>
+                <w:sz w:val="16"/>
+              </w:rPr>
+              <w:t>No es on/off: presostatos. Día 88 → 28 m³</w:t>
+            </w:r>
+          </w:p>
+        </w:tc>
+        <w:tc>
+          <w:tcPr>
+            <w:tcW w:type="dxa" w:w="1361"/>
+            <w:shd w:fill="F4F7FA" w:val="clear"/>
+          </w:tcPr>
+          <w:p>
+            <w:pPr>
+              <w:spacing w:before="20" w:after="20"/>
+            </w:pPr>
+            <w:r/>
+            <w:r>
+              <w:rPr>
+                <w:rFonts w:ascii="Calibri" w:hAnsi="Calibri"/>
+                <w:b w:val="0"/>
+                <w:color w:val="0D3B66"/>
+                <w:sz w:val="16"/>
+              </w:rPr>
+              <w:t>1.826</w:t>
+            </w:r>
+          </w:p>
+        </w:tc>
+        <w:tc>
+          <w:tcPr>
+            <w:tcW w:type="dxa" w:w="1474"/>
+            <w:shd w:fill="F4F7FA" w:val="clear"/>
+          </w:tcPr>
+          <w:p>
+            <w:pPr>
+              <w:spacing w:before="20" w:after="20"/>
+            </w:pPr>
+            <w:r/>
+            <w:r>
+              <w:rPr>
+                <w:rFonts w:ascii="Calibri" w:hAnsi="Calibri"/>
+                <w:b w:val="0"/>
+                <w:color w:val="0D3B66"/>
+                <w:sz w:val="16"/>
+              </w:rPr>
+              <w:t>$2.555.700</w:t>
+            </w:r>
+          </w:p>
+        </w:tc>
+      </w:tr>
+      <w:tr>
+        <w:trPr>
+          <w:cantSplit/>
+        </w:trPr>
+        <w:tc>
+          <w:tcPr>
+            <w:tcW w:type="dxa" w:w="2608"/>
+            <w:shd w:fill="D9E1F2" w:val="clear"/>
+          </w:tcPr>
+          <w:p>
+            <w:pPr>
+              <w:spacing w:before="20" w:after="20"/>
+            </w:pPr>
+            <w:r/>
+            <w:r>
+              <w:rPr>
+                <w:rFonts w:ascii="Calibri" w:hAnsi="Calibri"/>
+                <w:b/>
+                <w:color w:val="0D3B66"/>
+                <w:sz w:val="16"/>
+              </w:rPr>
+              <w:t>Total ya operativo</w:t>
+            </w:r>
+          </w:p>
+        </w:tc>
+        <w:tc>
+          <w:tcPr>
+            <w:tcW w:type="dxa" w:w="907"/>
+            <w:shd w:fill="D9E1F2" w:val="clear"/>
+          </w:tcPr>
+          <w:p>
+            <w:pPr>
+              <w:spacing w:before="20" w:after="20"/>
+            </w:pPr>
+            <w:r/>
+            <w:r>
+              <w:rPr>
+                <w:rFonts w:ascii="Calibri" w:hAnsi="Calibri"/>
+                <w:b/>
+                <w:color w:val="0D3B66"/>
+                <w:sz w:val="16"/>
+              </w:rPr>
+            </w:r>
+          </w:p>
+        </w:tc>
+        <w:tc>
+          <w:tcPr>
+            <w:tcW w:type="dxa" w:w="3515"/>
+            <w:shd w:fill="D9E1F2" w:val="clear"/>
+          </w:tcPr>
+          <w:p>
+            <w:pPr>
+              <w:spacing w:before="20" w:after="20"/>
+            </w:pPr>
+            <w:r/>
+            <w:r>
+              <w:rPr>
+                <w:rFonts w:ascii="Calibri" w:hAnsi="Calibri"/>
+                <w:b/>
+                <w:color w:val="0D3B66"/>
+                <w:sz w:val="16"/>
+              </w:rPr>
+              <w:t>MAE + Buenaventura</w:t>
+            </w:r>
+          </w:p>
+        </w:tc>
+        <w:tc>
+          <w:tcPr>
+            <w:tcW w:type="dxa" w:w="1361"/>
+            <w:shd w:fill="D9E1F2" w:val="clear"/>
+          </w:tcPr>
+          <w:p>
+            <w:pPr>
+              <w:spacing w:before="20" w:after="20"/>
+            </w:pPr>
+            <w:r/>
+            <w:r>
+              <w:rPr>
+                <w:rFonts w:ascii="Calibri" w:hAnsi="Calibri"/>
+                <w:b/>
+                <w:color w:val="0D3B66"/>
+                <w:sz w:val="16"/>
+              </w:rPr>
+              <w:t>2.825</w:t>
+            </w:r>
+          </w:p>
+        </w:tc>
+        <w:tc>
+          <w:tcPr>
+            <w:tcW w:type="dxa" w:w="1474"/>
+            <w:shd w:fill="D9E1F2" w:val="clear"/>
+          </w:tcPr>
+          <w:p>
+            <w:pPr>
+              <w:spacing w:before="20" w:after="20"/>
+            </w:pPr>
+            <w:r/>
+            <w:r>
+              <w:rPr>
+                <w:rFonts w:ascii="Calibri" w:hAnsi="Calibri"/>
+                <w:b/>
+                <w:color w:val="0D3B66"/>
+                <w:sz w:val="16"/>
+              </w:rPr>
+              <w:t>$3.954.720</w:t>
+            </w:r>
+          </w:p>
+        </w:tc>
+      </w:tr>
+    </w:tbl>
+    <w:p/>
+    <w:p>
+      <w:pPr>
+        <w:pStyle w:val="Heading1"/>
+      </w:pPr>
+      <w:r>
+        <w:rPr>
+          <w:rFonts w:ascii="Calibri" w:hAnsi="Calibri"/>
+          <w:color w:val="0D3B66"/>
+        </w:rPr>
+        <w:t>A proponer — mismo corte 00:30</w:t>
+      </w:r>
+    </w:p>
+    <w:p>
+      <w:pPr>
+        <w:spacing w:after="120" w:before="0" w:line="240" w:lineRule="auto"/>
+        <w:jc w:val="both"/>
+      </w:pPr>
+      <w:r>
+        <w:rPr>
+          <w:rFonts w:ascii="Calibri" w:hAnsi="Calibri"/>
+          <w:b w:val="0"/>
+          <w:color w:val="0D3B66"/>
+          <w:sz w:val="22"/>
+        </w:rPr>
+        <w:t>Copiar el on/off que ya corre en Norte y SI500. Meta: esa noche a cero.</w:t>
+      </w:r>
+    </w:p>
+    <w:tbl>
+      <w:tblPr>
+        <w:tblStyle w:val="TableGrid"/>
+        <w:tblW w:type="dxa" w:w="9865"/>
+        <w:tblLayout w:type="fixed"/>
+        <w:tblLook w:firstColumn="1" w:firstRow="1" w:lastColumn="0" w:lastRow="0" w:noHBand="0" w:noVBand="1" w:val="04A0"/>
+        <w:tblLayout w:type="fixed"/>
+      </w:tblPr>
+      <w:tblGrid>
+        <w:gridCol w:w="2040"/>
+        <w:gridCol w:w="2040"/>
+        <w:gridCol w:w="2040"/>
+        <w:gridCol w:w="2040"/>
+        <w:gridCol w:w="2040"/>
+      </w:tblGrid>
+      <w:tr>
+        <w:trPr>
+          <w:cantSplit/>
+        </w:trPr>
+        <w:tc>
+          <w:tcPr>
+            <w:tcW w:type="dxa" w:w="2608"/>
+            <w:shd w:fill="0D3B66" w:val="clear"/>
+          </w:tcPr>
+          <w:p>
+            <w:pPr>
+              <w:spacing w:before="20" w:after="20"/>
+            </w:pPr>
+            <w:r/>
+            <w:r>
+              <w:rPr>
+                <w:rFonts w:ascii="Calibri" w:hAnsi="Calibri"/>
+                <w:b/>
+                <w:color w:val="FFFFFF"/>
+                <w:sz w:val="16"/>
+              </w:rPr>
+              <w:t>Punto</w:t>
+            </w:r>
+          </w:p>
+        </w:tc>
+        <w:tc>
+          <w:tcPr>
+            <w:tcW w:type="dxa" w:w="1587"/>
+            <w:shd w:fill="0D3B66" w:val="clear"/>
+          </w:tcPr>
+          <w:p>
+            <w:pPr>
+              <w:spacing w:before="20" w:after="20"/>
+            </w:pPr>
+            <w:r/>
+            <w:r>
+              <w:rPr>
+                <w:rFonts w:ascii="Calibri" w:hAnsi="Calibri"/>
+                <w:b/>
+                <w:color w:val="FFFFFF"/>
+                <w:sz w:val="16"/>
+              </w:rPr>
+              <w:t>Acción</w:t>
+            </w:r>
+          </w:p>
+        </w:tc>
+        <w:tc>
+          <w:tcPr>
+            <w:tcW w:type="dxa" w:w="2835"/>
+            <w:shd w:fill="0D3B66" w:val="clear"/>
+          </w:tcPr>
+          <w:p>
+            <w:pPr>
+              <w:spacing w:before="20" w:after="20"/>
+            </w:pPr>
+            <w:r/>
+            <w:r>
+              <w:rPr>
+                <w:rFonts w:ascii="Calibri" w:hAnsi="Calibri"/>
+                <w:b/>
+                <w:color w:val="FFFFFF"/>
+                <w:sz w:val="16"/>
+              </w:rPr>
+              <w:t>Noche → cero</w:t>
+            </w:r>
+          </w:p>
+        </w:tc>
+        <w:tc>
+          <w:tcPr>
+            <w:tcW w:type="dxa" w:w="1361"/>
+            <w:shd w:fill="0D3B66" w:val="clear"/>
+          </w:tcPr>
+          <w:p>
+            <w:pPr>
+              <w:spacing w:before="20" w:after="20"/>
+            </w:pPr>
+            <w:r/>
+            <w:r>
+              <w:rPr>
+                <w:rFonts w:ascii="Calibri" w:hAnsi="Calibri"/>
+                <w:b/>
+                <w:color w:val="FFFFFF"/>
+                <w:sz w:val="16"/>
+              </w:rPr>
+              <w:t>m³/mes</w:t>
+            </w:r>
+          </w:p>
+        </w:tc>
+        <w:tc>
+          <w:tcPr>
+            <w:tcW w:type="dxa" w:w="1474"/>
+            <w:shd w:fill="0D3B66" w:val="clear"/>
+          </w:tcPr>
+          <w:p>
+            <w:pPr>
+              <w:spacing w:before="20" w:after="20"/>
+            </w:pPr>
+            <w:r/>
+            <w:r>
+              <w:rPr>
+                <w:rFonts w:ascii="Calibri" w:hAnsi="Calibri"/>
+                <w:b/>
+                <w:color w:val="FFFFFF"/>
+                <w:sz w:val="16"/>
+              </w:rPr>
+              <w:t>$/mes</w:t>
+            </w:r>
+          </w:p>
+        </w:tc>
+      </w:tr>
+      <w:tr>
+        <w:trPr>
+          <w:cantSplit/>
+        </w:trPr>
+        <w:tc>
+          <w:tcPr>
+            <w:tcW w:type="dxa" w:w="2608"/>
+          </w:tcPr>
+          <w:p>
+            <w:pPr>
+              <w:spacing w:before="20" w:after="20"/>
+            </w:pPr>
+            <w:r/>
+            <w:r>
+              <w:rPr>
+                <w:rFonts w:ascii="Calibri" w:hAnsi="Calibri"/>
+                <w:b/>
+                <w:color w:val="0D3B66"/>
+                <w:sz w:val="16"/>
+              </w:rPr>
+              <w:t>MAQ Matriz Principal</w:t>
+            </w:r>
+          </w:p>
+        </w:tc>
+        <w:tc>
+          <w:tcPr>
+            <w:tcW w:type="dxa" w:w="1587"/>
+          </w:tcPr>
+          <w:p>
+            <w:pPr>
+              <w:spacing w:before="20" w:after="20"/>
+            </w:pPr>
+            <w:r/>
+            <w:r>
+              <w:rPr>
+                <w:rFonts w:ascii="Calibri" w:hAnsi="Calibri"/>
+                <w:b w:val="0"/>
+                <w:color w:val="0D3B66"/>
+                <w:sz w:val="16"/>
+              </w:rPr>
+              <w:t>On/off 00:30</w:t>
+            </w:r>
+          </w:p>
+        </w:tc>
+        <w:tc>
+          <w:tcPr>
+            <w:tcW w:type="dxa" w:w="2835"/>
+          </w:tcPr>
+          <w:p>
+            <w:pPr>
+              <w:spacing w:before="20" w:after="20"/>
+            </w:pPr>
+            <w:r/>
+            <w:r>
+              <w:rPr>
+                <w:rFonts w:ascii="Calibri" w:hAnsi="Calibri"/>
+                <w:b w:val="0"/>
+                <w:color w:val="0D3B66"/>
+                <w:sz w:val="16"/>
+              </w:rPr>
+              <w:t>21,1 m³ → 0  ·  umbral 240 m³/día</w:t>
+            </w:r>
+          </w:p>
+        </w:tc>
+        <w:tc>
+          <w:tcPr>
+            <w:tcW w:type="dxa" w:w="1361"/>
+          </w:tcPr>
+          <w:p>
+            <w:pPr>
+              <w:spacing w:before="20" w:after="20"/>
+            </w:pPr>
+            <w:r/>
+            <w:r>
+              <w:rPr>
+                <w:rFonts w:ascii="Calibri" w:hAnsi="Calibri"/>
+                <w:b w:val="0"/>
+                <w:color w:val="0D3B66"/>
+                <w:sz w:val="16"/>
+              </w:rPr>
+              <w:t>634</w:t>
+            </w:r>
+          </w:p>
+        </w:tc>
+        <w:tc>
+          <w:tcPr>
+            <w:tcW w:type="dxa" w:w="1474"/>
+          </w:tcPr>
+          <w:p>
+            <w:pPr>
+              <w:spacing w:before="20" w:after="20"/>
+            </w:pPr>
+            <w:r/>
+            <w:r>
+              <w:rPr>
+                <w:rFonts w:ascii="Calibri" w:hAnsi="Calibri"/>
+                <w:b w:val="0"/>
+                <w:color w:val="0D3B66"/>
+                <w:sz w:val="16"/>
+              </w:rPr>
+              <w:t>$887.040</w:t>
+            </w:r>
+          </w:p>
+        </w:tc>
+      </w:tr>
+      <w:tr>
+        <w:trPr>
+          <w:cantSplit/>
+        </w:trPr>
+        <w:tc>
+          <w:tcPr>
+            <w:tcW w:type="dxa" w:w="2608"/>
+            <w:shd w:fill="F4F7FA" w:val="clear"/>
+          </w:tcPr>
+          <w:p>
+            <w:pPr>
+              <w:spacing w:before="20" w:after="20"/>
+            </w:pPr>
+            <w:r/>
+            <w:r>
+              <w:rPr>
+                <w:rFonts w:ascii="Calibri" w:hAnsi="Calibri"/>
+                <w:b/>
+                <w:color w:val="0D3B66"/>
+                <w:sz w:val="16"/>
+              </w:rPr>
+              <w:t>PAK Bazar Gourmet</w:t>
+            </w:r>
+          </w:p>
+        </w:tc>
+        <w:tc>
+          <w:tcPr>
+            <w:tcW w:type="dxa" w:w="1587"/>
+            <w:shd w:fill="F4F7FA" w:val="clear"/>
+          </w:tcPr>
+          <w:p>
+            <w:pPr>
+              <w:spacing w:before="20" w:after="20"/>
+            </w:pPr>
+            <w:r/>
+            <w:r>
+              <w:rPr>
+                <w:rFonts w:ascii="Calibri" w:hAnsi="Calibri"/>
+                <w:b w:val="0"/>
+                <w:color w:val="0D3B66"/>
+                <w:sz w:val="16"/>
+              </w:rPr>
+              <w:t>On/off 00:30 (no las Sandías)</w:t>
+            </w:r>
+          </w:p>
+        </w:tc>
+        <w:tc>
+          <w:tcPr>
+            <w:tcW w:type="dxa" w:w="2835"/>
+            <w:shd w:fill="F4F7FA" w:val="clear"/>
+          </w:tcPr>
+          <w:p>
+            <w:pPr>
+              <w:spacing w:before="20" w:after="20"/>
+            </w:pPr>
+            <w:r/>
+            <w:r>
+              <w:rPr>
+                <w:rFonts w:ascii="Calibri" w:hAnsi="Calibri"/>
+                <w:b w:val="0"/>
+                <w:color w:val="0D3B66"/>
+                <w:sz w:val="16"/>
+              </w:rPr>
+              <w:t>29,1 m³ → 0  ·  umbrales DL 390 · Bazar 250 · DL Kennedy 20</w:t>
+            </w:r>
+          </w:p>
+        </w:tc>
+        <w:tc>
+          <w:tcPr>
+            <w:tcW w:type="dxa" w:w="1361"/>
+            <w:shd w:fill="F4F7FA" w:val="clear"/>
+          </w:tcPr>
+          <w:p>
+            <w:pPr>
+              <w:spacing w:before="20" w:after="20"/>
+            </w:pPr>
+            <w:r/>
+            <w:r>
+              <w:rPr>
+                <w:rFonts w:ascii="Calibri" w:hAnsi="Calibri"/>
+                <w:b w:val="0"/>
+                <w:color w:val="0D3B66"/>
+                <w:sz w:val="16"/>
+              </w:rPr>
+              <w:t>874</w:t>
+            </w:r>
+          </w:p>
+        </w:tc>
+        <w:tc>
+          <w:tcPr>
+            <w:tcW w:type="dxa" w:w="1474"/>
+            <w:shd w:fill="F4F7FA" w:val="clear"/>
+          </w:tcPr>
+          <w:p>
+            <w:pPr>
+              <w:spacing w:before="20" w:after="20"/>
+            </w:pPr>
+            <w:r/>
+            <w:r>
+              <w:rPr>
+                <w:rFonts w:ascii="Calibri" w:hAnsi="Calibri"/>
+                <w:b w:val="0"/>
+                <w:color w:val="0D3B66"/>
+                <w:sz w:val="16"/>
+              </w:rPr>
+              <w:t>$1.224.300</w:t>
+            </w:r>
+          </w:p>
+        </w:tc>
+      </w:tr>
+      <w:tr>
+        <w:trPr>
+          <w:cantSplit/>
+        </w:trPr>
+        <w:tc>
+          <w:tcPr>
+            <w:tcW w:type="dxa" w:w="2608"/>
+          </w:tcPr>
+          <w:p>
+            <w:pPr>
+              <w:spacing w:before="20" w:after="20"/>
+            </w:pPr>
+            <w:r/>
+            <w:r>
+              <w:rPr>
+                <w:rFonts w:ascii="Calibri" w:hAnsi="Calibri"/>
+                <w:b/>
+                <w:color w:val="0D3B66"/>
+                <w:sz w:val="16"/>
+              </w:rPr>
+              <w:t>AEB Anillo Plaza y Matriz 1° piso</w:t>
+            </w:r>
+          </w:p>
+        </w:tc>
+        <w:tc>
+          <w:tcPr>
+            <w:tcW w:type="dxa" w:w="1587"/>
+          </w:tcPr>
+          <w:p>
+            <w:pPr>
+              <w:spacing w:before="20" w:after="20"/>
+            </w:pPr>
+            <w:r/>
+            <w:r>
+              <w:rPr>
+                <w:rFonts w:ascii="Calibri" w:hAnsi="Calibri"/>
+                <w:b w:val="0"/>
+                <w:color w:val="0D3B66"/>
+                <w:sz w:val="16"/>
+              </w:rPr>
+              <w:t>On/off 00:30</w:t>
+            </w:r>
+          </w:p>
+        </w:tc>
+        <w:tc>
+          <w:tcPr>
+            <w:tcW w:type="dxa" w:w="2835"/>
+          </w:tcPr>
+          <w:p>
+            <w:pPr>
+              <w:spacing w:before="20" w:after="20"/>
+            </w:pPr>
+            <w:r/>
+            <w:r>
+              <w:rPr>
+                <w:rFonts w:ascii="Calibri" w:hAnsi="Calibri"/>
+                <w:b w:val="0"/>
+                <w:color w:val="0D3B66"/>
+                <w:sz w:val="16"/>
+              </w:rPr>
+              <w:t>Umbrales 24 h: Anillo 22 · Matriz 75 m³/día</w:t>
+            </w:r>
+          </w:p>
+        </w:tc>
+        <w:tc>
+          <w:tcPr>
+            <w:tcW w:type="dxa" w:w="1361"/>
+          </w:tcPr>
+          <w:p>
+            <w:pPr>
+              <w:spacing w:before="20" w:after="20"/>
+            </w:pPr>
+            <w:r/>
+            <w:r>
+              <w:rPr>
+                <w:rFonts w:ascii="Calibri" w:hAnsi="Calibri"/>
+                <w:b w:val="0"/>
+                <w:color w:val="0D3B66"/>
+                <w:sz w:val="16"/>
+              </w:rPr>
+              <w:t>A definir</w:t>
+            </w:r>
+          </w:p>
+        </w:tc>
+        <w:tc>
+          <w:tcPr>
+            <w:tcW w:type="dxa" w:w="1474"/>
+          </w:tcPr>
+          <w:p>
+            <w:pPr>
+              <w:spacing w:before="20" w:after="20"/>
+            </w:pPr>
+            <w:r/>
+            <w:r>
+              <w:rPr>
+                <w:rFonts w:ascii="Calibri" w:hAnsi="Calibri"/>
+                <w:b w:val="0"/>
+                <w:color w:val="0D3B66"/>
+                <w:sz w:val="16"/>
+              </w:rPr>
+              <w:t>—</w:t>
+            </w:r>
+          </w:p>
+        </w:tc>
+      </w:tr>
+      <w:tr>
+        <w:trPr>
+          <w:cantSplit/>
+        </w:trPr>
+        <w:tc>
+          <w:tcPr>
+            <w:tcW w:type="dxa" w:w="2608"/>
+            <w:shd w:fill="F4F7FA" w:val="clear"/>
+          </w:tcPr>
+          <w:p>
+            <w:pPr>
+              <w:spacing w:before="20" w:after="20"/>
+            </w:pPr>
+            <w:r/>
+            <w:r>
+              <w:rPr>
+                <w:rFonts w:ascii="Calibri" w:hAnsi="Calibri"/>
+                <w:b/>
+                <w:color w:val="0D3B66"/>
+                <w:sz w:val="16"/>
+              </w:rPr>
+              <w:t>MAM / CUR</w:t>
+            </w:r>
+          </w:p>
+        </w:tc>
+        <w:tc>
+          <w:tcPr>
+            <w:tcW w:type="dxa" w:w="1587"/>
+            <w:shd w:fill="F4F7FA" w:val="clear"/>
+          </w:tcPr>
+          <w:p>
+            <w:pPr>
+              <w:spacing w:before="20" w:after="20"/>
+            </w:pPr>
+            <w:r/>
+            <w:r>
+              <w:rPr>
+                <w:rFonts w:ascii="Calibri" w:hAnsi="Calibri"/>
+                <w:b w:val="0"/>
+                <w:color w:val="0D3B66"/>
+                <w:sz w:val="16"/>
+              </w:rPr>
+              <w:t>Sin on/off ahora</w:t>
+            </w:r>
+          </w:p>
+        </w:tc>
+        <w:tc>
+          <w:tcPr>
+            <w:tcW w:type="dxa" w:w="2835"/>
+            <w:shd w:fill="F4F7FA" w:val="clear"/>
+          </w:tcPr>
+          <w:p>
+            <w:pPr>
+              <w:spacing w:before="20" w:after="20"/>
+            </w:pPr>
+            <w:r/>
+            <w:r>
+              <w:rPr>
+                <w:rFonts w:ascii="Calibri" w:hAnsi="Calibri"/>
+                <w:b w:val="0"/>
+                <w:color w:val="0D3B66"/>
+                <w:sz w:val="16"/>
+              </w:rPr>
+              <w:t>Maipú: Arrow + punto 6. Curauma: noche chica (umbrales Sur 14 · Norte 13)</w:t>
+            </w:r>
+          </w:p>
+        </w:tc>
+        <w:tc>
+          <w:tcPr>
+            <w:tcW w:type="dxa" w:w="1361"/>
+            <w:shd w:fill="F4F7FA" w:val="clear"/>
+          </w:tcPr>
+          <w:p>
+            <w:pPr>
+              <w:spacing w:before="20" w:after="20"/>
+            </w:pPr>
+            <w:r/>
+            <w:r>
+              <w:rPr>
+                <w:rFonts w:ascii="Calibri" w:hAnsi="Calibri"/>
+                <w:b w:val="0"/>
+                <w:color w:val="0D3B66"/>
+                <w:sz w:val="16"/>
+              </w:rPr>
+              <w:t>—</w:t>
+            </w:r>
+          </w:p>
+        </w:tc>
+        <w:tc>
+          <w:tcPr>
+            <w:tcW w:type="dxa" w:w="1474"/>
+            <w:shd w:fill="F4F7FA" w:val="clear"/>
+          </w:tcPr>
+          <w:p>
+            <w:pPr>
+              <w:spacing w:before="20" w:after="20"/>
+            </w:pPr>
+            <w:r/>
+            <w:r>
+              <w:rPr>
+                <w:rFonts w:ascii="Calibri" w:hAnsi="Calibri"/>
+                <w:b w:val="0"/>
+                <w:color w:val="0D3B66"/>
+                <w:sz w:val="16"/>
+              </w:rPr>
+              <w:t>—</w:t>
+            </w:r>
+          </w:p>
+        </w:tc>
+      </w:tr>
+      <w:tr>
+        <w:trPr>
+          <w:cantSplit/>
+        </w:trPr>
+        <w:tc>
+          <w:tcPr>
+            <w:tcW w:type="dxa" w:w="2608"/>
+            <w:shd w:fill="D9E1F2" w:val="clear"/>
+          </w:tcPr>
+          <w:p>
+            <w:pPr>
+              <w:spacing w:before="20" w:after="20"/>
+            </w:pPr>
+            <w:r/>
+            <w:r>
+              <w:rPr>
+                <w:rFonts w:ascii="Calibri" w:hAnsi="Calibri"/>
+                <w:b/>
+                <w:color w:val="0D3B66"/>
+                <w:sz w:val="16"/>
+              </w:rPr>
+              <w:t>Total si se aprueban MAQ + PAK</w:t>
+            </w:r>
+          </w:p>
+        </w:tc>
+        <w:tc>
+          <w:tcPr>
+            <w:tcW w:type="dxa" w:w="1587"/>
+            <w:shd w:fill="D9E1F2" w:val="clear"/>
+          </w:tcPr>
+          <w:p>
+            <w:pPr>
+              <w:spacing w:before="20" w:after="20"/>
+            </w:pPr>
+            <w:r/>
+            <w:r>
+              <w:rPr>
+                <w:rFonts w:ascii="Calibri" w:hAnsi="Calibri"/>
+                <w:b/>
+                <w:color w:val="0D3B66"/>
+                <w:sz w:val="16"/>
+              </w:rPr>
+              <w:t>Logrado + propuesto</w:t>
+            </w:r>
+          </w:p>
+        </w:tc>
+        <w:tc>
+          <w:tcPr>
+            <w:tcW w:type="dxa" w:w="2835"/>
+            <w:shd w:fill="D9E1F2" w:val="clear"/>
+          </w:tcPr>
+          <w:p>
+            <w:pPr>
+              <w:spacing w:before="20" w:after="20"/>
+            </w:pPr>
+            <w:r/>
+            <w:r>
+              <w:rPr>
+                <w:rFonts w:ascii="Calibri" w:hAnsi="Calibri"/>
+                <w:b/>
+                <w:color w:val="0D3B66"/>
+                <w:sz w:val="16"/>
+              </w:rPr>
+              <w:t>Cuatro recintos con $ en esta tabla</w:t>
+            </w:r>
+          </w:p>
+        </w:tc>
+        <w:tc>
+          <w:tcPr>
+            <w:tcW w:type="dxa" w:w="1361"/>
+            <w:shd w:fill="D9E1F2" w:val="clear"/>
+          </w:tcPr>
+          <w:p>
+            <w:pPr>
+              <w:spacing w:before="20" w:after="20"/>
+            </w:pPr>
+            <w:r/>
+            <w:r>
+              <w:rPr>
+                <w:rFonts w:ascii="Calibri" w:hAnsi="Calibri"/>
+                <w:b/>
+                <w:color w:val="0D3B66"/>
+                <w:sz w:val="16"/>
+              </w:rPr>
+              <w:t>4.333</w:t>
+            </w:r>
+          </w:p>
+        </w:tc>
+        <w:tc>
+          <w:tcPr>
+            <w:tcW w:type="dxa" w:w="1474"/>
+            <w:shd w:fill="D9E1F2" w:val="clear"/>
+          </w:tcPr>
+          <w:p>
+            <w:pPr>
+              <w:spacing w:before="20" w:after="20"/>
+            </w:pPr>
+            <w:r/>
+            <w:r>
+              <w:rPr>
+                <w:rFonts w:ascii="Calibri" w:hAnsi="Calibri"/>
+                <w:b/>
+                <w:color w:val="0D3B66"/>
+                <w:sz w:val="16"/>
+              </w:rPr>
+              <w:t>$6.066.060</w:t>
+            </w:r>
+          </w:p>
+        </w:tc>
+      </w:tr>
+    </w:tbl>
+    <w:p/>
+    <w:p>
+      <w:pPr>
+        <w:pStyle w:val="Heading1"/>
+      </w:pPr>
+      <w:r>
+        <w:rPr>
+          <w:rFonts w:ascii="Calibri" w:hAnsi="Calibri"/>
+          <w:color w:val="0D3B66"/>
+        </w:rPr>
         <w:t>3. Mall Arauco Estación (MAE) — ahorro ya logrado</w:t>
       </w:r>
     </w:p>

</xml_diff>

<commit_message>
Regenerate PA meeting brief and consolidado with AEB and Falabella night savings.
El Bosque Matriz 1° piso and Maipú Falabella now carry m³/$ in the 00:30-to-zero simulation (205 and 249 m³/mes through 08/09/2026).

Co-authored-by: anibaloperacionesWes <anibaloperacionesWes@users.noreply.github.com>
</commit_message>
<xml_diff>
--- a/reports/Parque_Arauco/CONSOLIDADO/Informe_ahorro_PA_reunion_20260908.docx
+++ b/reports/Parque_Arauco/CONSOLIDADO/Informe_ahorro_PA_reunion_20260908.docx
@@ -135,7 +135,7 @@
           <w:color w:val="0D3B66"/>
           <w:sz w:val="22"/>
         </w:rPr>
-        <w:t>A copiar — Quilicura y Kennedy.</w:t>
+        <w:t>A copiar — Quilicura, Kennedy, El Bosque 1° piso y Falabella Maipú.</w:t>
       </w:r>
       <w:r>
         <w:rPr>
@@ -144,7 +144,7 @@
           <w:color w:val="0D3B66"/>
           <w:sz w:val="22"/>
         </w:rPr>
-        <w:t xml:space="preserve"> El mismo corte se propone en Matriz Principal y en Bazar Gourmet. Esa noche hoy no es cero; esa es la proyección.</w:t>
+        <w:t xml:space="preserve"> El mismo corte se propone en Matriz Principal, Bazar Gourmet, Matriz 1° piso de El Bosque y Falabella de Maipú (el mall sale por ahí desde el 15/08). Esa noche hoy no es cero; esa es la proyección.</w:t>
       </w:r>
     </w:p>
     <w:p>
@@ -159,7 +159,7 @@
           <w:color w:val="0D3B66"/>
           <w:sz w:val="22"/>
         </w:rPr>
-        <w:t>Pendiente — Maipú.</w:t>
+        <w:t>Pendiente — Maipú (puntos 6 y Arrow).</w:t>
       </w:r>
       <w:r>
         <w:rPr>
@@ -168,7 +168,7 @@
           <w:color w:val="0D3B66"/>
           <w:sz w:val="22"/>
         </w:rPr>
-        <w:t xml:space="preserve"> No hay on/off que sumar todavía. Estamos a la espera de concretar la relocalización de Pasillo 1 Arrow y la instalación del punto 6 (Pasillo 2), según la propuesta enviada a Don Miguel.</w:t>
+        <w:t xml:space="preserve"> El on/off de Falabella sí entra en la simulación. Sigue pendiente concretar la relocalización de Pasillo 1 Arrow y la instalación del punto 6 (Pasillo 2), según la propuesta enviada a Don Miguel.</w:t>
       </w:r>
     </w:p>
     <w:p>
@@ -965,6 +965,221 @@
         <w:tc>
           <w:tcPr>
             <w:tcW w:type="dxa" w:w="3061"/>
+          </w:tcPr>
+          <w:p>
+            <w:pPr>
+              <w:spacing w:before="20" w:after="20"/>
+            </w:pPr>
+            <w:r/>
+            <w:r>
+              <w:rPr>
+                <w:rFonts w:ascii="Calibri" w:hAnsi="Calibri"/>
+                <w:b/>
+                <w:color w:val="0D3B66"/>
+                <w:sz w:val="16"/>
+              </w:rPr>
+              <w:t>El Bosque Matriz 1° piso</w:t>
+            </w:r>
+          </w:p>
+        </w:tc>
+        <w:tc>
+          <w:tcPr>
+            <w:tcW w:type="dxa" w:w="1474"/>
+          </w:tcPr>
+          <w:p>
+            <w:pPr>
+              <w:spacing w:before="20" w:after="20"/>
+            </w:pPr>
+            <w:r/>
+            <w:r>
+              <w:rPr>
+                <w:rFonts w:ascii="Calibri" w:hAnsi="Calibri"/>
+                <w:b w:val="0"/>
+                <w:color w:val="0D3B66"/>
+                <w:sz w:val="16"/>
+              </w:rPr>
+              <w:t>Propuesta</w:t>
+            </w:r>
+          </w:p>
+        </w:tc>
+        <w:tc>
+          <w:tcPr>
+            <w:tcW w:type="dxa" w:w="2381"/>
+          </w:tcPr>
+          <w:p>
+            <w:pPr>
+              <w:spacing w:before="20" w:after="20"/>
+            </w:pPr>
+            <w:r/>
+            <w:r>
+              <w:rPr>
+                <w:rFonts w:ascii="Calibri" w:hAnsi="Calibri"/>
+                <w:b w:val="0"/>
+                <w:color w:val="0D3B66"/>
+                <w:sz w:val="16"/>
+              </w:rPr>
+              <w:t>6,8 m³ → 0 desde 00:30</w:t>
+            </w:r>
+          </w:p>
+        </w:tc>
+        <w:tc>
+          <w:tcPr>
+            <w:tcW w:type="dxa" w:w="1361"/>
+          </w:tcPr>
+          <w:p>
+            <w:pPr>
+              <w:spacing w:before="20" w:after="20"/>
+            </w:pPr>
+            <w:r/>
+            <w:r>
+              <w:rPr>
+                <w:rFonts w:ascii="Calibri" w:hAnsi="Calibri"/>
+                <w:b w:val="0"/>
+                <w:color w:val="0D3B66"/>
+                <w:sz w:val="16"/>
+              </w:rPr>
+              <w:t>205</w:t>
+            </w:r>
+          </w:p>
+        </w:tc>
+        <w:tc>
+          <w:tcPr>
+            <w:tcW w:type="dxa" w:w="1587"/>
+          </w:tcPr>
+          <w:p>
+            <w:pPr>
+              <w:spacing w:before="20" w:after="20"/>
+            </w:pPr>
+            <w:r/>
+            <w:r>
+              <w:rPr>
+                <w:rFonts w:ascii="Calibri" w:hAnsi="Calibri"/>
+                <w:b w:val="0"/>
+                <w:color w:val="0D3B66"/>
+                <w:sz w:val="16"/>
+              </w:rPr>
+              <w:t>$286.860</w:t>
+            </w:r>
+          </w:p>
+        </w:tc>
+      </w:tr>
+      <w:tr>
+        <w:trPr>
+          <w:cantSplit/>
+        </w:trPr>
+        <w:tc>
+          <w:tcPr>
+            <w:tcW w:type="dxa" w:w="3061"/>
+            <w:shd w:fill="F4F7FA" w:val="clear"/>
+          </w:tcPr>
+          <w:p>
+            <w:pPr>
+              <w:spacing w:before="20" w:after="20"/>
+            </w:pPr>
+            <w:r/>
+            <w:r>
+              <w:rPr>
+                <w:rFonts w:ascii="Calibri" w:hAnsi="Calibri"/>
+                <w:b/>
+                <w:color w:val="0D3B66"/>
+                <w:sz w:val="16"/>
+              </w:rPr>
+              <w:t>Maipú Falabella</w:t>
+            </w:r>
+          </w:p>
+        </w:tc>
+        <w:tc>
+          <w:tcPr>
+            <w:tcW w:type="dxa" w:w="1474"/>
+            <w:shd w:fill="F4F7FA" w:val="clear"/>
+          </w:tcPr>
+          <w:p>
+            <w:pPr>
+              <w:spacing w:before="20" w:after="20"/>
+            </w:pPr>
+            <w:r/>
+            <w:r>
+              <w:rPr>
+                <w:rFonts w:ascii="Calibri" w:hAnsi="Calibri"/>
+                <w:b w:val="0"/>
+                <w:color w:val="0D3B66"/>
+                <w:sz w:val="16"/>
+              </w:rPr>
+              <w:t>Propuesta</w:t>
+            </w:r>
+          </w:p>
+        </w:tc>
+        <w:tc>
+          <w:tcPr>
+            <w:tcW w:type="dxa" w:w="2381"/>
+            <w:shd w:fill="F4F7FA" w:val="clear"/>
+          </w:tcPr>
+          <w:p>
+            <w:pPr>
+              <w:spacing w:before="20" w:after="20"/>
+            </w:pPr>
+            <w:r/>
+            <w:r>
+              <w:rPr>
+                <w:rFonts w:ascii="Calibri" w:hAnsi="Calibri"/>
+                <w:b w:val="0"/>
+                <w:color w:val="0D3B66"/>
+                <w:sz w:val="16"/>
+              </w:rPr>
+              <w:t>8,3 m³ → 0 desde 00:30</w:t>
+            </w:r>
+          </w:p>
+        </w:tc>
+        <w:tc>
+          <w:tcPr>
+            <w:tcW w:type="dxa" w:w="1361"/>
+            <w:shd w:fill="F4F7FA" w:val="clear"/>
+          </w:tcPr>
+          <w:p>
+            <w:pPr>
+              <w:spacing w:before="20" w:after="20"/>
+            </w:pPr>
+            <w:r/>
+            <w:r>
+              <w:rPr>
+                <w:rFonts w:ascii="Calibri" w:hAnsi="Calibri"/>
+                <w:b w:val="0"/>
+                <w:color w:val="0D3B66"/>
+                <w:sz w:val="16"/>
+              </w:rPr>
+              <w:t>249</w:t>
+            </w:r>
+          </w:p>
+        </w:tc>
+        <w:tc>
+          <w:tcPr>
+            <w:tcW w:type="dxa" w:w="1587"/>
+            <w:shd w:fill="F4F7FA" w:val="clear"/>
+          </w:tcPr>
+          <w:p>
+            <w:pPr>
+              <w:spacing w:before="20" w:after="20"/>
+            </w:pPr>
+            <w:r/>
+            <w:r>
+              <w:rPr>
+                <w:rFonts w:ascii="Calibri" w:hAnsi="Calibri"/>
+                <w:b w:val="0"/>
+                <w:color w:val="0D3B66"/>
+                <w:sz w:val="16"/>
+              </w:rPr>
+              <w:t>$348.390</w:t>
+            </w:r>
+          </w:p>
+        </w:tc>
+      </w:tr>
+      <w:tr>
+        <w:trPr>
+          <w:cantSplit/>
+        </w:trPr>
+        <w:tc>
+          <w:tcPr>
+            <w:tcW w:type="dxa" w:w="3061"/>
             <w:shd w:fill="D9E1F2" w:val="clear"/>
           </w:tcPr>
           <w:p>
@@ -1090,7 +1305,7 @@
                 <w:color w:val="0D3B66"/>
                 <w:sz w:val="16"/>
               </w:rPr>
-              <w:t>Total si se aprueban MAQ + PAK</w:t>
+              <w:t>Total si se aprueban las 4</w:t>
             </w:r>
           </w:p>
         </w:tc>
@@ -1134,7 +1349,7 @@
                 <w:color w:val="0D3B66"/>
                 <w:sz w:val="16"/>
               </w:rPr>
-              <w:t>Cuatro recintos</w:t>
+              <w:t>MAQ + PAK + AEB 1° piso + Falabella</w:t>
             </w:r>
           </w:p>
         </w:tc>
@@ -1156,7 +1371,7 @@
                 <w:color w:val="0D3B66"/>
                 <w:sz w:val="16"/>
               </w:rPr>
-              <w:t>4.333</w:t>
+              <w:t>4.787</w:t>
             </w:r>
           </w:p>
         </w:tc>
@@ -1178,7 +1393,7 @@
                 <w:color w:val="0D3B66"/>
                 <w:sz w:val="16"/>
               </w:rPr>
-              <w:t>$6.066.060</w:t>
+              <w:t>$6.701.310</w:t>
             </w:r>
           </w:p>
         </w:tc>
@@ -1204,7 +1419,7 @@
       <w:r>
         <w:drawing>
           <wp:inline xmlns:a="http://schemas.openxmlformats.org/drawingml/2006/main" xmlns:pic="http://schemas.openxmlformats.org/drawingml/2006/picture">
-            <wp:extent cx="5760720" cy="2215662"/>
+            <wp:extent cx="5760720" cy="2848708"/>
             <wp:docPr id="1" name="Picture 1"/>
             <wp:cNvGraphicFramePr>
               <a:graphicFrameLocks noChangeAspect="1"/>
@@ -1225,7 +1440,7 @@
                   <pic:spPr>
                     <a:xfrm>
                       <a:off x="0" y="0"/>
-                      <a:ext cx="5760720" cy="2215662"/>
+                      <a:ext cx="5760720" cy="2848708"/>
                     </a:xfrm>
                     <a:prstGeom prst="rect"/>
                   </pic:spPr>
@@ -2330,7 +2545,7 @@
                 <w:color w:val="0D3B66"/>
                 <w:sz w:val="16"/>
               </w:rPr>
-              <w:t>AEB Anillo Plaza y Matriz 1° piso</w:t>
+              <w:t>AEB Matriz 1° piso</w:t>
             </w:r>
           </w:p>
         </w:tc>
@@ -2370,7 +2585,7 @@
                 <w:color w:val="0D3B66"/>
                 <w:sz w:val="16"/>
               </w:rPr>
-              <w:t>Umbrales 24 h: Anillo 22 · Matriz 75 m³/día</w:t>
+              <w:t>6,8 m³ → 0  ·  umbral 75 m³/día</w:t>
             </w:r>
           </w:p>
         </w:tc>
@@ -2390,7 +2605,7 @@
                 <w:color w:val="0D3B66"/>
                 <w:sz w:val="16"/>
               </w:rPr>
-              <w:t>A definir</w:t>
+              <w:t>205</w:t>
             </w:r>
           </w:p>
         </w:tc>
@@ -2410,7 +2625,7 @@
                 <w:color w:val="0D3B66"/>
                 <w:sz w:val="16"/>
               </w:rPr>
-              <w:t>—</w:t>
+              <w:t>$286.860</w:t>
             </w:r>
           </w:p>
         </w:tc>
@@ -2436,7 +2651,7 @@
                 <w:color w:val="0D3B66"/>
                 <w:sz w:val="16"/>
               </w:rPr>
-              <w:t>MAM / CUR</w:t>
+              <w:t>MAM Falabella</w:t>
             </w:r>
           </w:p>
         </w:tc>
@@ -2457,7 +2672,7 @@
                 <w:color w:val="0D3B66"/>
                 <w:sz w:val="16"/>
               </w:rPr>
-              <w:t>Sin on/off ahora</w:t>
+              <w:t>On/off 00:30 (desde 15/08 sale por Falabella)</w:t>
             </w:r>
           </w:p>
         </w:tc>
@@ -2478,7 +2693,7 @@
                 <w:color w:val="0D3B66"/>
                 <w:sz w:val="16"/>
               </w:rPr>
-              <w:t>Maipú: Arrow + punto 6. Curauma: noche chica (umbrales Sur 14 · Norte 13)</w:t>
+              <w:t>8,3 m³ → 0  ·  umbral 140 m³/día</w:t>
             </w:r>
           </w:p>
         </w:tc>
@@ -2499,7 +2714,7 @@
                 <w:color w:val="0D3B66"/>
                 <w:sz w:val="16"/>
               </w:rPr>
-              <w:t>—</w:t>
+              <w:t>249</w:t>
             </w:r>
           </w:p>
         </w:tc>
@@ -2520,7 +2735,7 @@
                 <w:color w:val="0D3B66"/>
                 <w:sz w:val="16"/>
               </w:rPr>
-              <w:t>—</w:t>
+              <w:t>$348.390</w:t>
             </w:r>
           </w:p>
         </w:tc>
@@ -2546,7 +2761,7 @@
                 <w:color w:val="0D3B66"/>
                 <w:sz w:val="16"/>
               </w:rPr>
-              <w:t>Total si se aprueban MAQ + PAK</w:t>
+              <w:t>Total si se aprueban las 4</w:t>
             </w:r>
           </w:p>
         </w:tc>
@@ -2588,7 +2803,7 @@
                 <w:color w:val="0D3B66"/>
                 <w:sz w:val="16"/>
               </w:rPr>
-              <w:t>Cuatro recintos con $ en esta tabla</w:t>
+              <w:t>MAQ + PAK + AEB 1° piso + Falabella. CUR: noche chica, sin on/off</w:t>
             </w:r>
           </w:p>
         </w:tc>
@@ -2609,7 +2824,7 @@
                 <w:color w:val="0D3B66"/>
                 <w:sz w:val="16"/>
               </w:rPr>
-              <w:t>4.333</w:t>
+              <w:t>4.787</w:t>
             </w:r>
           </w:p>
         </w:tc>
@@ -2630,7 +2845,7 @@
                 <w:color w:val="0D3B66"/>
                 <w:sz w:val="16"/>
               </w:rPr>
-              <w:t>$6.066.060</w:t>
+              <w:t>$6.701.310</w:t>
             </w:r>
           </w:p>
         </w:tc>
@@ -2997,7 +3212,7 @@
           <w:rFonts w:ascii="Calibri" w:hAnsi="Calibri"/>
           <w:color w:val="0D3B66"/>
         </w:rPr>
-        <w:t>7. Mall Arauco Maipú (MAM) — a la espera de concretar</w:t>
+        <w:t>7. Mall Arauco El Bosque (AEB) — propuesta de control</w:t>
       </w:r>
     </w:p>
     <w:p>
@@ -3012,7 +3227,22 @@
           <w:color w:val="0D3B66"/>
           <w:sz w:val="22"/>
         </w:rPr>
-        <w:t>Maipú no entra en esta lámina como ahorro de on/off. Placa Bancaria y Falabella son alimentación alternativa del mall (cuando se inyecta una, se corta la otra). El 08/09 Placa 4,5 m³ y Falabella 92 m³ es cambio de alimentación, no dos fallas.</w:t>
+        <w:t>Desde el 15/05 la Matriz A.A. está desactivada: el recinto se lee en Matriz 1° piso (000025-11) y Anillo Plaza. Esta simulación corta solo el primer piso, que es el caudal de noche: 6,8 m³ (mediana, 70 noches desde julio hasta 08/09). Anillo Plaza queda con umbral de día, sin $ en esta proyección.</w:t>
+      </w:r>
+    </w:p>
+    <w:p>
+      <w:pPr>
+        <w:spacing w:after="120" w:before="0" w:line="240" w:lineRule="auto"/>
+        <w:jc w:val="both"/>
+      </w:pPr>
+      <w:r>
+        <w:rPr>
+          <w:rFonts w:ascii="Calibri" w:hAnsi="Calibri"/>
+          <w:b/>
+          <w:color w:val="0D3B66"/>
+          <w:sz w:val="22"/>
+        </w:rPr>
+        <w:t>Propuesta: mismo corte a las 00:30 en Matriz 1° piso. Meta: 6,8 m³ → 0 = 205 m³/mes ($286.860). No se resta el tramo 00:00–00:30: el control es ir a cero.</w:t>
       </w:r>
     </w:p>
     <w:p>
@@ -3027,7 +3257,79 @@
           <w:color w:val="0D3B66"/>
           <w:sz w:val="22"/>
         </w:rPr>
-        <w:t>Lo que sí está pendiente —y hay que pedirlo en la reunión— es concretar la relocalización del punto de Pasillo 1 Arrow y la instalación del punto 6 (Pasillo 2). Se envió a Don Miguel la propuesta de localización: dos sectores hoy no están monitoreados y pueden concentrar una parte importante del volumen distribuido. Pasillo Técnico Boulevard y Arrow casi no miden; no sirven donde están.</w:t>
+        <w:t>Umbral 24 h a activar: Matriz 1° piso 75 m³/día.</w:t>
+      </w:r>
+    </w:p>
+    <w:p>
+      <w:pPr>
+        <w:pStyle w:val="Heading1"/>
+      </w:pPr>
+      <w:r>
+        <w:rPr>
+          <w:rFonts w:ascii="Calibri" w:hAnsi="Calibri"/>
+          <w:color w:val="0D3B66"/>
+        </w:rPr>
+        <w:t>8. Mall Arauco Maipú (MAM) — Falabella + pendiente Arrow / punto 6</w:t>
+      </w:r>
+    </w:p>
+    <w:p>
+      <w:pPr>
+        <w:spacing w:after="120" w:before="0" w:line="240" w:lineRule="auto"/>
+        <w:jc w:val="both"/>
+      </w:pPr>
+      <w:r>
+        <w:rPr>
+          <w:rFonts w:ascii="Calibri" w:hAnsi="Calibri"/>
+          <w:b w:val="0"/>
+          <w:color w:val="0D3B66"/>
+          <w:sz w:val="22"/>
+        </w:rPr>
+        <w:t>Placa Bancaria y Falabella son alimentación alternativa del mall (cuando se inyecta una, se corta la otra). El 08/09 Placa 4,5 m³ y Falabella 92 m³ es cambio de alimentación, no dos fallas. Desde el 15/08 el mall sale por Falabella: el on/off se propone en esa línea.</w:t>
+      </w:r>
+    </w:p>
+    <w:p>
+      <w:pPr>
+        <w:spacing w:after="120" w:before="0" w:line="240" w:lineRule="auto"/>
+        <w:jc w:val="both"/>
+      </w:pPr>
+      <w:r>
+        <w:rPr>
+          <w:rFonts w:ascii="Calibri" w:hAnsi="Calibri"/>
+          <w:b/>
+          <w:color w:val="0D3B66"/>
+          <w:sz w:val="22"/>
+        </w:rPr>
+        <w:t>Noche típica de Falabella desde el 15/08 (solo noches con caudal, no los días que inyecta Placa): 8,3 m³ (mediana, 16 noches hasta 08/09). Propuesta: mismo corte a las 00:30. Meta: 8,3 m³ → 0 = 249 m³/mes ($348.390). Tampoco se resta el tramo 00:00–00:30.</w:t>
+      </w:r>
+    </w:p>
+    <w:p>
+      <w:pPr>
+        <w:spacing w:after="120" w:before="0" w:line="240" w:lineRule="auto"/>
+        <w:jc w:val="both"/>
+      </w:pPr>
+      <w:r>
+        <w:rPr>
+          <w:rFonts w:ascii="Calibri" w:hAnsi="Calibri"/>
+          <w:b w:val="0"/>
+          <w:color w:val="0D3B66"/>
+          <w:sz w:val="22"/>
+        </w:rPr>
+        <w:t>Umbral 24 h a activar: Falabella 140 m³/día.</w:t>
+      </w:r>
+    </w:p>
+    <w:p>
+      <w:pPr>
+        <w:spacing w:after="120" w:before="0" w:line="240" w:lineRule="auto"/>
+        <w:jc w:val="both"/>
+      </w:pPr>
+      <w:r>
+        <w:rPr>
+          <w:rFonts w:ascii="Calibri" w:hAnsi="Calibri"/>
+          <w:b w:val="0"/>
+          <w:color w:val="0D3B66"/>
+          <w:sz w:val="22"/>
+        </w:rPr>
+        <w:t>Sigue pendiente —y hay que pedirlo en la reunión— concretar la relocalización del punto de Pasillo 1 Arrow y la instalación del punto 6 (Pasillo 2). Se envió a Don Miguel la propuesta de localización: dos sectores hoy no están monitoreados y pueden concentrar una parte importante del volumen distribuido. Pasillo Técnico Boulevard y Arrow casi no miden; no sirven donde están.</w:t>
       </w:r>
     </w:p>
     <w:p>
@@ -3104,7 +3406,7 @@
           <w:rFonts w:ascii="Calibri" w:hAnsi="Calibri"/>
           <w:color w:val="0D3B66"/>
         </w:rPr>
-        <w:t>8. Pedido concreto de la reunión</w:t>
+        <w:t>9. Pedido concreto de la reunión</w:t>
       </w:r>
     </w:p>
     <w:p>
@@ -3119,7 +3421,7 @@
           <w:color w:val="0D3B66"/>
           <w:sz w:val="22"/>
         </w:rPr>
-        <w:t>Se pide aprobar el mismo corte (se arma a las 00:30; 01:00–05:00 a cero) en (a) Matriz Principal de Quilicura y (b) Bazar Gourmet de Kennedy. Con eso se proyectan 1.508 m³/mes adicionales ($2.111.340). Junto con el corte, activar los umbrales 24 h de este informe.</w:t>
+        <w:t>Se pide aprobar el mismo corte (se arma a las 00:30; 01:00–05:00 a cero) en (a) Matriz Principal de Quilicura, (b) Bazar Gourmet de Kennedy, (c) Matriz 1° piso de El Bosque y (d) Falabella de Maipú. Con eso se proyectan 1.962 m³/mes adicionales ($2.746.590). Junto con el corte, activar los umbrales 24 h de este informe.</w:t>
       </w:r>
     </w:p>
     <w:p>
@@ -3134,7 +3436,7 @@
           <w:color w:val="0D3B66"/>
           <w:sz w:val="22"/>
         </w:rPr>
-        <w:t>En Maipú se pide validar la propuesta enviada a Don Miguel (relocalizar Arrow e instalar el punto 6 en Pasillo 2) y habilitar la gatera al entretecho para programar la faena. No se pide on/off de ahorro en Maipú ni corte en las Sandías de Kennedy.</w:t>
+        <w:t>En Maipú, además del on/off de Falabella, se pide validar la propuesta enviada a Don Miguel (relocalizar Arrow e instalar el punto 6 en Pasillo 2) y habilitar la gatera al entretecho para programar la faena. No se pide corte en las Sandías de Kennedy ni on/off en Curauma.</w:t>
       </w:r>
     </w:p>
     <w:p>
@@ -3176,7 +3478,7 @@
           <w:color w:val="0D3B66"/>
           <w:sz w:val="22"/>
         </w:rPr>
-        <w:t>¿Cuánto más si aprueban Quilicura y Kennedy? 1.508 m³/mes ($2.111.340), pasando esa misma ventana a cero. Suma total 4.333 m³/mes ($6.066.060).</w:t>
+        <w:t>¿Cuánto más si aprueban las 4? 1.962 m³/mes ($2.746.590): Quilicura, Kennedy, El Bosque 1° piso y Falabella Maipú, pasando esa misma ventana a cero. Suma total 4.787 m³/mes ($6.701.310).</w:t>
       </w:r>
     </w:p>
     <w:p>
@@ -3236,6 +3538,21 @@
           <w:color w:val="0D3B66"/>
           <w:sz w:val="22"/>
         </w:rPr>
+        <w:t>¿Por qué El Bosque 1° piso? La Matriz A.A. está desactivada desde el 15/05; el caudal de noche está en Matriz 1° piso.</w:t>
+      </w:r>
+    </w:p>
+    <w:p>
+      <w:pPr>
+        <w:pStyle w:val="ListBullet"/>
+        <w:jc w:val="both"/>
+      </w:pPr>
+      <w:r>
+        <w:rPr>
+          <w:rFonts w:ascii="Calibri" w:hAnsi="Calibri"/>
+          <w:b w:val="0"/>
+          <w:color w:val="0D3B66"/>
+          <w:sz w:val="22"/>
+        </w:rPr>
         <w:t>¿Pizza Hut cuánto ahorra? El control está puesto; 01:00–05:00 ya era cero. No se suma en $.</w:t>
       </w:r>
     </w:p>
@@ -3251,7 +3568,7 @@
           <w:color w:val="0D3B66"/>
           <w:sz w:val="22"/>
         </w:rPr>
-        <w:t>¿Y Maipú? A la espera de concretar Arrow + punto 6 (Pasillo 2) con Don Miguel y la gatera. El 08/09 Placa/Falabella es cambio de alimentación, no ahorro.</w:t>
+        <w:t>¿Y Maipú? On/off en Falabella (el mall sale por ahí desde el 15/08). Placa/Falabella el 08/09 es cambio de alimentación, no dos fallas. Arrow + punto 6 sigue pendiente con Don Miguel y la gatera.</w:t>
       </w:r>
     </w:p>
     <w:p>

</xml_diff>

<commit_message>
Regenerate PA brief and consolidado with DL Kennedy in the night simulation.
Bazar Gourmet and DL Kennedy now both carry m³/$ (874 and 27 m³/mes through 08/09/2026).

Co-authored-by: anibaloperacionesWes <anibaloperacionesWes@users.noreply.github.com>
</commit_message>
<xml_diff>
--- a/reports/Parque_Arauco/CONSOLIDADO/Informe_ahorro_PA_reunion_20260908.docx
+++ b/reports/Parque_Arauco/CONSOLIDADO/Informe_ahorro_PA_reunion_20260908.docx
@@ -135,7 +135,7 @@
           <w:color w:val="0D3B66"/>
           <w:sz w:val="22"/>
         </w:rPr>
-        <w:t>A copiar — Quilicura, Kennedy, El Bosque 1° piso y Falabella Maipú.</w:t>
+        <w:t>A copiar — Quilicura, Kennedy (Bazar y DL Kennedy), El Bosque 1° piso y Falabella Maipú.</w:t>
       </w:r>
       <w:r>
         <w:rPr>
@@ -144,7 +144,7 @@
           <w:color w:val="0D3B66"/>
           <w:sz w:val="22"/>
         </w:rPr>
-        <w:t xml:space="preserve"> El mismo corte se propone en Matriz Principal, Bazar Gourmet, Matriz 1° piso de El Bosque y Falabella de Maipú (el mall sale por ahí desde el 15/08). Esa noche hoy no es cero; esa es la proyección.</w:t>
+        <w:t xml:space="preserve"> El mismo corte se propone en Matriz Principal, Bazar Gourmet, DL Kennedy, Matriz 1° piso de El Bosque y Falabella de Maipú (el mall sale por ahí desde el 15/08). Esa noche hoy no es cero; esa es la proyección.</w:t>
       </w:r>
     </w:p>
     <w:p>
@@ -978,7 +978,7 @@
                 <w:color w:val="0D3B66"/>
                 <w:sz w:val="16"/>
               </w:rPr>
-              <w:t>El Bosque Matriz 1° piso</w:t>
+              <w:t>Kennedy DL Kennedy</w:t>
             </w:r>
           </w:p>
         </w:tc>
@@ -1018,7 +1018,7 @@
                 <w:color w:val="0D3B66"/>
                 <w:sz w:val="16"/>
               </w:rPr>
-              <w:t>6,8 m³ → 0 desde 00:30</w:t>
+              <w:t>0,9 m³ → 0 desde 00:30</w:t>
             </w:r>
           </w:p>
         </w:tc>
@@ -1038,7 +1038,7 @@
                 <w:color w:val="0D3B66"/>
                 <w:sz w:val="16"/>
               </w:rPr>
-              <w:t>205</w:t>
+              <w:t>27</w:t>
             </w:r>
           </w:p>
         </w:tc>
@@ -1058,7 +1058,7 @@
                 <w:color w:val="0D3B66"/>
                 <w:sz w:val="16"/>
               </w:rPr>
-              <w:t>$286.860</w:t>
+              <w:t>$37.800</w:t>
             </w:r>
           </w:p>
         </w:tc>
@@ -1084,7 +1084,7 @@
                 <w:color w:val="0D3B66"/>
                 <w:sz w:val="16"/>
               </w:rPr>
-              <w:t>Maipú Falabella</w:t>
+              <w:t>El Bosque Matriz 1° piso</w:t>
             </w:r>
           </w:p>
         </w:tc>
@@ -1126,7 +1126,7 @@
                 <w:color w:val="0D3B66"/>
                 <w:sz w:val="16"/>
               </w:rPr>
-              <w:t>8,3 m³ → 0 desde 00:30</w:t>
+              <w:t>6,8 m³ → 0 desde 00:30</w:t>
             </w:r>
           </w:p>
         </w:tc>
@@ -1147,6 +1147,112 @@
                 <w:color w:val="0D3B66"/>
                 <w:sz w:val="16"/>
               </w:rPr>
+              <w:t>205</w:t>
+            </w:r>
+          </w:p>
+        </w:tc>
+        <w:tc>
+          <w:tcPr>
+            <w:tcW w:type="dxa" w:w="1587"/>
+            <w:shd w:fill="F4F7FA" w:val="clear"/>
+          </w:tcPr>
+          <w:p>
+            <w:pPr>
+              <w:spacing w:before="20" w:after="20"/>
+            </w:pPr>
+            <w:r/>
+            <w:r>
+              <w:rPr>
+                <w:rFonts w:ascii="Calibri" w:hAnsi="Calibri"/>
+                <w:b w:val="0"/>
+                <w:color w:val="0D3B66"/>
+                <w:sz w:val="16"/>
+              </w:rPr>
+              <w:t>$286.860</w:t>
+            </w:r>
+          </w:p>
+        </w:tc>
+      </w:tr>
+      <w:tr>
+        <w:trPr>
+          <w:cantSplit/>
+        </w:trPr>
+        <w:tc>
+          <w:tcPr>
+            <w:tcW w:type="dxa" w:w="3061"/>
+          </w:tcPr>
+          <w:p>
+            <w:pPr>
+              <w:spacing w:before="20" w:after="20"/>
+            </w:pPr>
+            <w:r/>
+            <w:r>
+              <w:rPr>
+                <w:rFonts w:ascii="Calibri" w:hAnsi="Calibri"/>
+                <w:b/>
+                <w:color w:val="0D3B66"/>
+                <w:sz w:val="16"/>
+              </w:rPr>
+              <w:t>Maipú Falabella</w:t>
+            </w:r>
+          </w:p>
+        </w:tc>
+        <w:tc>
+          <w:tcPr>
+            <w:tcW w:type="dxa" w:w="1474"/>
+          </w:tcPr>
+          <w:p>
+            <w:pPr>
+              <w:spacing w:before="20" w:after="20"/>
+            </w:pPr>
+            <w:r/>
+            <w:r>
+              <w:rPr>
+                <w:rFonts w:ascii="Calibri" w:hAnsi="Calibri"/>
+                <w:b w:val="0"/>
+                <w:color w:val="0D3B66"/>
+                <w:sz w:val="16"/>
+              </w:rPr>
+              <w:t>Propuesta</w:t>
+            </w:r>
+          </w:p>
+        </w:tc>
+        <w:tc>
+          <w:tcPr>
+            <w:tcW w:type="dxa" w:w="2381"/>
+          </w:tcPr>
+          <w:p>
+            <w:pPr>
+              <w:spacing w:before="20" w:after="20"/>
+            </w:pPr>
+            <w:r/>
+            <w:r>
+              <w:rPr>
+                <w:rFonts w:ascii="Calibri" w:hAnsi="Calibri"/>
+                <w:b w:val="0"/>
+                <w:color w:val="0D3B66"/>
+                <w:sz w:val="16"/>
+              </w:rPr>
+              <w:t>8,3 m³ → 0 desde 00:30</w:t>
+            </w:r>
+          </w:p>
+        </w:tc>
+        <w:tc>
+          <w:tcPr>
+            <w:tcW w:type="dxa" w:w="1361"/>
+          </w:tcPr>
+          <w:p>
+            <w:pPr>
+              <w:spacing w:before="20" w:after="20"/>
+            </w:pPr>
+            <w:r/>
+            <w:r>
+              <w:rPr>
+                <w:rFonts w:ascii="Calibri" w:hAnsi="Calibri"/>
+                <w:b w:val="0"/>
+                <w:color w:val="0D3B66"/>
+                <w:sz w:val="16"/>
+              </w:rPr>
               <w:t>249</w:t>
             </w:r>
           </w:p>
@@ -1154,7 +1260,6 @@
         <w:tc>
           <w:tcPr>
             <w:tcW w:type="dxa" w:w="1587"/>
-            <w:shd w:fill="F4F7FA" w:val="clear"/>
           </w:tcPr>
           <w:p>
             <w:pPr>
@@ -1180,6 +1285,7 @@
         <w:tc>
           <w:tcPr>
             <w:tcW w:type="dxa" w:w="3061"/>
+            <w:shd w:fill="F4F7FA" w:val="clear"/>
             <w:shd w:fill="D9E1F2" w:val="clear"/>
           </w:tcPr>
           <w:p>
@@ -1201,6 +1307,7 @@
         <w:tc>
           <w:tcPr>
             <w:tcW w:type="dxa" w:w="1474"/>
+            <w:shd w:fill="F4F7FA" w:val="clear"/>
             <w:shd w:fill="D9E1F2" w:val="clear"/>
           </w:tcPr>
           <w:p>
@@ -1222,6 +1329,7 @@
         <w:tc>
           <w:tcPr>
             <w:tcW w:type="dxa" w:w="2381"/>
+            <w:shd w:fill="F4F7FA" w:val="clear"/>
             <w:shd w:fill="D9E1F2" w:val="clear"/>
           </w:tcPr>
           <w:p>
@@ -1243,6 +1351,7 @@
         <w:tc>
           <w:tcPr>
             <w:tcW w:type="dxa" w:w="1361"/>
+            <w:shd w:fill="F4F7FA" w:val="clear"/>
             <w:shd w:fill="D9E1F2" w:val="clear"/>
           </w:tcPr>
           <w:p>
@@ -1264,6 +1373,7 @@
         <w:tc>
           <w:tcPr>
             <w:tcW w:type="dxa" w:w="1587"/>
+            <w:shd w:fill="F4F7FA" w:val="clear"/>
             <w:shd w:fill="D9E1F2" w:val="clear"/>
           </w:tcPr>
           <w:p>
@@ -1290,7 +1400,6 @@
         <w:tc>
           <w:tcPr>
             <w:tcW w:type="dxa" w:w="3061"/>
-            <w:shd w:fill="F4F7FA" w:val="clear"/>
             <w:shd w:fill="D9E1F2" w:val="clear"/>
           </w:tcPr>
           <w:p>
@@ -1305,14 +1414,13 @@
                 <w:color w:val="0D3B66"/>
                 <w:sz w:val="16"/>
               </w:rPr>
-              <w:t>Total si se aprueban las 4</w:t>
+              <w:t>Total si se aprueban las 5</w:t>
             </w:r>
           </w:p>
         </w:tc>
         <w:tc>
           <w:tcPr>
             <w:tcW w:type="dxa" w:w="1474"/>
-            <w:shd w:fill="F4F7FA" w:val="clear"/>
             <w:shd w:fill="D9E1F2" w:val="clear"/>
           </w:tcPr>
           <w:p>
@@ -1334,7 +1442,6 @@
         <w:tc>
           <w:tcPr>
             <w:tcW w:type="dxa" w:w="2381"/>
-            <w:shd w:fill="F4F7FA" w:val="clear"/>
             <w:shd w:fill="D9E1F2" w:val="clear"/>
           </w:tcPr>
           <w:p>
@@ -1349,14 +1456,13 @@
                 <w:color w:val="0D3B66"/>
                 <w:sz w:val="16"/>
               </w:rPr>
-              <w:t>MAQ + PAK + AEB 1° piso + Falabella</w:t>
+              <w:t>MAQ + Bazar + DL Kennedy + AEB 1° piso + Falabella</w:t>
             </w:r>
           </w:p>
         </w:tc>
         <w:tc>
           <w:tcPr>
             <w:tcW w:type="dxa" w:w="1361"/>
-            <w:shd w:fill="F4F7FA" w:val="clear"/>
             <w:shd w:fill="D9E1F2" w:val="clear"/>
           </w:tcPr>
           <w:p>
@@ -1371,14 +1477,13 @@
                 <w:color w:val="0D3B66"/>
                 <w:sz w:val="16"/>
               </w:rPr>
-              <w:t>4.787</w:t>
+              <w:t>4.814</w:t>
             </w:r>
           </w:p>
         </w:tc>
         <w:tc>
           <w:tcPr>
             <w:tcW w:type="dxa" w:w="1587"/>
-            <w:shd w:fill="F4F7FA" w:val="clear"/>
             <w:shd w:fill="D9E1F2" w:val="clear"/>
           </w:tcPr>
           <w:p>
@@ -1393,7 +1498,7 @@
                 <w:color w:val="0D3B66"/>
                 <w:sz w:val="16"/>
               </w:rPr>
-              <w:t>$6.701.310</w:t>
+              <w:t>$6.739.110</w:t>
             </w:r>
           </w:p>
         </w:tc>
@@ -1419,7 +1524,7 @@
       <w:r>
         <w:drawing>
           <wp:inline xmlns:a="http://schemas.openxmlformats.org/drawingml/2006/main" xmlns:pic="http://schemas.openxmlformats.org/drawingml/2006/picture">
-            <wp:extent cx="5760720" cy="2848708"/>
+            <wp:extent cx="5760720" cy="3165231"/>
             <wp:docPr id="1" name="Picture 1"/>
             <wp:cNvGraphicFramePr>
               <a:graphicFrameLocks noChangeAspect="1"/>
@@ -1440,7 +1545,7 @@
                   <pic:spPr>
                     <a:xfrm>
                       <a:off x="0" y="0"/>
-                      <a:ext cx="5760720" cy="2848708"/>
+                      <a:ext cx="5760720" cy="3165231"/>
                     </a:xfrm>
                     <a:prstGeom prst="rect"/>
                   </pic:spPr>
@@ -2478,7 +2583,7 @@
                 <w:color w:val="0D3B66"/>
                 <w:sz w:val="16"/>
               </w:rPr>
-              <w:t>29,1 m³ → 0  ·  umbrales DL 390 · Bazar 250 · DL Kennedy 20</w:t>
+              <w:t>29,1 m³ → 0  ·  umbral 250 m³/día</w:t>
             </w:r>
           </w:p>
         </w:tc>
@@ -2545,6 +2650,112 @@
                 <w:color w:val="0D3B66"/>
                 <w:sz w:val="16"/>
               </w:rPr>
+              <w:t>PAK DL Kennedy</w:t>
+            </w:r>
+          </w:p>
+        </w:tc>
+        <w:tc>
+          <w:tcPr>
+            <w:tcW w:type="dxa" w:w="1587"/>
+          </w:tcPr>
+          <w:p>
+            <w:pPr>
+              <w:spacing w:before="20" w:after="20"/>
+            </w:pPr>
+            <w:r/>
+            <w:r>
+              <w:rPr>
+                <w:rFonts w:ascii="Calibri" w:hAnsi="Calibri"/>
+                <w:b w:val="0"/>
+                <w:color w:val="0D3B66"/>
+                <w:sz w:val="16"/>
+              </w:rPr>
+              <w:t>On/off 00:30 (no las Sandías)</w:t>
+            </w:r>
+          </w:p>
+        </w:tc>
+        <w:tc>
+          <w:tcPr>
+            <w:tcW w:type="dxa" w:w="2835"/>
+          </w:tcPr>
+          <w:p>
+            <w:pPr>
+              <w:spacing w:before="20" w:after="20"/>
+            </w:pPr>
+            <w:r/>
+            <w:r>
+              <w:rPr>
+                <w:rFonts w:ascii="Calibri" w:hAnsi="Calibri"/>
+                <w:b w:val="0"/>
+                <w:color w:val="0D3B66"/>
+                <w:sz w:val="16"/>
+              </w:rPr>
+              <w:t>0,9 m³ → 0  ·  umbral 20 m³/día</w:t>
+            </w:r>
+          </w:p>
+        </w:tc>
+        <w:tc>
+          <w:tcPr>
+            <w:tcW w:type="dxa" w:w="1361"/>
+          </w:tcPr>
+          <w:p>
+            <w:pPr>
+              <w:spacing w:before="20" w:after="20"/>
+            </w:pPr>
+            <w:r/>
+            <w:r>
+              <w:rPr>
+                <w:rFonts w:ascii="Calibri" w:hAnsi="Calibri"/>
+                <w:b w:val="0"/>
+                <w:color w:val="0D3B66"/>
+                <w:sz w:val="16"/>
+              </w:rPr>
+              <w:t>27</w:t>
+            </w:r>
+          </w:p>
+        </w:tc>
+        <w:tc>
+          <w:tcPr>
+            <w:tcW w:type="dxa" w:w="1474"/>
+          </w:tcPr>
+          <w:p>
+            <w:pPr>
+              <w:spacing w:before="20" w:after="20"/>
+            </w:pPr>
+            <w:r/>
+            <w:r>
+              <w:rPr>
+                <w:rFonts w:ascii="Calibri" w:hAnsi="Calibri"/>
+                <w:b w:val="0"/>
+                <w:color w:val="0D3B66"/>
+                <w:sz w:val="16"/>
+              </w:rPr>
+              <w:t>$37.800</w:t>
+            </w:r>
+          </w:p>
+        </w:tc>
+      </w:tr>
+      <w:tr>
+        <w:trPr>
+          <w:cantSplit/>
+        </w:trPr>
+        <w:tc>
+          <w:tcPr>
+            <w:tcW w:type="dxa" w:w="2608"/>
+            <w:shd w:fill="F4F7FA" w:val="clear"/>
+          </w:tcPr>
+          <w:p>
+            <w:pPr>
+              <w:spacing w:before="20" w:after="20"/>
+            </w:pPr>
+            <w:r/>
+            <w:r>
+              <w:rPr>
+                <w:rFonts w:ascii="Calibri" w:hAnsi="Calibri"/>
+                <w:b/>
+                <w:color w:val="0D3B66"/>
+                <w:sz w:val="16"/>
+              </w:rPr>
               <w:t>AEB Matriz 1° piso</w:t>
             </w:r>
           </w:p>
@@ -2552,6 +2763,7 @@
         <w:tc>
           <w:tcPr>
             <w:tcW w:type="dxa" w:w="1587"/>
+            <w:shd w:fill="F4F7FA" w:val="clear"/>
           </w:tcPr>
           <w:p>
             <w:pPr>
@@ -2572,6 +2784,7 @@
         <w:tc>
           <w:tcPr>
             <w:tcW w:type="dxa" w:w="2835"/>
+            <w:shd w:fill="F4F7FA" w:val="clear"/>
           </w:tcPr>
           <w:p>
             <w:pPr>
@@ -2592,6 +2805,7 @@
         <w:tc>
           <w:tcPr>
             <w:tcW w:type="dxa" w:w="1361"/>
+            <w:shd w:fill="F4F7FA" w:val="clear"/>
           </w:tcPr>
           <w:p>
             <w:pPr>
@@ -2612,6 +2826,7 @@
         <w:tc>
           <w:tcPr>
             <w:tcW w:type="dxa" w:w="1474"/>
+            <w:shd w:fill="F4F7FA" w:val="clear"/>
           </w:tcPr>
           <w:p>
             <w:pPr>
@@ -2637,7 +2852,6 @@
         <w:tc>
           <w:tcPr>
             <w:tcW w:type="dxa" w:w="2608"/>
-            <w:shd w:fill="F4F7FA" w:val="clear"/>
           </w:tcPr>
           <w:p>
             <w:pPr>
@@ -2658,7 +2872,6 @@
         <w:tc>
           <w:tcPr>
             <w:tcW w:type="dxa" w:w="1587"/>
-            <w:shd w:fill="F4F7FA" w:val="clear"/>
           </w:tcPr>
           <w:p>
             <w:pPr>
@@ -2679,7 +2892,6 @@
         <w:tc>
           <w:tcPr>
             <w:tcW w:type="dxa" w:w="2835"/>
-            <w:shd w:fill="F4F7FA" w:val="clear"/>
           </w:tcPr>
           <w:p>
             <w:pPr>
@@ -2700,7 +2912,6 @@
         <w:tc>
           <w:tcPr>
             <w:tcW w:type="dxa" w:w="1361"/>
-            <w:shd w:fill="F4F7FA" w:val="clear"/>
           </w:tcPr>
           <w:p>
             <w:pPr>
@@ -2721,7 +2932,6 @@
         <w:tc>
           <w:tcPr>
             <w:tcW w:type="dxa" w:w="1474"/>
-            <w:shd w:fill="F4F7FA" w:val="clear"/>
           </w:tcPr>
           <w:p>
             <w:pPr>
@@ -2747,6 +2957,7 @@
         <w:tc>
           <w:tcPr>
             <w:tcW w:type="dxa" w:w="2608"/>
+            <w:shd w:fill="F4F7FA" w:val="clear"/>
             <w:shd w:fill="D9E1F2" w:val="clear"/>
           </w:tcPr>
           <w:p>
@@ -2761,13 +2972,14 @@
                 <w:color w:val="0D3B66"/>
                 <w:sz w:val="16"/>
               </w:rPr>
-              <w:t>Total si se aprueban las 4</w:t>
+              <w:t>Total si se aprueban las 5</w:t>
             </w:r>
           </w:p>
         </w:tc>
         <w:tc>
           <w:tcPr>
             <w:tcW w:type="dxa" w:w="1587"/>
+            <w:shd w:fill="F4F7FA" w:val="clear"/>
             <w:shd w:fill="D9E1F2" w:val="clear"/>
           </w:tcPr>
           <w:p>
@@ -2789,6 +3001,7 @@
         <w:tc>
           <w:tcPr>
             <w:tcW w:type="dxa" w:w="2835"/>
+            <w:shd w:fill="F4F7FA" w:val="clear"/>
             <w:shd w:fill="D9E1F2" w:val="clear"/>
           </w:tcPr>
           <w:p>
@@ -2803,13 +3016,14 @@
                 <w:color w:val="0D3B66"/>
                 <w:sz w:val="16"/>
               </w:rPr>
-              <w:t>MAQ + PAK + AEB 1° piso + Falabella. CUR: noche chica, sin on/off</w:t>
+              <w:t>MAQ + Bazar + DL Kennedy + AEB 1° piso + Falabella. CUR: noche chica, sin on/off</w:t>
             </w:r>
           </w:p>
         </w:tc>
         <w:tc>
           <w:tcPr>
             <w:tcW w:type="dxa" w:w="1361"/>
+            <w:shd w:fill="F4F7FA" w:val="clear"/>
             <w:shd w:fill="D9E1F2" w:val="clear"/>
           </w:tcPr>
           <w:p>
@@ -2824,13 +3038,14 @@
                 <w:color w:val="0D3B66"/>
                 <w:sz w:val="16"/>
               </w:rPr>
-              <w:t>4.787</w:t>
+              <w:t>4.814</w:t>
             </w:r>
           </w:p>
         </w:tc>
         <w:tc>
           <w:tcPr>
             <w:tcW w:type="dxa" w:w="1474"/>
+            <w:shd w:fill="F4F7FA" w:val="clear"/>
             <w:shd w:fill="D9E1F2" w:val="clear"/>
           </w:tcPr>
           <w:p>
@@ -2845,7 +3060,7 @@
                 <w:color w:val="0D3B66"/>
                 <w:sz w:val="16"/>
               </w:rPr>
-              <w:t>$6.701.310</w:t>
+              <w:t>$6.739.110</w:t>
             </w:r>
           </w:p>
         </w:tc>
@@ -3170,7 +3385,7 @@
           <w:color w:val="0D3B66"/>
           <w:sz w:val="22"/>
         </w:rPr>
-        <w:t>La cadena no se suma a la cabecera del mall: Sandía Antigua y Sandía Nueva alimentan Distrito de Lujo; de ahí sale a Bazar Gourmet y DL Kennedy. Cortar de noche en el eslabón que más gasta es el control, no apagar las Sandías (dejarían sin agua toda la cadena).</w:t>
+        <w:t>La cadena no se suma a la cabecera del mall: Sandía Antigua y Sandía Nueva alimentan Distrito de Lujo; de ahí sale a Bazar Gourmet y DL Kennedy. El control es cortar de noche en esos dos ramales, no apagar las Sandías (dejarían sin agua toda la cadena).</w:t>
       </w:r>
     </w:p>
     <w:p>
@@ -3185,7 +3400,7 @@
           <w:color w:val="0D3B66"/>
           <w:sz w:val="22"/>
         </w:rPr>
-        <w:t>El eslabón de mayor noche desde las 00:30 es Bazar Gourmet: 29,1 m³ (el otro queda más abajo). Propuesta: mismo corte a las 00:30 en Bazar Gourmet. Meta: 29,1 m³ → 0 = 874 m³/mes ($1.224.300). Tampoco se resta el tramo 00:00–00:30.</w:t>
+        <w:t>Bazar Gourmet: noche 29,1 m³ → 0 = 874 m³/mes ($1.224.300). DL Kennedy: noche 0,9 m³ → 0 = 27 m³/mes ($37.800). Mismo corte a las 00:30 en los dos. Tampoco se resta el tramo 00:00–00:30.</w:t>
       </w:r>
     </w:p>
     <w:p>
@@ -3421,7 +3636,7 @@
           <w:color w:val="0D3B66"/>
           <w:sz w:val="22"/>
         </w:rPr>
-        <w:t>Se pide aprobar el mismo corte (se arma a las 00:30; 01:00–05:00 a cero) en (a) Matriz Principal de Quilicura, (b) Bazar Gourmet de Kennedy, (c) Matriz 1° piso de El Bosque y (d) Falabella de Maipú. Con eso se proyectan 1.962 m³/mes adicionales ($2.746.590). Junto con el corte, activar los umbrales 24 h de este informe.</w:t>
+        <w:t>Se pide aprobar el mismo corte (se arma a las 00:30; 01:00–05:00 a cero) en (a) Matriz Principal de Quilicura, (b) Bazar Gourmet y (c) DL Kennedy de Kennedy, (d) Matriz 1° piso de El Bosque y (e) Falabella de Maipú. Con eso se proyectan 1.989 m³/mes adicionales ($2.784.390). Junto con el corte, activar los umbrales 24 h de este informe.</w:t>
       </w:r>
     </w:p>
     <w:p>
@@ -3478,7 +3693,7 @@
           <w:color w:val="0D3B66"/>
           <w:sz w:val="22"/>
         </w:rPr>
-        <w:t>¿Cuánto más si aprueban las 4? 1.962 m³/mes ($2.746.590): Quilicura, Kennedy, El Bosque 1° piso y Falabella Maipú, pasando esa misma ventana a cero. Suma total 4.787 m³/mes ($6.701.310).</w:t>
+        <w:t>¿Cuánto más si aprueban las 5? 1.989 m³/mes ($2.784.390): Quilicura, Bazar Gourmet, DL Kennedy, El Bosque 1° piso y Falabella Maipú, pasando esa misma ventana a cero. Suma total 4.814 m³/mes ($6.739.110).</w:t>
       </w:r>
     </w:p>
     <w:p>
@@ -3523,7 +3738,7 @@
           <w:color w:val="0D3B66"/>
           <w:sz w:val="22"/>
         </w:rPr>
-        <w:t>¿Por qué Kennedy? Hay que cortar en Bazar Gourmet (el de mayor noche de la cadena DL), no en las Sandías.</w:t>
+        <w:t>¿Por qué Kennedy? Hay que cortar en Bazar Gourmet y en DL Kennedy (los dos ramales que salen de DL), no en las Sandías.</w:t>
       </w:r>
     </w:p>
     <w:p>

</xml_diff>

<commit_message>
Regenerate the PA brief with hourly before/after control charts.
Estanque Sur is now m³/hour 00–23 around the 10/06 presostats repair; Norte and SI500 show the 00:30 cut hour by hour.

Co-authored-by: anibaloperacionesWes <anibaloperacionesWes@users.noreply.github.com>
</commit_message>
<xml_diff>
--- a/reports/Parque_Arauco/CONSOLIDADO/Informe_ahorro_PA_reunion_20260908.docx
+++ b/reports/Parque_Arauco/CONSOLIDADO/Informe_ahorro_PA_reunion_20260908.docx
@@ -3098,7 +3098,7 @@
       <w:r>
         <w:drawing>
           <wp:inline xmlns:a="http://schemas.openxmlformats.org/drawingml/2006/main" xmlns:pic="http://schemas.openxmlformats.org/drawingml/2006/picture">
-            <wp:extent cx="5120640" cy="2438400"/>
+            <wp:extent cx="5760720" cy="2114578"/>
             <wp:docPr id="2" name="Picture 2"/>
             <wp:cNvGraphicFramePr>
               <a:graphicFrameLocks noChangeAspect="1"/>
@@ -3119,7 +3119,7 @@
                   <pic:spPr>
                     <a:xfrm>
                       <a:off x="0" y="0"/>
-                      <a:ext cx="5120640" cy="2438400"/>
+                      <a:ext cx="5760720" cy="2114578"/>
                     </a:xfrm>
                     <a:prstGeom prst="rect"/>
                   </pic:spPr>
@@ -3128,6 +3128,20 @@
             </a:graphic>
           </wp:inline>
         </w:drawing>
+      </w:r>
+    </w:p>
+    <w:p>
+      <w:pPr>
+        <w:jc w:val="center"/>
+      </w:pPr>
+      <w:r>
+        <w:rPr>
+          <w:rFonts w:ascii="Calibri" w:hAnsi="Calibri"/>
+          <w:b w:val="0"/>
+          <w:color w:val="505050"/>
+          <w:sz w:val="18"/>
+        </w:rPr>
+        <w:t>Gris = antes de los presostatos. Dorado = después. Cada barra es la mediana de esa hora.</w:t>
       </w:r>
     </w:p>
     <w:p>
@@ -3149,7 +3163,7 @@
       <w:r>
         <w:drawing>
           <wp:inline xmlns:a="http://schemas.openxmlformats.org/drawingml/2006/main" xmlns:pic="http://schemas.openxmlformats.org/drawingml/2006/picture">
-            <wp:extent cx="5120640" cy="2438400"/>
+            <wp:extent cx="5760720" cy="2471971"/>
             <wp:docPr id="3" name="Picture 3"/>
             <wp:cNvGraphicFramePr>
               <a:graphicFrameLocks noChangeAspect="1"/>
@@ -3170,7 +3184,7 @@
                   <pic:spPr>
                     <a:xfrm>
                       <a:off x="0" y="0"/>
-                      <a:ext cx="5120640" cy="2438400"/>
+                      <a:ext cx="5760720" cy="2471971"/>
                     </a:xfrm>
                     <a:prstGeom prst="rect"/>
                   </pic:spPr>
@@ -3179,6 +3193,20 @@
             </a:graphic>
           </wp:inline>
         </w:drawing>
+      </w:r>
+    </w:p>
+    <w:p>
+      <w:pPr>
+        <w:jc w:val="center"/>
+      </w:pPr>
+      <w:r>
+        <w:rPr>
+          <w:rFonts w:ascii="Calibri" w:hAnsi="Calibri"/>
+          <w:b w:val="0"/>
+          <w:color w:val="505050"/>
+          <w:sz w:val="18"/>
+        </w:rPr>
+        <w:t>El corte se arma a las 00:30. De 01:00 a 05:00 el consumo queda en cero; 00:00–00:30 no es noche.</w:t>
       </w:r>
     </w:p>
     <w:p>
@@ -3257,7 +3285,7 @@
       <w:r>
         <w:drawing>
           <wp:inline xmlns:a="http://schemas.openxmlformats.org/drawingml/2006/main" xmlns:pic="http://schemas.openxmlformats.org/drawingml/2006/picture">
-            <wp:extent cx="5120640" cy="2438400"/>
+            <wp:extent cx="5760720" cy="2471971"/>
             <wp:docPr id="4" name="Picture 4"/>
             <wp:cNvGraphicFramePr>
               <a:graphicFrameLocks noChangeAspect="1"/>
@@ -3278,7 +3306,7 @@
                   <pic:spPr>
                     <a:xfrm>
                       <a:off x="0" y="0"/>
-                      <a:ext cx="5120640" cy="2438400"/>
+                      <a:ext cx="5760720" cy="2471971"/>
                     </a:xfrm>
                     <a:prstGeom prst="rect"/>
                   </pic:spPr>
@@ -3287,6 +3315,20 @@
             </a:graphic>
           </wp:inline>
         </w:drawing>
+      </w:r>
+    </w:p>
+    <w:p>
+      <w:pPr>
+        <w:jc w:val="center"/>
+      </w:pPr>
+      <w:r>
+        <w:rPr>
+          <w:rFonts w:ascii="Calibri" w:hAnsi="Calibri"/>
+          <w:b w:val="0"/>
+          <w:color w:val="505050"/>
+          <w:sz w:val="18"/>
+        </w:rPr>
+        <w:t>El corte se arma a las 00:30. De 01:00 a 05:00 queda en cero; el tramo 00:00–00:30 no se resta.</w:t>
       </w:r>
     </w:p>
     <w:p>

</xml_diff>

<commit_message>
Show Estanque Norte hourly before vs a night that is actually zero.
Gold bars are nights with 01:00–05:00 at zero after the 00:30 cut; gray is the typical night before 05/08. Sur stays as the daily presostats pair.

Co-authored-by: anibaloperacionesWes <anibaloperacionesWes@users.noreply.github.com>
</commit_message>
<xml_diff>
--- a/reports/Parque_Arauco/CONSOLIDADO/Informe_ahorro_PA_reunion_20260908.docx
+++ b/reports/Parque_Arauco/CONSOLIDADO/Informe_ahorro_PA_reunion_20260908.docx
@@ -3098,7 +3098,7 @@
       <w:r>
         <w:drawing>
           <wp:inline xmlns:a="http://schemas.openxmlformats.org/drawingml/2006/main" xmlns:pic="http://schemas.openxmlformats.org/drawingml/2006/picture">
-            <wp:extent cx="5760720" cy="2114578"/>
+            <wp:extent cx="5120640" cy="2438400"/>
             <wp:docPr id="2" name="Picture 2"/>
             <wp:cNvGraphicFramePr>
               <a:graphicFrameLocks noChangeAspect="1"/>
@@ -3112,6 +3112,57 @@
                   </pic:nvPicPr>
                   <pic:blipFill>
                     <a:blip r:embed="rId11"/>
+                    <a:stretch>
+                      <a:fillRect/>
+                    </a:stretch>
+                  </pic:blipFill>
+                  <pic:spPr>
+                    <a:xfrm>
+                      <a:off x="0" y="0"/>
+                      <a:ext cx="5120640" cy="2438400"/>
+                    </a:xfrm>
+                    <a:prstGeom prst="rect"/>
+                  </pic:spPr>
+                </pic:pic>
+              </a:graphicData>
+            </a:graphic>
+          </wp:inline>
+        </w:drawing>
+      </w:r>
+    </w:p>
+    <w:p>
+      <w:pPr>
+        <w:spacing w:after="120" w:before="0" w:line="240" w:lineRule="auto"/>
+        <w:jc w:val="both"/>
+      </w:pPr>
+      <w:r>
+        <w:rPr>
+          <w:rFonts w:ascii="Calibri" w:hAnsi="Calibri"/>
+          <w:b w:val="0"/>
+          <w:color w:val="0D3B66"/>
+          <w:sz w:val="22"/>
+        </w:rPr>
+        <w:t>Estanque Norte (desde el 05/08): el corte se activa a las 00:30. De 01:00 a 05:00 el consumo quedó en cero (de 3,2 a 0,1 m³). La noche completa desde las 00:30 era 4,8 m³: eso es 3,8 m³/noche = 113 m³/mes ($157.920). Lo que aparece entre 00:00 y 00:30 (1,1 m³) no es noche y no se resta del ahorro.</w:t>
+      </w:r>
+    </w:p>
+    <w:p>
+      <w:r>
+        <w:drawing>
+          <wp:inline xmlns:a="http://schemas.openxmlformats.org/drawingml/2006/main" xmlns:pic="http://schemas.openxmlformats.org/drawingml/2006/picture">
+            <wp:extent cx="5760720" cy="2114578"/>
+            <wp:docPr id="3" name="Picture 3"/>
+            <wp:cNvGraphicFramePr>
+              <a:graphicFrameLocks noChangeAspect="1"/>
+            </wp:cNvGraphicFramePr>
+            <a:graphic>
+              <a:graphicData uri="http://schemas.openxmlformats.org/drawingml/2006/picture">
+                <pic:pic>
+                  <pic:nvPicPr>
+                    <pic:cNvPr id="0" name="mae_norte_antes_despues.png"/>
+                    <pic:cNvPicPr/>
+                  </pic:nvPicPr>
+                  <pic:blipFill>
+                    <a:blip r:embed="rId12"/>
                     <a:stretch>
                       <a:fillRect/>
                     </a:stretch>
@@ -3141,72 +3192,7 @@
           <w:color w:val="505050"/>
           <w:sz w:val="18"/>
         </w:rPr>
-        <w:t>Gris = antes de los presostatos. Dorado = después. Cada barra es la mediana de esa hora.</w:t>
-      </w:r>
-    </w:p>
-    <w:p>
-      <w:pPr>
-        <w:spacing w:after="120" w:before="0" w:line="240" w:lineRule="auto"/>
-        <w:jc w:val="both"/>
-      </w:pPr>
-      <w:r>
-        <w:rPr>
-          <w:rFonts w:ascii="Calibri" w:hAnsi="Calibri"/>
-          <w:b w:val="0"/>
-          <w:color w:val="0D3B66"/>
-          <w:sz w:val="22"/>
-        </w:rPr>
-        <w:t>Estanque Norte (desde el 05/08): el corte se activa a las 00:30. De 01:00 a 05:00 el consumo quedó en cero (de 3,2 a 0,1 m³). La noche completa desde las 00:30 era 4,8 m³: eso es 3,8 m³/noche = 113 m³/mes ($157.920). Lo que aparece entre 00:00 y 00:30 (1,1 m³) no es noche y no se resta del ahorro.</w:t>
-      </w:r>
-    </w:p>
-    <w:p>
-      <w:r>
-        <w:drawing>
-          <wp:inline xmlns:a="http://schemas.openxmlformats.org/drawingml/2006/main" xmlns:pic="http://schemas.openxmlformats.org/drawingml/2006/picture">
-            <wp:extent cx="5760720" cy="2471971"/>
-            <wp:docPr id="3" name="Picture 3"/>
-            <wp:cNvGraphicFramePr>
-              <a:graphicFrameLocks noChangeAspect="1"/>
-            </wp:cNvGraphicFramePr>
-            <a:graphic>
-              <a:graphicData uri="http://schemas.openxmlformats.org/drawingml/2006/picture">
-                <pic:pic>
-                  <pic:nvPicPr>
-                    <pic:cNvPr id="0" name="mae_norte_antes_despues.png"/>
-                    <pic:cNvPicPr/>
-                  </pic:nvPicPr>
-                  <pic:blipFill>
-                    <a:blip r:embed="rId12"/>
-                    <a:stretch>
-                      <a:fillRect/>
-                    </a:stretch>
-                  </pic:blipFill>
-                  <pic:spPr>
-                    <a:xfrm>
-                      <a:off x="0" y="0"/>
-                      <a:ext cx="5760720" cy="2471971"/>
-                    </a:xfrm>
-                    <a:prstGeom prst="rect"/>
-                  </pic:spPr>
-                </pic:pic>
-              </a:graphicData>
-            </a:graphic>
-          </wp:inline>
-        </w:drawing>
-      </w:r>
-    </w:p>
-    <w:p>
-      <w:pPr>
-        <w:jc w:val="center"/>
-      </w:pPr>
-      <w:r>
-        <w:rPr>
-          <w:rFonts w:ascii="Calibri" w:hAnsi="Calibri"/>
-          <w:b w:val="0"/>
-          <w:color w:val="505050"/>
-          <w:sz w:val="18"/>
-        </w:rPr>
-        <w:t>El corte se arma a las 00:30. De 01:00 a 05:00 el consumo queda en cero; 00:00–00:30 no es noche.</w:t>
+        <w:t>Gris = noche con caudal. Dorado = con on/off: de 01:00 a 05:00 va a cero. Lo de 00:00–00:30 no es noche.</w:t>
       </w:r>
     </w:p>
     <w:p>

</xml_diff>

<commit_message>
Regenerate the PA brief with a 24h SI500 control chart.
Buenaventura now matches Norte: full-day scale, night hours labeled, leftover 00:00–00:30, and 01:00–05:00 at zero.

Co-authored-by: anibaloperacionesWes <anibaloperacionesWes@users.noreply.github.com>
</commit_message>
<xml_diff>
--- a/reports/Parque_Arauco/CONSOLIDADO/Informe_ahorro_PA_reunion_20260908.docx
+++ b/reports/Parque_Arauco/CONSOLIDADO/Informe_ahorro_PA_reunion_20260908.docx
@@ -3149,7 +3149,7 @@
       <w:r>
         <w:drawing>
           <wp:inline xmlns:a="http://schemas.openxmlformats.org/drawingml/2006/main" xmlns:pic="http://schemas.openxmlformats.org/drawingml/2006/picture">
-            <wp:extent cx="5760720" cy="2114578"/>
+            <wp:extent cx="5760720" cy="2253390"/>
             <wp:docPr id="3" name="Picture 3"/>
             <wp:cNvGraphicFramePr>
               <a:graphicFrameLocks noChangeAspect="1"/>
@@ -3170,7 +3170,7 @@
                   <pic:spPr>
                     <a:xfrm>
                       <a:off x="0" y="0"/>
-                      <a:ext cx="5760720" cy="2114578"/>
+                      <a:ext cx="5760720" cy="2253390"/>
                     </a:xfrm>
                     <a:prstGeom prst="rect"/>
                   </pic:spPr>
@@ -3271,7 +3271,7 @@
       <w:r>
         <w:drawing>
           <wp:inline xmlns:a="http://schemas.openxmlformats.org/drawingml/2006/main" xmlns:pic="http://schemas.openxmlformats.org/drawingml/2006/picture">
-            <wp:extent cx="5760720" cy="2471971"/>
+            <wp:extent cx="5760720" cy="2253390"/>
             <wp:docPr id="4" name="Picture 4"/>
             <wp:cNvGraphicFramePr>
               <a:graphicFrameLocks noChangeAspect="1"/>
@@ -3292,7 +3292,7 @@
                   <pic:spPr>
                     <a:xfrm>
                       <a:off x="0" y="0"/>
-                      <a:ext cx="5760720" cy="2471971"/>
+                      <a:ext cx="5760720" cy="2253390"/>
                     </a:xfrm>
                     <a:prstGeom prst="rect"/>
                   </pic:spPr>
@@ -3314,7 +3314,7 @@
           <w:color w:val="505050"/>
           <w:sz w:val="18"/>
         </w:rPr>
-        <w:t>El corte se arma a las 00:30. De 01:00 a 05:00 queda en cero; el tramo 00:00–00:30 no se resta.</w:t>
+        <w:t>Gris = noche con ~5 m³/h. Dorado = con on/off: 01:00–05:00 en cero. El ~2 m³ de 00:00–00:30 no es noche.</w:t>
       </w:r>
     </w:p>
     <w:p>

</xml_diff>

<commit_message>
Regenerate the PA brief with Estanque Sur as a 24h hourly chart.
The two-bar daily median is replaced by hour-of-day bars before and after the 10/06 presostats repair.

Co-authored-by: anibaloperacionesWes <anibaloperacionesWes@users.noreply.github.com>
</commit_message>
<xml_diff>
--- a/reports/Parque_Arauco/CONSOLIDADO/Informe_ahorro_PA_reunion_20260908.docx
+++ b/reports/Parque_Arauco/CONSOLIDADO/Informe_ahorro_PA_reunion_20260908.docx
@@ -3098,7 +3098,7 @@
       <w:r>
         <w:drawing>
           <wp:inline xmlns:a="http://schemas.openxmlformats.org/drawingml/2006/main" xmlns:pic="http://schemas.openxmlformats.org/drawingml/2006/picture">
-            <wp:extent cx="5120640" cy="2438400"/>
+            <wp:extent cx="5760720" cy="2253390"/>
             <wp:docPr id="2" name="Picture 2"/>
             <wp:cNvGraphicFramePr>
               <a:graphicFrameLocks noChangeAspect="1"/>
@@ -3119,7 +3119,7 @@
                   <pic:spPr>
                     <a:xfrm>
                       <a:off x="0" y="0"/>
-                      <a:ext cx="5120640" cy="2438400"/>
+                      <a:ext cx="5760720" cy="2253390"/>
                     </a:xfrm>
                     <a:prstGeom prst="rect"/>
                   </pic:spPr>
@@ -3128,6 +3128,20 @@
             </a:graphic>
           </wp:inline>
         </w:drawing>
+      </w:r>
+    </w:p>
+    <w:p>
+      <w:pPr>
+        <w:jc w:val="center"/>
+      </w:pPr>
+      <w:r>
+        <w:rPr>
+          <w:rFonts w:ascii="Calibri" w:hAnsi="Calibri"/>
+          <w:b w:val="0"/>
+          <w:color w:val="505050"/>
+          <w:sz w:val="18"/>
+        </w:rPr>
+        <w:t>Gris = antes de los presostatos (fuga día y noche). Dorado = después del 11/06: de madrugada casi desaparece y de día baja a menos de la mitad.</w:t>
       </w:r>
     </w:p>
     <w:p>

</xml_diff>

<commit_message>
fix(pa): Sur fuera de la suma; Andén 3-4 reemplaza DL Kennedy
Estanque Sur queda como contexto (presostato al relocalizar), no como
control WES. La propuesta de Kennedy pasa a Andén 3-4 Matriz. Gráfico
de barras de los cinco futuros puntos de control.

Co-authored-by: anibaloperacionesWes <anibaloperacionesWes@users.noreply.github.com>
</commit_message>
<xml_diff>
--- a/reports/Parque_Arauco/CONSOLIDADO/Informe_ahorro_PA_reunion_20260908.docx
+++ b/reports/Parque_Arauco/CONSOLIDADO/Informe_ahorro_PA_reunion_20260908.docx
@@ -111,7 +111,7 @@
           <w:color w:val="0D3B66"/>
           <w:sz w:val="22"/>
         </w:rPr>
-        <w:t>Ya operativo — Estación y Buenaventura.</w:t>
+        <w:t>Ya operativo — Estación y Buenaventura (control WES).</w:t>
       </w:r>
       <w:r>
         <w:rPr>
@@ -120,7 +120,7 @@
           <w:color w:val="0D3B66"/>
           <w:sz w:val="22"/>
         </w:rPr>
-        <w:t xml:space="preserve"> Estanque Sur bajó el día completo (presostatos 10/06). Estanque Norte y San Ignacio 500 pasaron de consumo nocturno a cero entre 01:00 y 05:00.</w:t>
+        <w:t xml:space="preserve"> Estanque Norte y San Ignacio 500 pasaron de consumo nocturno a cero entre 01:00 y 05:00. Estanque Sur se muestra más adelante (mejora de presostato al cambiar la ubicación); no es control WES y no entra en $.</w:t>
       </w:r>
     </w:p>
     <w:p>
@@ -135,7 +135,7 @@
           <w:color w:val="0D3B66"/>
           <w:sz w:val="22"/>
         </w:rPr>
-        <w:t>A copiar — Quilicura, Kennedy (Bazar y DL Kennedy), El Bosque 1° piso y Falabella Maipú.</w:t>
+        <w:t>A copiar — Quilicura, Kennedy (Bazar y Andén 3-4 Matriz), El Bosque 1° piso y Falabella Maipú.</w:t>
       </w:r>
       <w:r>
         <w:rPr>
@@ -144,7 +144,7 @@
           <w:color w:val="0D3B66"/>
           <w:sz w:val="22"/>
         </w:rPr>
-        <w:t xml:space="preserve"> El mismo corte se propone en Matriz Principal, Bazar Gourmet, DL Kennedy, Matriz 1° piso de El Bosque y Falabella de Maipú (el mall sale por ahí desde el 15/08). Esa noche hoy no es cero; esa es la proyección.</w:t>
+        <w:t xml:space="preserve"> El mismo corte se propone en Matriz Principal de Quilicura, Bazar Gourmet, Andén 3-4 Matriz de Kennedy, Matriz 1° piso de El Bosque y Falabella de Maipú (el mall sale por ahí desde el 15/08). Esa noche hoy no es cero; esa es la proyección. No se propone DL Kennedy.</w:t>
       </w:r>
     </w:p>
     <w:p>
@@ -333,7 +333,7 @@
                 <w:color w:val="0D3B66"/>
                 <w:sz w:val="16"/>
               </w:rPr>
-              <w:t>Estanque Sur (presostatos 10/06)</w:t>
+              <w:t>Estanque Norte</w:t>
             </w:r>
           </w:p>
         </w:tc>
@@ -373,7 +373,7 @@
                 <w:color w:val="0D3B66"/>
                 <w:sz w:val="16"/>
               </w:rPr>
-              <w:t>88 → 28 m³/día</w:t>
+              <w:t>4,8 → 0 m³ desde 00:30</w:t>
             </w:r>
           </w:p>
         </w:tc>
@@ -393,7 +393,7 @@
                 <w:color w:val="0D3B66"/>
                 <w:sz w:val="16"/>
               </w:rPr>
-              <w:t>1.826</w:t>
+              <w:t>113</w:t>
             </w:r>
           </w:p>
         </w:tc>
@@ -413,7 +413,7 @@
                 <w:color w:val="0D3B66"/>
                 <w:sz w:val="16"/>
               </w:rPr>
-              <w:t>$2.555.700</w:t>
+              <w:t>$157.920</w:t>
             </w:r>
           </w:p>
         </w:tc>
@@ -439,7 +439,7 @@
                 <w:color w:val="0D3B66"/>
                 <w:sz w:val="16"/>
               </w:rPr>
-              <w:t>Estanque Norte</w:t>
+              <w:t>Pizza Hut</w:t>
             </w:r>
           </w:p>
         </w:tc>
@@ -460,7 +460,7 @@
                 <w:color w:val="0D3B66"/>
                 <w:sz w:val="16"/>
               </w:rPr>
-              <w:t>Logrado</w:t>
+              <w:t>Operativo</w:t>
             </w:r>
           </w:p>
         </w:tc>
@@ -481,7 +481,7 @@
                 <w:color w:val="0D3B66"/>
                 <w:sz w:val="16"/>
               </w:rPr>
-              <w:t>4,8 → 0 m³ desde 00:30</w:t>
+              <w:t>Ya en cero (no suma $)</w:t>
             </w:r>
           </w:p>
         </w:tc>
@@ -502,7 +502,7 @@
                 <w:color w:val="0D3B66"/>
                 <w:sz w:val="16"/>
               </w:rPr>
-              <w:t>113</w:t>
+              <w:t>—</w:t>
             </w:r>
           </w:p>
         </w:tc>
@@ -510,111 +510,6 @@
           <w:tcPr>
             <w:tcW w:type="dxa" w:w="1587"/>
             <w:shd w:fill="F4F7FA" w:val="clear"/>
-          </w:tcPr>
-          <w:p>
-            <w:pPr>
-              <w:spacing w:before="20" w:after="20"/>
-            </w:pPr>
-            <w:r/>
-            <w:r>
-              <w:rPr>
-                <w:rFonts w:ascii="Calibri" w:hAnsi="Calibri"/>
-                <w:b w:val="0"/>
-                <w:color w:val="0D3B66"/>
-                <w:sz w:val="16"/>
-              </w:rPr>
-              <w:t>$157.920</w:t>
-            </w:r>
-          </w:p>
-        </w:tc>
-      </w:tr>
-      <w:tr>
-        <w:trPr>
-          <w:cantSplit/>
-        </w:trPr>
-        <w:tc>
-          <w:tcPr>
-            <w:tcW w:type="dxa" w:w="3061"/>
-          </w:tcPr>
-          <w:p>
-            <w:pPr>
-              <w:spacing w:before="20" w:after="20"/>
-            </w:pPr>
-            <w:r/>
-            <w:r>
-              <w:rPr>
-                <w:rFonts w:ascii="Calibri" w:hAnsi="Calibri"/>
-                <w:b/>
-                <w:color w:val="0D3B66"/>
-                <w:sz w:val="16"/>
-              </w:rPr>
-              <w:t>Pizza Hut</w:t>
-            </w:r>
-          </w:p>
-        </w:tc>
-        <w:tc>
-          <w:tcPr>
-            <w:tcW w:type="dxa" w:w="1474"/>
-          </w:tcPr>
-          <w:p>
-            <w:pPr>
-              <w:spacing w:before="20" w:after="20"/>
-            </w:pPr>
-            <w:r/>
-            <w:r>
-              <w:rPr>
-                <w:rFonts w:ascii="Calibri" w:hAnsi="Calibri"/>
-                <w:b w:val="0"/>
-                <w:color w:val="0D3B66"/>
-                <w:sz w:val="16"/>
-              </w:rPr>
-              <w:t>Operativo</w:t>
-            </w:r>
-          </w:p>
-        </w:tc>
-        <w:tc>
-          <w:tcPr>
-            <w:tcW w:type="dxa" w:w="2381"/>
-          </w:tcPr>
-          <w:p>
-            <w:pPr>
-              <w:spacing w:before="20" w:after="20"/>
-            </w:pPr>
-            <w:r/>
-            <w:r>
-              <w:rPr>
-                <w:rFonts w:ascii="Calibri" w:hAnsi="Calibri"/>
-                <w:b w:val="0"/>
-                <w:color w:val="0D3B66"/>
-                <w:sz w:val="16"/>
-              </w:rPr>
-              <w:t>Ya en cero (no suma $)</w:t>
-            </w:r>
-          </w:p>
-        </w:tc>
-        <w:tc>
-          <w:tcPr>
-            <w:tcW w:type="dxa" w:w="1361"/>
-          </w:tcPr>
-          <w:p>
-            <w:pPr>
-              <w:spacing w:before="20" w:after="20"/>
-            </w:pPr>
-            <w:r/>
-            <w:r>
-              <w:rPr>
-                <w:rFonts w:ascii="Calibri" w:hAnsi="Calibri"/>
-                <w:b w:val="0"/>
-                <w:color w:val="0D3B66"/>
-                <w:sz w:val="16"/>
-              </w:rPr>
-              <w:t>—</w:t>
-            </w:r>
-          </w:p>
-        </w:tc>
-        <w:tc>
-          <w:tcPr>
-            <w:tcW w:type="dxa" w:w="1587"/>
           </w:tcPr>
           <w:p>
             <w:pPr>
@@ -640,7 +535,6 @@
         <w:tc>
           <w:tcPr>
             <w:tcW w:type="dxa" w:w="3061"/>
-            <w:shd w:fill="F4F7FA" w:val="clear"/>
           </w:tcPr>
           <w:p>
             <w:pPr>
@@ -661,7 +555,6 @@
         <w:tc>
           <w:tcPr>
             <w:tcW w:type="dxa" w:w="1474"/>
-            <w:shd w:fill="F4F7FA" w:val="clear"/>
           </w:tcPr>
           <w:p>
             <w:pPr>
@@ -682,7 +575,6 @@
         <w:tc>
           <w:tcPr>
             <w:tcW w:type="dxa" w:w="2381"/>
-            <w:shd w:fill="F4F7FA" w:val="clear"/>
           </w:tcPr>
           <w:p>
             <w:pPr>
@@ -703,7 +595,6 @@
         <w:tc>
           <w:tcPr>
             <w:tcW w:type="dxa" w:w="1361"/>
-            <w:shd w:fill="F4F7FA" w:val="clear"/>
           </w:tcPr>
           <w:p>
             <w:pPr>
@@ -724,7 +615,6 @@
         <w:tc>
           <w:tcPr>
             <w:tcW w:type="dxa" w:w="1587"/>
-            <w:shd w:fill="F4F7FA" w:val="clear"/>
           </w:tcPr>
           <w:p>
             <w:pPr>
@@ -750,6 +640,7 @@
         <w:tc>
           <w:tcPr>
             <w:tcW w:type="dxa" w:w="3061"/>
+            <w:shd w:fill="F4F7FA" w:val="clear"/>
           </w:tcPr>
           <w:p>
             <w:pPr>
@@ -764,112 +655,6 @@
                 <w:sz w:val="16"/>
               </w:rPr>
               <w:t>Quilicura Matriz</w:t>
-            </w:r>
-          </w:p>
-        </w:tc>
-        <w:tc>
-          <w:tcPr>
-            <w:tcW w:type="dxa" w:w="1474"/>
-          </w:tcPr>
-          <w:p>
-            <w:pPr>
-              <w:spacing w:before="20" w:after="20"/>
-            </w:pPr>
-            <w:r/>
-            <w:r>
-              <w:rPr>
-                <w:rFonts w:ascii="Calibri" w:hAnsi="Calibri"/>
-                <w:b w:val="0"/>
-                <w:color w:val="0D3B66"/>
-                <w:sz w:val="16"/>
-              </w:rPr>
-              <w:t>Propuesta</w:t>
-            </w:r>
-          </w:p>
-        </w:tc>
-        <w:tc>
-          <w:tcPr>
-            <w:tcW w:type="dxa" w:w="2381"/>
-          </w:tcPr>
-          <w:p>
-            <w:pPr>
-              <w:spacing w:before="20" w:after="20"/>
-            </w:pPr>
-            <w:r/>
-            <w:r>
-              <w:rPr>
-                <w:rFonts w:ascii="Calibri" w:hAnsi="Calibri"/>
-                <w:b w:val="0"/>
-                <w:color w:val="0D3B66"/>
-                <w:sz w:val="16"/>
-              </w:rPr>
-              <w:t>21,1 m³ → 0 desde 00:30</w:t>
-            </w:r>
-          </w:p>
-        </w:tc>
-        <w:tc>
-          <w:tcPr>
-            <w:tcW w:type="dxa" w:w="1361"/>
-          </w:tcPr>
-          <w:p>
-            <w:pPr>
-              <w:spacing w:before="20" w:after="20"/>
-            </w:pPr>
-            <w:r/>
-            <w:r>
-              <w:rPr>
-                <w:rFonts w:ascii="Calibri" w:hAnsi="Calibri"/>
-                <w:b w:val="0"/>
-                <w:color w:val="0D3B66"/>
-                <w:sz w:val="16"/>
-              </w:rPr>
-              <w:t>634</w:t>
-            </w:r>
-          </w:p>
-        </w:tc>
-        <w:tc>
-          <w:tcPr>
-            <w:tcW w:type="dxa" w:w="1587"/>
-          </w:tcPr>
-          <w:p>
-            <w:pPr>
-              <w:spacing w:before="20" w:after="20"/>
-            </w:pPr>
-            <w:r/>
-            <w:r>
-              <w:rPr>
-                <w:rFonts w:ascii="Calibri" w:hAnsi="Calibri"/>
-                <w:b w:val="0"/>
-                <w:color w:val="0D3B66"/>
-                <w:sz w:val="16"/>
-              </w:rPr>
-              <w:t>$887.040</w:t>
-            </w:r>
-          </w:p>
-        </w:tc>
-      </w:tr>
-      <w:tr>
-        <w:trPr>
-          <w:cantSplit/>
-        </w:trPr>
-        <w:tc>
-          <w:tcPr>
-            <w:tcW w:type="dxa" w:w="3061"/>
-            <w:shd w:fill="F4F7FA" w:val="clear"/>
-          </w:tcPr>
-          <w:p>
-            <w:pPr>
-              <w:spacing w:before="20" w:after="20"/>
-            </w:pPr>
-            <w:r/>
-            <w:r>
-              <w:rPr>
-                <w:rFonts w:ascii="Calibri" w:hAnsi="Calibri"/>
-                <w:b/>
-                <w:color w:val="0D3B66"/>
-                <w:sz w:val="16"/>
-              </w:rPr>
-              <w:t>Kennedy Bazar Gourmet</w:t>
             </w:r>
           </w:p>
         </w:tc>
@@ -911,7 +696,7 @@
                 <w:color w:val="0D3B66"/>
                 <w:sz w:val="16"/>
               </w:rPr>
-              <w:t>29,1 m³ → 0 desde 00:30</w:t>
+              <w:t>21,1 m³ → 0 desde 00:30</w:t>
             </w:r>
           </w:p>
         </w:tc>
@@ -932,7 +717,7 @@
                 <w:color w:val="0D3B66"/>
                 <w:sz w:val="16"/>
               </w:rPr>
-              <w:t>874</w:t>
+              <w:t>634</w:t>
             </w:r>
           </w:p>
         </w:tc>
@@ -953,7 +738,7 @@
                 <w:color w:val="0D3B66"/>
                 <w:sz w:val="16"/>
               </w:rPr>
-              <w:t>$1.224.300</w:t>
+              <w:t>$887.040</w:t>
             </w:r>
           </w:p>
         </w:tc>
@@ -978,7 +763,7 @@
                 <w:color w:val="0D3B66"/>
                 <w:sz w:val="16"/>
               </w:rPr>
-              <w:t>Kennedy DL Kennedy</w:t>
+              <w:t>Kennedy Bazar Gourmet</w:t>
             </w:r>
           </w:p>
         </w:tc>
@@ -1018,7 +803,7 @@
                 <w:color w:val="0D3B66"/>
                 <w:sz w:val="16"/>
               </w:rPr>
-              <w:t>0,9 m³ → 0 desde 00:30</w:t>
+              <w:t>29,1 m³ → 0 desde 00:30</w:t>
             </w:r>
           </w:p>
         </w:tc>
@@ -1038,7 +823,7 @@
                 <w:color w:val="0D3B66"/>
                 <w:sz w:val="16"/>
               </w:rPr>
-              <w:t>27</w:t>
+              <w:t>874</w:t>
             </w:r>
           </w:p>
         </w:tc>
@@ -1058,7 +843,7 @@
                 <w:color w:val="0D3B66"/>
                 <w:sz w:val="16"/>
               </w:rPr>
-              <w:t>$37.800</w:t>
+              <w:t>$1.224.300</w:t>
             </w:r>
           </w:p>
         </w:tc>
@@ -1084,7 +869,7 @@
                 <w:color w:val="0D3B66"/>
                 <w:sz w:val="16"/>
               </w:rPr>
-              <w:t>El Bosque Matriz 1° piso</w:t>
+              <w:t>Kennedy Andén 3-4 Matriz</w:t>
             </w:r>
           </w:p>
         </w:tc>
@@ -1126,7 +911,7 @@
                 <w:color w:val="0D3B66"/>
                 <w:sz w:val="16"/>
               </w:rPr>
-              <w:t>6,8 m³ → 0 desde 00:30</w:t>
+              <w:t>6 m³ → 0 desde 00:30</w:t>
             </w:r>
           </w:p>
         </w:tc>
@@ -1147,7 +932,7 @@
                 <w:color w:val="0D3B66"/>
                 <w:sz w:val="16"/>
               </w:rPr>
-              <w:t>205</w:t>
+              <w:t>178</w:t>
             </w:r>
           </w:p>
         </w:tc>
@@ -1168,7 +953,7 @@
                 <w:color w:val="0D3B66"/>
                 <w:sz w:val="16"/>
               </w:rPr>
-              <w:t>$286.860</w:t>
+              <w:t>$249.900</w:t>
             </w:r>
           </w:p>
         </w:tc>
@@ -1193,7 +978,7 @@
                 <w:color w:val="0D3B66"/>
                 <w:sz w:val="16"/>
               </w:rPr>
-              <w:t>Maipú Falabella</w:t>
+              <w:t>El Bosque Matriz 1° piso</w:t>
             </w:r>
           </w:p>
         </w:tc>
@@ -1233,6 +1018,114 @@
                 <w:color w:val="0D3B66"/>
                 <w:sz w:val="16"/>
               </w:rPr>
+              <w:t>6,8 m³ → 0 desde 00:30</w:t>
+            </w:r>
+          </w:p>
+        </w:tc>
+        <w:tc>
+          <w:tcPr>
+            <w:tcW w:type="dxa" w:w="1361"/>
+          </w:tcPr>
+          <w:p>
+            <w:pPr>
+              <w:spacing w:before="20" w:after="20"/>
+            </w:pPr>
+            <w:r/>
+            <w:r>
+              <w:rPr>
+                <w:rFonts w:ascii="Calibri" w:hAnsi="Calibri"/>
+                <w:b w:val="0"/>
+                <w:color w:val="0D3B66"/>
+                <w:sz w:val="16"/>
+              </w:rPr>
+              <w:t>205</w:t>
+            </w:r>
+          </w:p>
+        </w:tc>
+        <w:tc>
+          <w:tcPr>
+            <w:tcW w:type="dxa" w:w="1587"/>
+          </w:tcPr>
+          <w:p>
+            <w:pPr>
+              <w:spacing w:before="20" w:after="20"/>
+            </w:pPr>
+            <w:r/>
+            <w:r>
+              <w:rPr>
+                <w:rFonts w:ascii="Calibri" w:hAnsi="Calibri"/>
+                <w:b w:val="0"/>
+                <w:color w:val="0D3B66"/>
+                <w:sz w:val="16"/>
+              </w:rPr>
+              <w:t>$286.860</w:t>
+            </w:r>
+          </w:p>
+        </w:tc>
+      </w:tr>
+      <w:tr>
+        <w:trPr>
+          <w:cantSplit/>
+        </w:trPr>
+        <w:tc>
+          <w:tcPr>
+            <w:tcW w:type="dxa" w:w="3061"/>
+            <w:shd w:fill="F4F7FA" w:val="clear"/>
+          </w:tcPr>
+          <w:p>
+            <w:pPr>
+              <w:spacing w:before="20" w:after="20"/>
+            </w:pPr>
+            <w:r/>
+            <w:r>
+              <w:rPr>
+                <w:rFonts w:ascii="Calibri" w:hAnsi="Calibri"/>
+                <w:b/>
+                <w:color w:val="0D3B66"/>
+                <w:sz w:val="16"/>
+              </w:rPr>
+              <w:t>Maipú Falabella</w:t>
+            </w:r>
+          </w:p>
+        </w:tc>
+        <w:tc>
+          <w:tcPr>
+            <w:tcW w:type="dxa" w:w="1474"/>
+            <w:shd w:fill="F4F7FA" w:val="clear"/>
+          </w:tcPr>
+          <w:p>
+            <w:pPr>
+              <w:spacing w:before="20" w:after="20"/>
+            </w:pPr>
+            <w:r/>
+            <w:r>
+              <w:rPr>
+                <w:rFonts w:ascii="Calibri" w:hAnsi="Calibri"/>
+                <w:b w:val="0"/>
+                <w:color w:val="0D3B66"/>
+                <w:sz w:val="16"/>
+              </w:rPr>
+              <w:t>Propuesta</w:t>
+            </w:r>
+          </w:p>
+        </w:tc>
+        <w:tc>
+          <w:tcPr>
+            <w:tcW w:type="dxa" w:w="2381"/>
+            <w:shd w:fill="F4F7FA" w:val="clear"/>
+          </w:tcPr>
+          <w:p>
+            <w:pPr>
+              <w:spacing w:before="20" w:after="20"/>
+            </w:pPr>
+            <w:r/>
+            <w:r>
+              <w:rPr>
+                <w:rFonts w:ascii="Calibri" w:hAnsi="Calibri"/>
+                <w:b w:val="0"/>
+                <w:color w:val="0D3B66"/>
+                <w:sz w:val="16"/>
+              </w:rPr>
               <w:t>8,3 m³ → 0 desde 00:30</w:t>
             </w:r>
           </w:p>
@@ -1240,6 +1133,7 @@
         <w:tc>
           <w:tcPr>
             <w:tcW w:type="dxa" w:w="1361"/>
+            <w:shd w:fill="F4F7FA" w:val="clear"/>
           </w:tcPr>
           <w:p>
             <w:pPr>
@@ -1260,6 +1154,7 @@
         <w:tc>
           <w:tcPr>
             <w:tcW w:type="dxa" w:w="1587"/>
+            <w:shd w:fill="F4F7FA" w:val="clear"/>
           </w:tcPr>
           <w:p>
             <w:pPr>
@@ -1274,6 +1169,116 @@
                 <w:sz w:val="16"/>
               </w:rPr>
               <w:t>$348.390</w:t>
+            </w:r>
+          </w:p>
+        </w:tc>
+      </w:tr>
+      <w:tr>
+        <w:trPr>
+          <w:cantSplit/>
+        </w:trPr>
+        <w:tc>
+          <w:tcPr>
+            <w:tcW w:type="dxa" w:w="3061"/>
+            <w:shd w:fill="D9E1F2" w:val="clear"/>
+          </w:tcPr>
+          <w:p>
+            <w:pPr>
+              <w:spacing w:before="20" w:after="20"/>
+            </w:pPr>
+            <w:r/>
+            <w:r>
+              <w:rPr>
+                <w:rFonts w:ascii="Calibri" w:hAnsi="Calibri"/>
+                <w:b/>
+                <w:color w:val="0D3B66"/>
+                <w:sz w:val="16"/>
+              </w:rPr>
+              <w:t>Total logrado (control WES)</w:t>
+            </w:r>
+          </w:p>
+        </w:tc>
+        <w:tc>
+          <w:tcPr>
+            <w:tcW w:type="dxa" w:w="1474"/>
+            <w:shd w:fill="D9E1F2" w:val="clear"/>
+          </w:tcPr>
+          <w:p>
+            <w:pPr>
+              <w:spacing w:before="20" w:after="20"/>
+            </w:pPr>
+            <w:r/>
+            <w:r>
+              <w:rPr>
+                <w:rFonts w:ascii="Calibri" w:hAnsi="Calibri"/>
+                <w:b/>
+                <w:color w:val="0D3B66"/>
+                <w:sz w:val="16"/>
+              </w:rPr>
+              <w:t>Operativo</w:t>
+            </w:r>
+          </w:p>
+        </w:tc>
+        <w:tc>
+          <w:tcPr>
+            <w:tcW w:type="dxa" w:w="2381"/>
+            <w:shd w:fill="D9E1F2" w:val="clear"/>
+          </w:tcPr>
+          <w:p>
+            <w:pPr>
+              <w:spacing w:before="20" w:after="20"/>
+            </w:pPr>
+            <w:r/>
+            <w:r>
+              <w:rPr>
+                <w:rFonts w:ascii="Calibri" w:hAnsi="Calibri"/>
+                <w:b/>
+                <w:color w:val="0D3B66"/>
+                <w:sz w:val="16"/>
+              </w:rPr>
+              <w:t>Norte + SI500. Sur no entra</w:t>
+            </w:r>
+          </w:p>
+        </w:tc>
+        <w:tc>
+          <w:tcPr>
+            <w:tcW w:type="dxa" w:w="1361"/>
+            <w:shd w:fill="D9E1F2" w:val="clear"/>
+          </w:tcPr>
+          <w:p>
+            <w:pPr>
+              <w:spacing w:before="20" w:after="20"/>
+            </w:pPr>
+            <w:r/>
+            <w:r>
+              <w:rPr>
+                <w:rFonts w:ascii="Calibri" w:hAnsi="Calibri"/>
+                <w:b/>
+                <w:color w:val="0D3B66"/>
+                <w:sz w:val="16"/>
+              </w:rPr>
+              <w:t>999</w:t>
+            </w:r>
+          </w:p>
+        </w:tc>
+        <w:tc>
+          <w:tcPr>
+            <w:tcW w:type="dxa" w:w="1587"/>
+            <w:shd w:fill="D9E1F2" w:val="clear"/>
+          </w:tcPr>
+          <w:p>
+            <w:pPr>
+              <w:spacing w:before="20" w:after="20"/>
+            </w:pPr>
+            <w:r/>
+            <w:r>
+              <w:rPr>
+                <w:rFonts w:ascii="Calibri" w:hAnsi="Calibri"/>
+                <w:b/>
+                <w:color w:val="0D3B66"/>
+                <w:sz w:val="16"/>
+              </w:rPr>
+              <w:t>$1.399.020</w:t>
             </w:r>
           </w:p>
         </w:tc>
@@ -1300,7 +1305,7 @@
                 <w:color w:val="0D3B66"/>
                 <w:sz w:val="16"/>
               </w:rPr>
-              <w:t>Total logrado</w:t>
+              <w:t>Total si se aprueban las 5</w:t>
             </w:r>
           </w:p>
         </w:tc>
@@ -1322,7 +1327,7 @@
                 <w:color w:val="0D3B66"/>
                 <w:sz w:val="16"/>
               </w:rPr>
-              <w:t>Operativo</w:t>
+              <w:t>Logrado + propuesto</w:t>
             </w:r>
           </w:p>
         </w:tc>
@@ -1344,7 +1349,7 @@
                 <w:color w:val="0D3B66"/>
                 <w:sz w:val="16"/>
               </w:rPr>
-              <w:t>MAE + Buenaventura</w:t>
+              <w:t>MAQ + Bazar + Andén 3-4 + AEB 1° piso + Falabella</w:t>
             </w:r>
           </w:p>
         </w:tc>
@@ -1366,7 +1371,7 @@
                 <w:color w:val="0D3B66"/>
                 <w:sz w:val="16"/>
               </w:rPr>
-              <w:t>2.825</w:t>
+              <w:t>3.140</w:t>
             </w:r>
           </w:p>
         </w:tc>
@@ -1388,117 +1393,7 @@
                 <w:color w:val="0D3B66"/>
                 <w:sz w:val="16"/>
               </w:rPr>
-              <w:t>$3.954.720</w:t>
-            </w:r>
-          </w:p>
-        </w:tc>
-      </w:tr>
-      <w:tr>
-        <w:trPr>
-          <w:cantSplit/>
-        </w:trPr>
-        <w:tc>
-          <w:tcPr>
-            <w:tcW w:type="dxa" w:w="3061"/>
-            <w:shd w:fill="D9E1F2" w:val="clear"/>
-          </w:tcPr>
-          <w:p>
-            <w:pPr>
-              <w:spacing w:before="20" w:after="20"/>
-            </w:pPr>
-            <w:r/>
-            <w:r>
-              <w:rPr>
-                <w:rFonts w:ascii="Calibri" w:hAnsi="Calibri"/>
-                <w:b/>
-                <w:color w:val="0D3B66"/>
-                <w:sz w:val="16"/>
-              </w:rPr>
-              <w:t>Total si se aprueban las 5</w:t>
-            </w:r>
-          </w:p>
-        </w:tc>
-        <w:tc>
-          <w:tcPr>
-            <w:tcW w:type="dxa" w:w="1474"/>
-            <w:shd w:fill="D9E1F2" w:val="clear"/>
-          </w:tcPr>
-          <w:p>
-            <w:pPr>
-              <w:spacing w:before="20" w:after="20"/>
-            </w:pPr>
-            <w:r/>
-            <w:r>
-              <w:rPr>
-                <w:rFonts w:ascii="Calibri" w:hAnsi="Calibri"/>
-                <w:b/>
-                <w:color w:val="0D3B66"/>
-                <w:sz w:val="16"/>
-              </w:rPr>
-              <w:t>Logrado + propuesto</w:t>
-            </w:r>
-          </w:p>
-        </w:tc>
-        <w:tc>
-          <w:tcPr>
-            <w:tcW w:type="dxa" w:w="2381"/>
-            <w:shd w:fill="D9E1F2" w:val="clear"/>
-          </w:tcPr>
-          <w:p>
-            <w:pPr>
-              <w:spacing w:before="20" w:after="20"/>
-            </w:pPr>
-            <w:r/>
-            <w:r>
-              <w:rPr>
-                <w:rFonts w:ascii="Calibri" w:hAnsi="Calibri"/>
-                <w:b/>
-                <w:color w:val="0D3B66"/>
-                <w:sz w:val="16"/>
-              </w:rPr>
-              <w:t>MAQ + Bazar + DL Kennedy + AEB 1° piso + Falabella</w:t>
-            </w:r>
-          </w:p>
-        </w:tc>
-        <w:tc>
-          <w:tcPr>
-            <w:tcW w:type="dxa" w:w="1361"/>
-            <w:shd w:fill="D9E1F2" w:val="clear"/>
-          </w:tcPr>
-          <w:p>
-            <w:pPr>
-              <w:spacing w:before="20" w:after="20"/>
-            </w:pPr>
-            <w:r/>
-            <w:r>
-              <w:rPr>
-                <w:rFonts w:ascii="Calibri" w:hAnsi="Calibri"/>
-                <w:b/>
-                <w:color w:val="0D3B66"/>
-                <w:sz w:val="16"/>
-              </w:rPr>
-              <w:t>4.814</w:t>
-            </w:r>
-          </w:p>
-        </w:tc>
-        <w:tc>
-          <w:tcPr>
-            <w:tcW w:type="dxa" w:w="1587"/>
-            <w:shd w:fill="D9E1F2" w:val="clear"/>
-          </w:tcPr>
-          <w:p>
-            <w:pPr>
-              <w:spacing w:before="20" w:after="20"/>
-            </w:pPr>
-            <w:r/>
-            <w:r>
-              <w:rPr>
-                <w:rFonts w:ascii="Calibri" w:hAnsi="Calibri"/>
-                <w:b/>
-                <w:color w:val="0D3B66"/>
-                <w:sz w:val="16"/>
-              </w:rPr>
-              <w:t>$6.739.110</w:t>
+              <w:t>$4.395.510</w:t>
             </w:r>
           </w:p>
         </w:tc>
@@ -1517,14 +1412,14 @@
           <w:color w:val="505050"/>
           <w:sz w:val="20"/>
         </w:rPr>
-        <w:t>Acumulado ya operativo a 08/09: 7.143 m³ ($10.000.130). El $ es la noche desde las 00:30 a cero (00:00–00:30 queda en el medidor y no se resta del ahorro).</w:t>
+        <w:t>Acumulado ya operativo a 08/09: 1.727 m³ ($2.418.220). El $ es la noche desde las 00:30 a cero (00:00–00:30 queda en el medidor y no se resta del ahorro). Estanque Sur no está en esta suma: no es un control de WES.</w:t>
       </w:r>
     </w:p>
     <w:p>
       <w:r>
         <w:drawing>
           <wp:inline xmlns:a="http://schemas.openxmlformats.org/drawingml/2006/main" xmlns:pic="http://schemas.openxmlformats.org/drawingml/2006/picture">
-            <wp:extent cx="5760720" cy="3165231"/>
+            <wp:extent cx="5760720" cy="2329891"/>
             <wp:docPr id="1" name="Picture 1"/>
             <wp:cNvGraphicFramePr>
               <a:graphicFrameLocks noChangeAspect="1"/>
@@ -1533,7 +1428,7 @@
               <a:graphicData uri="http://schemas.openxmlformats.org/drawingml/2006/picture">
                 <pic:pic>
                   <pic:nvPicPr>
-                    <pic:cNvPr id="0" name="ahorro_mensual_barras.png"/>
+                    <pic:cNvPr id="0" name="futuros_puntos_control.png"/>
                     <pic:cNvPicPr/>
                   </pic:nvPicPr>
                   <pic:blipFill>
@@ -1545,7 +1440,7 @@
                   <pic:spPr>
                     <a:xfrm>
                       <a:off x="0" y="0"/>
-                      <a:ext cx="5760720" cy="3165231"/>
+                      <a:ext cx="5760720" cy="2329891"/>
                     </a:xfrm>
                     <a:prstGeom prst="rect"/>
                   </pic:spPr>
@@ -1567,7 +1462,7 @@
           <w:color w:val="505050"/>
           <w:sz w:val="18"/>
         </w:rPr>
-        <w:t>Verde = ya operativo (noche a cero desde las 00:30). Dorado = propuesta, misma ventana a cero.</w:t>
+        <w:t>Dorado = futuros puntos de control (misma ventana 00:30 → cero). Estanque Sur no entra.</w:t>
       </w:r>
     </w:p>
     <w:p>
@@ -2050,115 +1945,6 @@
           <w:tcPr>
             <w:tcW w:type="dxa" w:w="2608"/>
             <w:shd w:fill="F4F7FA" w:val="clear"/>
-          </w:tcPr>
-          <w:p>
-            <w:pPr>
-              <w:spacing w:before="20" w:after="20"/>
-            </w:pPr>
-            <w:r/>
-            <w:r>
-              <w:rPr>
-                <w:rFonts w:ascii="Calibri" w:hAnsi="Calibri"/>
-                <w:b/>
-                <w:color w:val="0D3B66"/>
-                <w:sz w:val="16"/>
-              </w:rPr>
-              <w:t>MAE Estanque Sur</w:t>
-            </w:r>
-          </w:p>
-        </w:tc>
-        <w:tc>
-          <w:tcPr>
-            <w:tcW w:type="dxa" w:w="907"/>
-            <w:shd w:fill="F4F7FA" w:val="clear"/>
-          </w:tcPr>
-          <w:p>
-            <w:pPr>
-              <w:spacing w:before="20" w:after="20"/>
-            </w:pPr>
-            <w:r/>
-            <w:r>
-              <w:rPr>
-                <w:rFonts w:ascii="Calibri" w:hAnsi="Calibri"/>
-                <w:b w:val="0"/>
-                <w:color w:val="0D3B66"/>
-                <w:sz w:val="16"/>
-              </w:rPr>
-              <w:t>10/06</w:t>
-            </w:r>
-          </w:p>
-        </w:tc>
-        <w:tc>
-          <w:tcPr>
-            <w:tcW w:type="dxa" w:w="3515"/>
-            <w:shd w:fill="F4F7FA" w:val="clear"/>
-          </w:tcPr>
-          <w:p>
-            <w:pPr>
-              <w:spacing w:before="20" w:after="20"/>
-            </w:pPr>
-            <w:r/>
-            <w:r>
-              <w:rPr>
-                <w:rFonts w:ascii="Calibri" w:hAnsi="Calibri"/>
-                <w:b w:val="0"/>
-                <w:color w:val="0D3B66"/>
-                <w:sz w:val="16"/>
-              </w:rPr>
-              <w:t>No es on/off: presostatos. Día 88 → 28 m³</w:t>
-            </w:r>
-          </w:p>
-        </w:tc>
-        <w:tc>
-          <w:tcPr>
-            <w:tcW w:type="dxa" w:w="1361"/>
-            <w:shd w:fill="F4F7FA" w:val="clear"/>
-          </w:tcPr>
-          <w:p>
-            <w:pPr>
-              <w:spacing w:before="20" w:after="20"/>
-            </w:pPr>
-            <w:r/>
-            <w:r>
-              <w:rPr>
-                <w:rFonts w:ascii="Calibri" w:hAnsi="Calibri"/>
-                <w:b w:val="0"/>
-                <w:color w:val="0D3B66"/>
-                <w:sz w:val="16"/>
-              </w:rPr>
-              <w:t>1.826</w:t>
-            </w:r>
-          </w:p>
-        </w:tc>
-        <w:tc>
-          <w:tcPr>
-            <w:tcW w:type="dxa" w:w="1474"/>
-            <w:shd w:fill="F4F7FA" w:val="clear"/>
-          </w:tcPr>
-          <w:p>
-            <w:pPr>
-              <w:spacing w:before="20" w:after="20"/>
-            </w:pPr>
-            <w:r/>
-            <w:r>
-              <w:rPr>
-                <w:rFonts w:ascii="Calibri" w:hAnsi="Calibri"/>
-                <w:b w:val="0"/>
-                <w:color w:val="0D3B66"/>
-                <w:sz w:val="16"/>
-              </w:rPr>
-              <w:t>$2.555.700</w:t>
-            </w:r>
-          </w:p>
-        </w:tc>
-      </w:tr>
-      <w:tr>
-        <w:trPr>
-          <w:cantSplit/>
-        </w:trPr>
-        <w:tc>
-          <w:tcPr>
-            <w:tcW w:type="dxa" w:w="2608"/>
             <w:shd w:fill="D9E1F2" w:val="clear"/>
           </w:tcPr>
           <w:p>
@@ -2180,6 +1966,7 @@
         <w:tc>
           <w:tcPr>
             <w:tcW w:type="dxa" w:w="907"/>
+            <w:shd w:fill="F4F7FA" w:val="clear"/>
             <w:shd w:fill="D9E1F2" w:val="clear"/>
           </w:tcPr>
           <w:p>
@@ -2200,6 +1987,7 @@
         <w:tc>
           <w:tcPr>
             <w:tcW w:type="dxa" w:w="3515"/>
+            <w:shd w:fill="F4F7FA" w:val="clear"/>
             <w:shd w:fill="D9E1F2" w:val="clear"/>
           </w:tcPr>
           <w:p>
@@ -2214,13 +2002,14 @@
                 <w:color w:val="0D3B66"/>
                 <w:sz w:val="16"/>
               </w:rPr>
-              <w:t>MAE + Buenaventura</w:t>
+              <w:t>Norte + SI500. Sur no entra (no es control WES)</w:t>
             </w:r>
           </w:p>
         </w:tc>
         <w:tc>
           <w:tcPr>
             <w:tcW w:type="dxa" w:w="1361"/>
+            <w:shd w:fill="F4F7FA" w:val="clear"/>
             <w:shd w:fill="D9E1F2" w:val="clear"/>
           </w:tcPr>
           <w:p>
@@ -2235,13 +2024,14 @@
                 <w:color w:val="0D3B66"/>
                 <w:sz w:val="16"/>
               </w:rPr>
-              <w:t>2.825</w:t>
+              <w:t>999</w:t>
             </w:r>
           </w:p>
         </w:tc>
         <w:tc>
           <w:tcPr>
             <w:tcW w:type="dxa" w:w="1474"/>
+            <w:shd w:fill="F4F7FA" w:val="clear"/>
             <w:shd w:fill="D9E1F2" w:val="clear"/>
           </w:tcPr>
           <w:p>
@@ -2256,7 +2046,7 @@
                 <w:color w:val="0D3B66"/>
                 <w:sz w:val="16"/>
               </w:rPr>
-              <w:t>$3.954.720</w:t>
+              <w:t>$1.399.020</w:t>
             </w:r>
           </w:p>
         </w:tc>
@@ -2650,7 +2440,7 @@
                 <w:color w:val="0D3B66"/>
                 <w:sz w:val="16"/>
               </w:rPr>
-              <w:t>PAK DL Kennedy</w:t>
+              <w:t>PAK Andén 3-4 Matriz</w:t>
             </w:r>
           </w:p>
         </w:tc>
@@ -2670,7 +2460,7 @@
                 <w:color w:val="0D3B66"/>
                 <w:sz w:val="16"/>
               </w:rPr>
-              <w:t>On/off 00:30 (no las Sandías)</w:t>
+              <w:t>On/off 00:30 (no DL Kennedy)</w:t>
             </w:r>
           </w:p>
         </w:tc>
@@ -2690,7 +2480,7 @@
                 <w:color w:val="0D3B66"/>
                 <w:sz w:val="16"/>
               </w:rPr>
-              <w:t>0,9 m³ → 0  ·  umbral 20 m³/día</w:t>
+              <w:t>6 m³ → 0  ·  umbral 125 m³/día</w:t>
             </w:r>
           </w:p>
         </w:tc>
@@ -2710,7 +2500,7 @@
                 <w:color w:val="0D3B66"/>
                 <w:sz w:val="16"/>
               </w:rPr>
-              <w:t>27</w:t>
+              <w:t>178</w:t>
             </w:r>
           </w:p>
         </w:tc>
@@ -2730,7 +2520,7 @@
                 <w:color w:val="0D3B66"/>
                 <w:sz w:val="16"/>
               </w:rPr>
-              <w:t>$37.800</w:t>
+              <w:t>$249.900</w:t>
             </w:r>
           </w:p>
         </w:tc>
@@ -3016,7 +2806,7 @@
                 <w:color w:val="0D3B66"/>
                 <w:sz w:val="16"/>
               </w:rPr>
-              <w:t>MAQ + Bazar + DL Kennedy + AEB 1° piso + Falabella. CUR: noche chica, sin on/off</w:t>
+              <w:t>MAQ + Bazar + Andén 3-4 + AEB 1° piso + Falabella. CUR: noche chica, sin on/off</w:t>
             </w:r>
           </w:p>
         </w:tc>
@@ -3038,7 +2828,7 @@
                 <w:color w:val="0D3B66"/>
                 <w:sz w:val="16"/>
               </w:rPr>
-              <w:t>4.814</w:t>
+              <w:t>3.140</w:t>
             </w:r>
           </w:p>
         </w:tc>
@@ -3060,7 +2850,7 @@
                 <w:color w:val="0D3B66"/>
                 <w:sz w:val="16"/>
               </w:rPr>
-              <w:t>$6.739.110</w:t>
+              <w:t>$4.395.510</w:t>
             </w:r>
           </w:p>
         </w:tc>
@@ -3076,7 +2866,7 @@
           <w:rFonts w:ascii="Calibri" w:hAnsi="Calibri"/>
           <w:color w:val="0D3B66"/>
         </w:rPr>
-        <w:t>3. Mall Arauco Estación (MAE) — ahorro ya logrado</w:t>
+        <w:t>3. Mall Arauco Estación (MAE) — control WES y contexto Estanque Sur</w:t>
       </w:r>
     </w:p>
     <w:p>
@@ -3091,7 +2881,7 @@
           <w:color w:val="0D3B66"/>
           <w:sz w:val="22"/>
         </w:rPr>
-        <w:t>Estanque Sur es el caso más limpio para la reunión: el 10/06 se repararon los presostatos. La mediana diaria pasó de 88 a 28 m³/día (−61 m³/día). A 30 días son 1.826 m³/mes ($2.555.700). Acumulado desde el 11/06 hasta 08/09: 5.416 m³ ($7.581.910). No es un modelo: es el mall después de la reparación.</w:t>
+        <w:t>Estanque Norte (desde el 05/08): el corte se activa a las 00:30. De 01:00 a 05:00 el consumo quedó en cero (de 3,2 a 0,1 m³). La noche completa desde las 00:30 era 4,8 m³: eso es 3,8 m³/noche = 113 m³/mes ($157.920). Lo que aparece entre 00:00 y 00:30 (1,1 m³) no es noche y no se resta del ahorro.</w:t>
       </w:r>
     </w:p>
     <w:p>
@@ -3107,7 +2897,7 @@
               <a:graphicData uri="http://schemas.openxmlformats.org/drawingml/2006/picture">
                 <pic:pic>
                   <pic:nvPicPr>
-                    <pic:cNvPr id="0" name="mae_sur_antes_despues.png"/>
+                    <pic:cNvPr id="0" name="mae_norte_antes_despues.png"/>
                     <pic:cNvPicPr/>
                   </pic:nvPicPr>
                   <pic:blipFill>
@@ -3141,7 +2931,7 @@
           <w:color w:val="505050"/>
           <w:sz w:val="18"/>
         </w:rPr>
-        <w:t>Gris = antes de los presostatos (fuga día y noche). Dorado = después del 11/06: de madrugada casi desaparece y de día baja a menos de la mitad.</w:t>
+        <w:t>Gris = noche con caudal. Dorado = con on/off: de 01:00 a 05:00 va a cero. Lo de 00:00–00:30 no es noche.</w:t>
       </w:r>
     </w:p>
     <w:p>
@@ -3156,7 +2946,7 @@
           <w:color w:val="0D3B66"/>
           <w:sz w:val="22"/>
         </w:rPr>
-        <w:t>Estanque Norte (desde el 05/08): el corte se activa a las 00:30. De 01:00 a 05:00 el consumo quedó en cero (de 3,2 a 0,1 m³). La noche completa desde las 00:30 era 4,8 m³: eso es 3,8 m³/noche = 113 m³/mes ($157.920). Lo que aparece entre 00:00 y 00:30 (1,1 m³) no es noche y no se resta del ahorro.</w:t>
+        <w:t>Estanque Sur no es un control de WES y no entra en la sumatoria. El 10/06, al cambiar la ubicación del punto, se mejoró el presostato. La mediana diaria pasó de 88 a 28 m³/día (−61 m³/día). El gráfico muestra ese antes/después: de madrugada el caudal casi desaparece y de día baja a menos de la mitad. Es una mejora operativa del recinto, no un on/off de WES.</w:t>
       </w:r>
     </w:p>
     <w:p>
@@ -3172,7 +2962,7 @@
               <a:graphicData uri="http://schemas.openxmlformats.org/drawingml/2006/picture">
                 <pic:pic>
                   <pic:nvPicPr>
-                    <pic:cNvPr id="0" name="mae_norte_antes_despues.png"/>
+                    <pic:cNvPr id="0" name="mae_sur_antes_despues.png"/>
                     <pic:cNvPicPr/>
                   </pic:nvPicPr>
                   <pic:blipFill>
@@ -3206,7 +2996,7 @@
           <w:color w:val="505050"/>
           <w:sz w:val="18"/>
         </w:rPr>
-        <w:t>Gris = noche con caudal. Dorado = con on/off: de 01:00 a 05:00 va a cero. Lo de 00:00–00:30 no es noche.</w:t>
+        <w:t>Contexto Estanque Sur: gris = antes del 10/06; dorado = después de mejorar el presostato al relocalizar. No se suma al $ de WES.</w:t>
       </w:r>
     </w:p>
     <w:p>
@@ -3427,7 +3217,7 @@
           <w:color w:val="0D3B66"/>
           <w:sz w:val="22"/>
         </w:rPr>
-        <w:t>La cadena no se suma a la cabecera del mall: Sandía Antigua y Sandía Nueva alimentan Distrito de Lujo; de ahí sale a Bazar Gourmet y DL Kennedy. El control es cortar de noche en esos dos ramales, no apagar las Sandías (dejarían sin agua toda la cadena).</w:t>
+        <w:t>La cadena DL no se suma a la cabecera del mall: Sandía Antigua y Sandía Nueva alimentan Distrito de Lujo; de ahí sale a Bazar Gourmet y DL Kennedy. El control de esa cadena es cortar de noche en Bazar Gourmet, no apagar las Sandías (dejarían sin agua toda la cadena) ni DL Kennedy (noche chica; no se propone).</w:t>
       </w:r>
     </w:p>
     <w:p>
@@ -3442,7 +3232,7 @@
           <w:color w:val="0D3B66"/>
           <w:sz w:val="22"/>
         </w:rPr>
-        <w:t>Bazar Gourmet: noche 29,1 m³ → 0 = 874 m³/mes ($1.224.300). DL Kennedy: noche 0,9 m³ → 0 = 27 m³/mes ($37.800). Mismo corte a las 00:30 en los dos. Tampoco se resta el tramo 00:00–00:30.</w:t>
+        <w:t>Bazar Gourmet: noche 29,1 m³ → 0 = 874 m³/mes ($1.224.300). Andén 3-4 Matriz Principal (000025-20): es cabecera, alimenta Locales Gast. y Restaurante del Andén. Noche 6 m³ → 0 = 178 m³/mes ($249.900). Mismo corte a las 00:30 en los dos. Tampoco se resta el tramo 00:00–00:30.</w:t>
       </w:r>
     </w:p>
     <w:p>
@@ -3457,7 +3247,7 @@
           <w:color w:val="0D3B66"/>
           <w:sz w:val="22"/>
         </w:rPr>
-        <w:t>Umbrales 24 h: Distrito de Lujo 390 · Bazar Gourmet 250 · DL Kennedy 20 m³/día.</w:t>
+        <w:t>Umbrales 24 h: Distrito de Lujo 390 · Bazar Gourmet 250 · Andén 3-4 Matriz 125 m³/día.</w:t>
       </w:r>
     </w:p>
     <w:p>
@@ -3678,7 +3468,7 @@
           <w:color w:val="0D3B66"/>
           <w:sz w:val="22"/>
         </w:rPr>
-        <w:t>Se pide aprobar el mismo corte (se arma a las 00:30; 01:00–05:00 a cero) en (a) Matriz Principal de Quilicura, (b) Bazar Gourmet y (c) DL Kennedy de Kennedy, (d) Matriz 1° piso de El Bosque y (e) Falabella de Maipú. Con eso se proyectan 1.989 m³/mes adicionales ($2.784.390). Junto con el corte, activar los umbrales 24 h de este informe.</w:t>
+        <w:t>Se pide aprobar el mismo corte (se arma a las 00:30; 01:00–05:00 a cero) en (a) Matriz Principal de Quilicura, (b) Bazar Gourmet y (c) Andén 3-4 Matriz de Kennedy, (d) Matriz 1° piso de El Bosque y (e) Falabella de Maipú. Con eso se proyectan 2.140 m³/mes adicionales ($2.996.490). Junto con el corte, activar los umbrales 24 h de este informe.</w:t>
       </w:r>
     </w:p>
     <w:p>
@@ -3693,7 +3483,7 @@
           <w:color w:val="0D3B66"/>
           <w:sz w:val="22"/>
         </w:rPr>
-        <w:t>En Maipú, además del on/off de Falabella, se pide validar la propuesta enviada a Don Miguel (relocalizar Arrow e instalar el punto 6 en Pasillo 2) y habilitar la gatera al entretecho para programar la faena. No se pide corte en las Sandías de Kennedy ni on/off en Curauma.</w:t>
+        <w:t>En Maipú, además del on/off de Falabella, se pide validar la propuesta enviada a Don Miguel (relocalizar Arrow e instalar el punto 6 en Pasillo 2) y habilitar la gatera al entretecho para programar la faena. No se pide corte en las Sandías de Kennedy, ni en DL Kennedy, ni on/off en Curauma.</w:t>
       </w:r>
     </w:p>
     <w:p>
@@ -3720,7 +3510,7 @@
           <w:color w:val="0D3B66"/>
           <w:sz w:val="22"/>
         </w:rPr>
-        <w:t>¿Cuánto se demuestra ya? 2.825 m³/mes ($3.954.720), MAE + Buenaventura. Casi todo es Estanque Sur + SI500 a cero en 01:00–05:00. Acumulado a 08/09: 7.143 m³ ($10.000.130).</w:t>
+        <w:t>¿Cuánto se demuestra ya? 999 m³/mes ($1.399.020), control WES en Estanque Norte + SI500. Estanque Sur no entra (presostato al relocalizar). Acumulado a 08/09: 1.727 m³ ($2.418.220).</w:t>
       </w:r>
     </w:p>
     <w:p>
@@ -3735,7 +3525,7 @@
           <w:color w:val="0D3B66"/>
           <w:sz w:val="22"/>
         </w:rPr>
-        <w:t>¿Cuánto más si aprueban las 5? 1.989 m³/mes ($2.784.390): Quilicura, Bazar Gourmet, DL Kennedy, El Bosque 1° piso y Falabella Maipú, pasando esa misma ventana a cero. Suma total 4.814 m³/mes ($6.739.110).</w:t>
+        <w:t>¿Cuánto más si aprueban las 5? 2.140 m³/mes ($2.996.490): Quilicura, Bazar Gourmet, Andén 3-4 Matriz, El Bosque 1° piso y Falabella Maipú, pasando esa misma ventana a cero. Suma total 3.140 m³/mes ($4.395.510).</w:t>
       </w:r>
     </w:p>
     <w:p>
@@ -3780,7 +3570,7 @@
           <w:color w:val="0D3B66"/>
           <w:sz w:val="22"/>
         </w:rPr>
-        <w:t>¿Por qué Kennedy? Hay que cortar en Bazar Gourmet y en DL Kennedy (los dos ramales que salen de DL), no en las Sandías.</w:t>
+        <w:t>¿Por qué Kennedy? Hay que cortar en Bazar Gourmet (cadena DL, no las Sandías) y en Andén 3-4 Matriz (cabecera del Andén). DL Kennedy no se propone.</w:t>
       </w:r>
     </w:p>
     <w:p>

</xml_diff>

<commit_message>
fix(pa): barras horizontales de propuestas, escala legible
Las cinco cifras se leen a la derecha o dentro de la barra; Bazar
ya no aplasta a Andén, El Bosque y Falabella.

Co-authored-by: anibaloperacionesWes <anibaloperacionesWes@users.noreply.github.com>
</commit_message>
<xml_diff>
--- a/reports/Parque_Arauco/CONSOLIDADO/Informe_ahorro_PA_reunion_20260908.docx
+++ b/reports/Parque_Arauco/CONSOLIDADO/Informe_ahorro_PA_reunion_20260908.docx
@@ -1419,7 +1419,7 @@
       <w:r>
         <w:drawing>
           <wp:inline xmlns:a="http://schemas.openxmlformats.org/drawingml/2006/main" xmlns:pic="http://schemas.openxmlformats.org/drawingml/2006/picture">
-            <wp:extent cx="5760720" cy="2329891"/>
+            <wp:extent cx="5760720" cy="2503490"/>
             <wp:docPr id="1" name="Picture 1"/>
             <wp:cNvGraphicFramePr>
               <a:graphicFrameLocks noChangeAspect="1"/>
@@ -1440,7 +1440,7 @@
                   <pic:spPr>
                     <a:xfrm>
                       <a:off x="0" y="0"/>
-                      <a:ext cx="5760720" cy="2329891"/>
+                      <a:ext cx="5760720" cy="2503490"/>
                     </a:xfrm>
                     <a:prstGeom prst="rect"/>
                   </pic:spPr>

</xml_diff>

<commit_message>
fix(pa): barras verdes de Norte y SI500 de vuelta en la proyección
El gráfico mezcla control WES ya operativo (verde) y las cinco
propuestas (dorado). Estanque Sur sigue fuera.

Co-authored-by: anibaloperacionesWes <anibaloperacionesWes@users.noreply.github.com>
</commit_message>
<xml_diff>
--- a/reports/Parque_Arauco/CONSOLIDADO/Informe_ahorro_PA_reunion_20260908.docx
+++ b/reports/Parque_Arauco/CONSOLIDADO/Informe_ahorro_PA_reunion_20260908.docx
@@ -1419,7 +1419,7 @@
       <w:r>
         <w:drawing>
           <wp:inline xmlns:a="http://schemas.openxmlformats.org/drawingml/2006/main" xmlns:pic="http://schemas.openxmlformats.org/drawingml/2006/picture">
-            <wp:extent cx="5760720" cy="2503490"/>
+            <wp:extent cx="5760720" cy="3008226"/>
             <wp:docPr id="1" name="Picture 1"/>
             <wp:cNvGraphicFramePr>
               <a:graphicFrameLocks noChangeAspect="1"/>
@@ -1440,7 +1440,7 @@
                   <pic:spPr>
                     <a:xfrm>
                       <a:off x="0" y="0"/>
-                      <a:ext cx="5760720" cy="2503490"/>
+                      <a:ext cx="5760720" cy="3008226"/>
                     </a:xfrm>
                     <a:prstGeom prst="rect"/>
                   </pic:spPr>
@@ -1462,7 +1462,7 @@
           <w:color w:val="505050"/>
           <w:sz w:val="18"/>
         </w:rPr>
-        <w:t>Dorado = futuros puntos de control (misma ventana 00:30 → cero). Estanque Sur no entra.</w:t>
+        <w:t>Verde = ya operativo (Norte y SI500). Dorado = a copiar. Estanque Sur no entra.</w:t>
       </w:r>
     </w:p>
     <w:p>

</xml_diff>